<commit_message>
Cambio en la memoria
He añadido los nombres y alguna cosa en la portada de la memoria
</commit_message>
<xml_diff>
--- a/Documentacion/Memoria Proyecto Integrador.docx
+++ b/Documentacion/Memoria Proyecto Integrador.docx
@@ -132,23 +132,7 @@
               <w:sz w:val="52"/>
               <w:szCs w:val="72"/>
             </w:rPr>
-            <w:t>[</w:t>
-          </w:r>
-          <w:r>
-            <w:rPr>
-              <w:rFonts w:asciiTheme="majorHAnsi" w:hAnsiTheme="majorHAnsi"/>
-              <w:sz w:val="52"/>
-              <w:szCs w:val="72"/>
-            </w:rPr>
-            <w:t>NOMBRE DEL GRUPO</w:t>
-          </w:r>
-          <w:r>
-            <w:rPr>
-              <w:rFonts w:asciiTheme="majorHAnsi" w:hAnsiTheme="majorHAnsi"/>
-              <w:sz w:val="52"/>
-              <w:szCs w:val="72"/>
-            </w:rPr>
-            <w:t>]</w:t>
+            <w:t>Payo Vallecano</w:t>
           </w:r>
         </w:p>
         <w:p>
@@ -1964,7 +1948,6 @@
         <w:docPartUnique/>
       </w:docPartObj>
     </w:sdtPr>
-    <w:sdtEndPr/>
     <w:sdtContent>
       <w:p>
         <w:pPr>
@@ -3230,15 +3213,18 @@
 </file>
 
 <file path=customXml/item1.xml><?xml version="1.0" encoding="utf-8"?>
-<?mso-contentType ?>
-<FormTemplates xmlns="http://schemas.microsoft.com/sharepoint/v3/contenttype/forms">
-  <Display>DocumentLibraryForm</Display>
-  <Edit>DocumentLibraryForm</Edit>
-  <New>DocumentLibraryForm</New>
-</FormTemplates>
+<p:properties xmlns:p="http://schemas.microsoft.com/office/2006/metadata/properties" xmlns:xsi="http://www.w3.org/2001/XMLSchema-instance" xmlns:pc="http://schemas.microsoft.com/office/infopath/2007/PartnerControls">
+  <documentManagement>
+    <_activity xmlns="fd8a73f8-f815-4fba-aad8-7d5d42663f91" xsi:nil="true"/>
+  </documentManagement>
+</p:properties>
 </file>
 
 <file path=customXml/item2.xml><?xml version="1.0" encoding="utf-8"?>
+<b:Sources xmlns:b="http://schemas.openxmlformats.org/officeDocument/2006/bibliography" xmlns="http://schemas.openxmlformats.org/officeDocument/2006/bibliography" SelectedStyle="/APASixthEditionOfficeOnline.xsl" StyleName="APA" Version="6"/>
+</file>
+
+<file path=customXml/item3.xml><?xml version="1.0" encoding="utf-8"?>
 <ct:contentTypeSchema xmlns:ct="http://schemas.microsoft.com/office/2006/metadata/contentType" xmlns:ma="http://schemas.microsoft.com/office/2006/metadata/properties/metaAttributes" ct:_="" ma:_="" ma:contentTypeName="Document" ma:contentTypeID="0x0101003771EF6F4DD57D4BB341978B0C699B9F" ma:contentTypeVersion="5" ma:contentTypeDescription="Create a new document." ma:contentTypeScope="" ma:versionID="06868b8f65cc4d54ae1303708550a388">
   <xsd:schema xmlns:xsd="http://www.w3.org/2001/XMLSchema" xmlns:xs="http://www.w3.org/2001/XMLSchema" xmlns:p="http://schemas.microsoft.com/office/2006/metadata/properties" xmlns:ns3="fd8a73f8-f815-4fba-aad8-7d5d42663f91" targetNamespace="http://schemas.microsoft.com/office/2006/metadata/properties" ma:root="true" ma:fieldsID="d2cd9717685c60f99e0cb70942fdffc5" ns3:_="">
     <xsd:import namespace="fd8a73f8-f815-4fba-aad8-7d5d42663f91"/>
@@ -3388,27 +3374,34 @@
 </ct:contentTypeSchema>
 </file>
 
-<file path=customXml/item3.xml><?xml version="1.0" encoding="utf-8"?>
-<b:Sources xmlns:b="http://schemas.openxmlformats.org/officeDocument/2006/bibliography" xmlns="http://schemas.openxmlformats.org/officeDocument/2006/bibliography" SelectedStyle="/APASixthEditionOfficeOnline.xsl" StyleName="APA" Version="6"/>
-</file>
-
 <file path=customXml/item4.xml><?xml version="1.0" encoding="utf-8"?>
-<p:properties xmlns:p="http://schemas.microsoft.com/office/2006/metadata/properties" xmlns:xsi="http://www.w3.org/2001/XMLSchema-instance" xmlns:pc="http://schemas.microsoft.com/office/infopath/2007/PartnerControls">
-  <documentManagement>
-    <_activity xmlns="fd8a73f8-f815-4fba-aad8-7d5d42663f91" xsi:nil="true"/>
-  </documentManagement>
-</p:properties>
+<?mso-contentType ?>
+<FormTemplates xmlns="http://schemas.microsoft.com/sharepoint/v3/contenttype/forms">
+  <Display>DocumentLibraryForm</Display>
+  <Edit>DocumentLibraryForm</Edit>
+  <New>DocumentLibraryForm</New>
+</FormTemplates>
 </file>
 
 <file path=customXml/itemProps1.xml><?xml version="1.0" encoding="utf-8"?>
-<ds:datastoreItem xmlns:ds="http://schemas.openxmlformats.org/officeDocument/2006/customXml" ds:itemID="{98966CDD-637B-4D63-95C4-03CFA3699F1F}">
+<ds:datastoreItem xmlns:ds="http://schemas.openxmlformats.org/officeDocument/2006/customXml" ds:itemID="{F5965877-3DCA-4AA9-B0CE-C0B104DB6983}">
   <ds:schemaRefs>
-    <ds:schemaRef ds:uri="http://schemas.microsoft.com/sharepoint/v3/contenttype/forms"/>
+    <ds:schemaRef ds:uri="http://schemas.microsoft.com/office/2006/metadata/properties"/>
+    <ds:schemaRef ds:uri="http://schemas.microsoft.com/office/infopath/2007/PartnerControls"/>
+    <ds:schemaRef ds:uri="fd8a73f8-f815-4fba-aad8-7d5d42663f91"/>
   </ds:schemaRefs>
 </ds:datastoreItem>
 </file>
 
 <file path=customXml/itemProps2.xml><?xml version="1.0" encoding="utf-8"?>
+<ds:datastoreItem xmlns:ds="http://schemas.openxmlformats.org/officeDocument/2006/customXml" ds:itemID="{B84EB3CA-A7A5-E449-AC80-CF8C7BFFBCE0}">
+  <ds:schemaRefs>
+    <ds:schemaRef ds:uri="http://schemas.openxmlformats.org/officeDocument/2006/bibliography"/>
+  </ds:schemaRefs>
+</ds:datastoreItem>
+</file>
+
+<file path=customXml/itemProps3.xml><?xml version="1.0" encoding="utf-8"?>
 <ds:datastoreItem xmlns:ds="http://schemas.openxmlformats.org/officeDocument/2006/customXml" ds:itemID="{31BF955A-D32C-45E3-B821-FAF3A835F9A4}">
   <ds:schemaRefs>
     <ds:schemaRef ds:uri="http://schemas.microsoft.com/office/2006/metadata/contentType"/>
@@ -3426,20 +3419,10 @@
 </ds:datastoreItem>
 </file>
 
-<file path=customXml/itemProps3.xml><?xml version="1.0" encoding="utf-8"?>
-<ds:datastoreItem xmlns:ds="http://schemas.openxmlformats.org/officeDocument/2006/customXml" ds:itemID="{B84EB3CA-A7A5-E449-AC80-CF8C7BFFBCE0}">
+<file path=customXml/itemProps4.xml><?xml version="1.0" encoding="utf-8"?>
+<ds:datastoreItem xmlns:ds="http://schemas.openxmlformats.org/officeDocument/2006/customXml" ds:itemID="{98966CDD-637B-4D63-95C4-03CFA3699F1F}">
   <ds:schemaRefs>
-    <ds:schemaRef ds:uri="http://schemas.openxmlformats.org/officeDocument/2006/bibliography"/>
-  </ds:schemaRefs>
-</ds:datastoreItem>
-</file>
-
-<file path=customXml/itemProps4.xml><?xml version="1.0" encoding="utf-8"?>
-<ds:datastoreItem xmlns:ds="http://schemas.openxmlformats.org/officeDocument/2006/customXml" ds:itemID="{F5965877-3DCA-4AA9-B0CE-C0B104DB6983}">
-  <ds:schemaRefs>
-    <ds:schemaRef ds:uri="http://schemas.microsoft.com/office/2006/metadata/properties"/>
-    <ds:schemaRef ds:uri="http://schemas.microsoft.com/office/infopath/2007/PartnerControls"/>
-    <ds:schemaRef ds:uri="fd8a73f8-f815-4fba-aad8-7d5d42663f91"/>
+    <ds:schemaRef ds:uri="http://schemas.microsoft.com/sharepoint/v3/contenttype/forms"/>
   </ds:schemaRefs>
 </ds:datastoreItem>
 </file>
</xml_diff>

<commit_message>
Modificacion Memoria primer Sprint
Introduccion, objetivos y herramientas usadas
</commit_message>
<xml_diff>
--- a/Documentacion/Memoria Proyecto Integrador.docx
+++ b/Documentacion/Memoria Proyecto Integrador.docx
@@ -1,6 +1,6 @@
 
 <file path=word/document.xml><?xml version="1.0" encoding="utf-8"?>
-<w:document xmlns:wpc="http://schemas.microsoft.com/office/word/2010/wordprocessingCanvas" xmlns:cx="http://schemas.microsoft.com/office/drawing/2014/chartex" xmlns:cx1="http://schemas.microsoft.com/office/drawing/2015/9/8/chartex" xmlns:cx2="http://schemas.microsoft.com/office/drawing/2015/10/21/chartex" xmlns:cx3="http://schemas.microsoft.com/office/drawing/2016/5/9/chartex" xmlns:cx4="http://schemas.microsoft.com/office/drawing/2016/5/10/chartex" xmlns:cx5="http://schemas.microsoft.com/office/drawing/2016/5/11/chartex" xmlns:cx6="http://schemas.microsoft.com/office/drawing/2016/5/12/chartex" xmlns:cx7="http://schemas.microsoft.com/office/drawing/2016/5/13/chartex" xmlns:cx8="http://schemas.microsoft.com/office/drawing/2016/5/14/chartex" xmlns:mc="http://schemas.openxmlformats.org/markup-compatibility/2006" xmlns:aink="http://schemas.microsoft.com/office/drawing/2016/ink" xmlns:am3d="http://schemas.microsoft.com/office/drawing/2017/model3d" xmlns:o="urn:schemas-microsoft-com:office:office" xmlns:oel="http://schemas.microsoft.com/office/2019/extlst" xmlns:r="http://schemas.openxmlformats.org/officeDocument/2006/relationships" xmlns:m="http://schemas.openxmlformats.org/officeDocument/2006/math" xmlns:v="urn:schemas-microsoft-com:vml" xmlns:wp14="http://schemas.microsoft.com/office/word/2010/wordprocessingDrawing" xmlns:wp="http://schemas.openxmlformats.org/drawingml/2006/wordprocessingDrawing" xmlns:w10="urn:schemas-microsoft-com:office:word" xmlns:w="http://schemas.openxmlformats.org/wordprocessingml/2006/main" xmlns:w14="http://schemas.microsoft.com/office/word/2010/wordml" xmlns:w15="http://schemas.microsoft.com/office/word/2012/wordml" xmlns:w16cex="http://schemas.microsoft.com/office/word/2018/wordml/cex" xmlns:w16cid="http://schemas.microsoft.com/office/word/2016/wordml/cid" xmlns:w16="http://schemas.microsoft.com/office/word/2018/wordml" xmlns:w16du="http://schemas.microsoft.com/office/word/2023/wordml/word16du" xmlns:w16sdtdh="http://schemas.microsoft.com/office/word/2020/wordml/sdtdatahash" xmlns:w16sdtfl="http://schemas.microsoft.com/office/word/2024/wordml/sdtformatlock" xmlns:w16se="http://schemas.microsoft.com/office/word/2015/wordml/symex" xmlns:wpg="http://schemas.microsoft.com/office/word/2010/wordprocessingGroup" xmlns:wpi="http://schemas.microsoft.com/office/word/2010/wordprocessingInk" xmlns:wne="http://schemas.microsoft.com/office/word/2006/wordml" xmlns:wps="http://schemas.microsoft.com/office/word/2010/wordprocessingShape" mc:Ignorable="w14 w15 w16se w16cid w16 w16cex w16sdtdh w16sdtfl w16du wp14">
+<w:document xmlns:wpc="http://schemas.microsoft.com/office/word/2010/wordprocessingCanvas" xmlns:cx="http://schemas.microsoft.com/office/drawing/2014/chartex" xmlns:cx1="http://schemas.microsoft.com/office/drawing/2015/9/8/chartex" xmlns:cx2="http://schemas.microsoft.com/office/drawing/2015/10/21/chartex" xmlns:cx3="http://schemas.microsoft.com/office/drawing/2016/5/9/chartex" xmlns:cx4="http://schemas.microsoft.com/office/drawing/2016/5/10/chartex" xmlns:cx5="http://schemas.microsoft.com/office/drawing/2016/5/11/chartex" xmlns:cx6="http://schemas.microsoft.com/office/drawing/2016/5/12/chartex" xmlns:cx7="http://schemas.microsoft.com/office/drawing/2016/5/13/chartex" xmlns:cx8="http://schemas.microsoft.com/office/drawing/2016/5/14/chartex" xmlns:mc="http://schemas.openxmlformats.org/markup-compatibility/2006" xmlns:aink="http://schemas.microsoft.com/office/drawing/2016/ink" xmlns:am3d="http://schemas.microsoft.com/office/drawing/2017/model3d" xmlns:o="urn:schemas-microsoft-com:office:office" xmlns:oel="http://schemas.microsoft.com/office/2019/extlst" xmlns:r="http://schemas.openxmlformats.org/officeDocument/2006/relationships" xmlns:m="http://schemas.openxmlformats.org/officeDocument/2006/math" xmlns:v="urn:schemas-microsoft-com:vml" xmlns:wp14="http://schemas.microsoft.com/office/word/2010/wordprocessingDrawing" xmlns:wp="http://schemas.openxmlformats.org/drawingml/2006/wordprocessingDrawing" xmlns:w10="urn:schemas-microsoft-com:office:word" xmlns:w="http://schemas.openxmlformats.org/wordprocessingml/2006/main" xmlns:w14="http://schemas.microsoft.com/office/word/2010/wordml" xmlns:w15="http://schemas.microsoft.com/office/word/2012/wordml" xmlns:w16cex="http://schemas.microsoft.com/office/word/2018/wordml/cex" xmlns:w16cid="http://schemas.microsoft.com/office/word/2016/wordml/cid" xmlns:w16="http://schemas.microsoft.com/office/word/2018/wordml" xmlns:w16du="http://schemas.microsoft.com/office/word/2023/wordml/word16du" xmlns:w16sdtdh="http://schemas.microsoft.com/office/word/2020/wordml/sdtdatahash" xmlns:w16sdtfl="http://schemas.microsoft.com/office/word/2024/wordml/sdtformatlock" xmlns:w16se="http://schemas.microsoft.com/office/word/2015/wordml/symex" xmlns:wpg="http://schemas.microsoft.com/office/word/2010/wordprocessingGroup" xmlns:wpi="http://schemas.microsoft.com/office/word/2010/wordprocessingInk" xmlns:wne="http://schemas.microsoft.com/office/word/2006/wordml" xmlns:wps="http://schemas.microsoft.com/office/word/2010/wordprocessingShape" xmlns:a="http://schemas.openxmlformats.org/drawingml/2006/main" xmlns:pic="http://schemas.openxmlformats.org/drawingml/2006/picture" xmlns:a14="http://schemas.microsoft.com/office/drawing/2010/main" mc:Ignorable="w14 w15 w16se w16cid w16 w16cex w16sdtdh w16sdtfl w16du wp14">
   <w:body>
     <w:sdt>
       <w:sdtPr>
@@ -186,11 +186,7 @@
         </w:p>
         <w:p>
           <w:pPr>
-            <w:jc w:val="center"/>
-          </w:pPr>
-        </w:p>
-        <w:p>
-          <w:pPr>
+            <w:pStyle w:val="Normal"/>
             <w:jc w:val="center"/>
           </w:pPr>
         </w:p>
@@ -246,22 +242,26 @@
     </w:sdt>
     <w:sdt>
       <w:sdtPr>
-        <w:rPr>
-          <w:rFonts w:asciiTheme="minorHAnsi" w:eastAsiaTheme="minorEastAsia" w:hAnsiTheme="minorHAnsi" w:cstheme="minorBidi"/>
-          <w:color w:val="auto"/>
-          <w:sz w:val="24"/>
-          <w:szCs w:val="24"/>
-        </w:rPr>
         <w:id w:val="-1659147511"/>
         <w:docPartObj>
           <w:docPartGallery w:val="Table of Contents"/>
           <w:docPartUnique/>
         </w:docPartObj>
+        <w:rPr>
+          <w:rFonts w:ascii="Calibri" w:hAnsi="Calibri" w:eastAsia="" w:cs="" w:asciiTheme="minorAscii" w:hAnsiTheme="minorAscii" w:eastAsiaTheme="minorEastAsia" w:cstheme="minorBidi"/>
+          <w:color w:val="auto"/>
+          <w:sz w:val="24"/>
+          <w:szCs w:val="24"/>
+        </w:rPr>
       </w:sdtPr>
       <w:sdtEndPr>
         <w:rPr>
-          <w:b/>
-          <w:bCs/>
+          <w:rFonts w:ascii="Calibri" w:hAnsi="Calibri" w:eastAsia="" w:cs="" w:asciiTheme="minorAscii" w:hAnsiTheme="minorAscii" w:eastAsiaTheme="minorEastAsia" w:cstheme="minorBidi"/>
+          <w:b w:val="1"/>
+          <w:bCs w:val="1"/>
+          <w:color w:val="auto"/>
+          <w:sz w:val="24"/>
+          <w:szCs w:val="24"/>
         </w:rPr>
       </w:sdtEndPr>
       <w:sdtContent>
@@ -309,7 +309,7 @@
           <w:r>
             <w:fldChar w:fldCharType="separate"/>
           </w:r>
-          <w:hyperlink w:anchor="_Toc164530067" w:history="1">
+          <w:hyperlink w:history="1" w:anchor="_Toc164530067">
             <w:r>
               <w:rPr>
                 <w:rStyle w:val="Hipervnculo"/>
@@ -382,7 +382,7 @@
               <w14:ligatures w14:val="standardContextual"/>
             </w:rPr>
           </w:pPr>
-          <w:hyperlink w:anchor="_Toc164530068" w:history="1">
+          <w:hyperlink w:history="1" w:anchor="_Toc164530068">
             <w:r>
               <w:rPr>
                 <w:rStyle w:val="Hipervnculo"/>
@@ -472,7 +472,7 @@
               <w14:ligatures w14:val="standardContextual"/>
             </w:rPr>
           </w:pPr>
-          <w:hyperlink w:anchor="_Toc164530069" w:history="1">
+          <w:hyperlink w:history="1" w:anchor="_Toc164530069">
             <w:r>
               <w:rPr>
                 <w:rStyle w:val="Hipervnculo"/>
@@ -562,7 +562,7 @@
               <w14:ligatures w14:val="standardContextual"/>
             </w:rPr>
           </w:pPr>
-          <w:hyperlink w:anchor="_Toc164530070" w:history="1">
+          <w:hyperlink w:history="1" w:anchor="_Toc164530070">
             <w:r>
               <w:rPr>
                 <w:rStyle w:val="Hipervnculo"/>
@@ -652,7 +652,7 @@
               <w14:ligatures w14:val="standardContextual"/>
             </w:rPr>
           </w:pPr>
-          <w:hyperlink w:anchor="_Toc164530071" w:history="1">
+          <w:hyperlink w:history="1" w:anchor="_Toc164530071">
             <w:r>
               <w:rPr>
                 <w:rStyle w:val="Hipervnculo"/>
@@ -742,7 +742,7 @@
               <w14:ligatures w14:val="standardContextual"/>
             </w:rPr>
           </w:pPr>
-          <w:hyperlink w:anchor="_Toc164530072" w:history="1">
+          <w:hyperlink w:history="1" w:anchor="_Toc164530072">
             <w:r>
               <w:rPr>
                 <w:rStyle w:val="Hipervnculo"/>
@@ -832,7 +832,7 @@
               <w14:ligatures w14:val="standardContextual"/>
             </w:rPr>
           </w:pPr>
-          <w:hyperlink w:anchor="_Toc164530073" w:history="1">
+          <w:hyperlink w:history="1" w:anchor="_Toc164530073">
             <w:r>
               <w:rPr>
                 <w:rStyle w:val="Hipervnculo"/>
@@ -922,7 +922,7 @@
               <w14:ligatures w14:val="standardContextual"/>
             </w:rPr>
           </w:pPr>
-          <w:hyperlink w:anchor="_Toc164530074" w:history="1">
+          <w:hyperlink w:history="1" w:anchor="_Toc164530074">
             <w:r>
               <w:rPr>
                 <w:rStyle w:val="Hipervnculo"/>
@@ -1011,7 +1011,7 @@
               <w14:ligatures w14:val="standardContextual"/>
             </w:rPr>
           </w:pPr>
-          <w:hyperlink w:anchor="_Toc164530075" w:history="1">
+          <w:hyperlink w:history="1" w:anchor="_Toc164530075">
             <w:r>
               <w:rPr>
                 <w:rStyle w:val="Hipervnculo"/>
@@ -1084,7 +1084,7 @@
               <w14:ligatures w14:val="standardContextual"/>
             </w:rPr>
           </w:pPr>
-          <w:hyperlink w:anchor="_Toc164530076" w:history="1">
+          <w:hyperlink w:history="1" w:anchor="_Toc164530076">
             <w:r>
               <w:rPr>
                 <w:rStyle w:val="Hipervnculo"/>
@@ -1156,7 +1156,7 @@
               <w14:ligatures w14:val="standardContextual"/>
             </w:rPr>
           </w:pPr>
-          <w:hyperlink w:anchor="_Toc164530077" w:history="1">
+          <w:hyperlink w:history="1" w:anchor="_Toc164530077">
             <w:r>
               <w:rPr>
                 <w:rStyle w:val="Hipervnculo"/>
@@ -1228,7 +1228,7 @@
               <w14:ligatures w14:val="standardContextual"/>
             </w:rPr>
           </w:pPr>
-          <w:hyperlink w:anchor="_Toc164530078" w:history="1">
+          <w:hyperlink w:history="1" w:anchor="_Toc164530078">
             <w:r>
               <w:rPr>
                 <w:rStyle w:val="Hipervnculo"/>
@@ -1391,8 +1391,8 @@
       <w:pPr>
         <w:pStyle w:val="Ttulo1"/>
       </w:pPr>
-      <w:bookmarkStart w:id="0" w:name="_Toc92297615"/>
-      <w:bookmarkStart w:id="1" w:name="_Toc164530067"/>
+      <w:bookmarkStart w:name="_Toc92297615" w:id="0"/>
+      <w:bookmarkStart w:name="_Toc164530067" w:id="1"/>
       <w:r>
         <w:t>Resumen</w:t>
       </w:r>
@@ -1443,18 +1443,161 @@
           <w:ilvl w:val="0"/>
           <w:numId w:val="1"/>
         </w:numPr>
-      </w:pPr>
-      <w:bookmarkStart w:id="2" w:name="_Toc164530068"/>
-      <w:r>
+        <w:rPr/>
+      </w:pPr>
+      <w:bookmarkStart w:name="_Toc164530068" w:id="2"/>
+      <w:r>
+        <w:rPr/>
         <w:t>Introducción</w:t>
       </w:r>
       <w:bookmarkEnd w:id="2"/>
     </w:p>
     <w:p>
-      <w:r>
-        <w:t>Para este apartado se recomienda una extensión de 1 a 2 páginas. Presentación del proyecto, contexto y detalles introductorios.</w:t>
-      </w:r>
-    </w:p>
+      <w:pPr>
+        <w:spacing w:before="0" w:beforeAutospacing="off" w:after="240" w:afterAutospacing="off"/>
+        <w:rPr>
+          <w:noProof w:val="0"/>
+          <w:lang w:val="es-ES"/>
+        </w:rPr>
+      </w:pPr>
+      <w:r>
+        <w:rPr>
+          <w:rFonts w:ascii="Calibri" w:hAnsi="Calibri" w:eastAsia="" w:cs="" w:asciiTheme="minorAscii" w:hAnsiTheme="minorAscii" w:eastAsiaTheme="minorEastAsia" w:cstheme="minorBidi"/>
+          <w:noProof w:val="0"/>
+          <w:color w:val="auto"/>
+          <w:sz w:val="24"/>
+          <w:szCs w:val="24"/>
+          <w:lang w:val="es-ES" w:eastAsia="es-ES" w:bidi="ar-SA"/>
+        </w:rPr>
+        <w:t xml:space="preserve">El presente documento detalla el desarrollo del Proyecto Integrador para el primer curso del Ciclo Formativo de Grado Superior en Desarrollo de Aplicaciones Web (DAW) durante el año académico 2025-26. El equipo de trabajo encargado de este proyecto, denominado Payo Vallecano, integrado por Diego Jordá, Diego Librado y Pablo del </w:t>
+      </w:r>
+      <w:r>
+        <w:rPr>
+          <w:rFonts w:ascii="Calibri" w:hAnsi="Calibri" w:eastAsia="" w:cs="" w:asciiTheme="minorAscii" w:hAnsiTheme="minorAscii" w:eastAsiaTheme="minorEastAsia" w:cstheme="minorBidi"/>
+          <w:noProof w:val="0"/>
+          <w:color w:val="auto"/>
+          <w:sz w:val="24"/>
+          <w:szCs w:val="24"/>
+          <w:lang w:val="es-ES" w:eastAsia="es-ES" w:bidi="ar-SA"/>
+        </w:rPr>
+        <w:t>Castillo , ha</w:t>
+      </w:r>
+      <w:r>
+        <w:rPr>
+          <w:rFonts w:ascii="Calibri" w:hAnsi="Calibri" w:eastAsia="" w:cs="" w:asciiTheme="minorAscii" w:hAnsiTheme="minorAscii" w:eastAsiaTheme="minorEastAsia" w:cstheme="minorBidi"/>
+          <w:noProof w:val="0"/>
+          <w:color w:val="auto"/>
+          <w:sz w:val="24"/>
+          <w:szCs w:val="24"/>
+          <w:lang w:val="es-ES" w:eastAsia="es-ES" w:bidi="ar-SA"/>
+        </w:rPr>
+        <w:t xml:space="preserve"> asumido el reto de diseñar y ejecutar una solución tecnológica integral que responda a las necesidades de gestión de un cliente real, aplicando los conocimientos técnicos adquiridos en los módulos de Programación, Bases de Datos y Entornos de Desarrollo.</w:t>
+      </w:r>
+    </w:p>
+    <w:p>
+      <w:pPr>
+        <w:spacing w:before="0" w:beforeAutospacing="off" w:after="240" w:afterAutospacing="off"/>
+        <w:rPr>
+          <w:noProof w:val="0"/>
+          <w:lang w:val="es-ES"/>
+        </w:rPr>
+      </w:pPr>
+      <w:r>
+        <w:rPr>
+          <w:rFonts w:ascii="Calibri" w:hAnsi="Calibri" w:eastAsia="" w:cs="" w:asciiTheme="minorAscii" w:hAnsiTheme="minorAscii" w:eastAsiaTheme="minorEastAsia" w:cstheme="minorBidi"/>
+          <w:noProof w:val="0"/>
+          <w:color w:val="auto"/>
+          <w:sz w:val="24"/>
+          <w:szCs w:val="24"/>
+          <w:lang w:val="es-ES" w:eastAsia="es-ES" w:bidi="ar-SA"/>
+        </w:rPr>
+        <w:t>El contexto del proyecto se sitúa en el taller de sastrería de la reconocida diseñadora de vestimenta superheroica Edna Moda. La naturaleza exclusiva y particular de su clientela, compuesta por tanto superhéroes como de supervillanos, exige una organización precisa y eficiente que los métodos tradicionales ya no pueden garantizar. Por ello, se nos ha encomendado la creación de una aplicación de gestión de citas personalizada que permita administrar de forma centralizada tanto la información de los clientes y sus trajes como el flujo de trabajo en los distintos talleres del estudio.</w:t>
+      </w:r>
+    </w:p>
+    <w:p>
+      <w:pPr>
+        <w:spacing w:before="0" w:beforeAutospacing="off" w:after="240" w:afterAutospacing="off"/>
+        <w:rPr>
+          <w:noProof w:val="0"/>
+          <w:lang w:val="es-ES"/>
+        </w:rPr>
+      </w:pPr>
+      <w:r>
+        <w:rPr>
+          <w:rFonts w:ascii="Calibri" w:hAnsi="Calibri" w:eastAsia="" w:cs="" w:asciiTheme="minorAscii" w:hAnsiTheme="minorAscii" w:eastAsiaTheme="minorEastAsia" w:cstheme="minorBidi"/>
+          <w:noProof w:val="0"/>
+          <w:color w:val="auto"/>
+          <w:sz w:val="24"/>
+          <w:szCs w:val="24"/>
+          <w:lang w:val="es-ES" w:eastAsia="es-ES" w:bidi="ar-SA"/>
+        </w:rPr>
+        <w:t>La aplicación propuesta debe permitir realizar un ciclo completo de gestión de datos, incluyendo la creación, consulta, modificación y borrado (CRUD) de clientes y citas. Para lograr una operatividad óptima, el sistema diferenciará entre varios perfiles de usuario dentro del taller: aprendices, oficiales y maestros, cada uno con niveles de acceso y permisos específicos adaptados a su rango y responsabilidad dentro de la empresa. Los maestros tendrán el control total del inventario de talleres y la agenda global, mientras que los oficiales y aprendices gestionarán sus tareas operativas directas.</w:t>
+      </w:r>
+    </w:p>
+    <w:p>
+      <w:pPr>
+        <w:spacing w:before="0" w:beforeAutospacing="off" w:after="240" w:afterAutospacing="off"/>
+        <w:rPr>
+          <w:noProof w:val="0"/>
+          <w:lang w:val="es-ES"/>
+        </w:rPr>
+      </w:pPr>
+      <w:r>
+        <w:rPr>
+          <w:rFonts w:ascii="Calibri" w:hAnsi="Calibri" w:eastAsia="" w:cs="" w:asciiTheme="minorAscii" w:hAnsiTheme="minorAscii" w:eastAsiaTheme="minorEastAsia" w:cstheme="minorBidi"/>
+          <w:noProof w:val="0"/>
+          <w:color w:val="auto"/>
+          <w:sz w:val="24"/>
+          <w:szCs w:val="24"/>
+          <w:lang w:val="es-ES" w:eastAsia="es-ES" w:bidi="ar-SA"/>
+        </w:rPr>
+        <w:t>Uno de los desafíos más singulares de esta propuesta, que hemos decidido abordar como un valor añadido, es la implementación de una lógica de seguridad para la agenda. Dado que el taller atiende a facciones enfrentadas, el sistema debe ser capaz de identificar si un cliente es héroe o villano para evitar que coincidan en el tiempo y el espacio. La aplicación garantizará un margen de seguridad de al menos una hora entre citas de clientes con intereses opuestos para prevenir incidentes en la sede.</w:t>
+      </w:r>
+    </w:p>
+    <w:p>
+      <w:pPr>
+        <w:spacing w:before="0" w:beforeAutospacing="off" w:after="240" w:afterAutospacing="off"/>
+        <w:rPr>
+          <w:noProof w:val="0"/>
+          <w:lang w:val="es-ES"/>
+        </w:rPr>
+      </w:pPr>
+      <w:r>
+        <w:rPr>
+          <w:rFonts w:ascii="Calibri" w:hAnsi="Calibri" w:eastAsia="" w:cs="" w:asciiTheme="minorAscii" w:hAnsiTheme="minorAscii" w:eastAsiaTheme="minorEastAsia" w:cstheme="minorBidi"/>
+          <w:noProof w:val="0"/>
+          <w:color w:val="auto"/>
+          <w:sz w:val="24"/>
+          <w:szCs w:val="24"/>
+          <w:lang w:val="es-ES" w:eastAsia="es-ES" w:bidi="ar-SA"/>
+        </w:rPr>
+        <w:t xml:space="preserve">Desde el punto de vista metodológico, el proyecto se desarrolla bajo el marco de trabajo SCRUM, lo que permite al equipo una adaptación constante a los requisitos y una entrega incremental de valor a través de diferentes </w:t>
+      </w:r>
+      <w:r>
+        <w:rPr>
+          <w:rFonts w:ascii="Calibri" w:hAnsi="Calibri" w:eastAsia="" w:cs="" w:asciiTheme="minorAscii" w:hAnsiTheme="minorAscii" w:eastAsiaTheme="minorEastAsia" w:cstheme="minorBidi"/>
+          <w:noProof w:val="0"/>
+          <w:color w:val="auto"/>
+          <w:sz w:val="24"/>
+          <w:szCs w:val="24"/>
+          <w:lang w:val="es-ES" w:eastAsia="es-ES" w:bidi="ar-SA"/>
+        </w:rPr>
+        <w:t>sprints</w:t>
+      </w:r>
+      <w:r>
+        <w:rPr>
+          <w:rFonts w:ascii="Calibri" w:hAnsi="Calibri" w:eastAsia="" w:cs="" w:asciiTheme="minorAscii" w:hAnsiTheme="minorAscii" w:eastAsiaTheme="minorEastAsia" w:cstheme="minorBidi"/>
+          <w:noProof w:val="0"/>
+          <w:color w:val="auto"/>
+          <w:sz w:val="24"/>
+          <w:szCs w:val="24"/>
+          <w:lang w:val="es-ES" w:eastAsia="es-ES" w:bidi="ar-SA"/>
+        </w:rPr>
+        <w:t>. La integración de tecnologías como el lenguaje de programación Java, el uso de bases de datos relacionales MySQL y el control de versiones mediante GitHub asegura un entorno de desarrollo profesional y colaborativo. Con este enfoque, buscamos no solo cumplir con las especificaciones técnicas, sino también demostrar capacidad de resolución de problemas y gestión eficaz del trabajo en equipo en un entorno de desarrollo real.</w:t>
+      </w:r>
+    </w:p>
+    <w:p/>
+    <w:p/>
     <w:p>
       <w:pPr>
         <w:pStyle w:val="Ttulo1"/>
@@ -1462,18 +1605,168 @@
           <w:ilvl w:val="0"/>
           <w:numId w:val="1"/>
         </w:numPr>
-      </w:pPr>
-      <w:bookmarkStart w:id="3" w:name="_Toc164530069"/>
-      <w:r>
+        <w:rPr/>
+      </w:pPr>
+      <w:bookmarkStart w:name="_Toc164530069" w:id="3"/>
+      <w:r>
+        <w:rPr/>
         <w:t>Objetivos</w:t>
       </w:r>
       <w:bookmarkEnd w:id="3"/>
     </w:p>
     <w:p>
-      <w:r>
-        <w:t>Para este apartado se recomienda una extensión de 2 a 3 páginas. Enumeración de los objetivos del proyecto, indicando qué se pretende lograr con cada uno de ellos, tanto objetivos generales como específicos de cada módulo involucrado en la asignatura.</w:t>
-      </w:r>
-    </w:p>
+      <w:pPr>
+        <w:spacing w:before="0" w:beforeAutospacing="off" w:after="240" w:afterAutospacing="off"/>
+        <w:jc w:val="both"/>
+        <w:rPr>
+          <w:noProof w:val="0"/>
+          <w:lang w:val="es-ES"/>
+        </w:rPr>
+      </w:pPr>
+      <w:r>
+        <w:rPr>
+          <w:rFonts w:ascii="Calibri" w:hAnsi="Calibri" w:eastAsia="" w:cs="" w:asciiTheme="minorAscii" w:hAnsiTheme="minorAscii" w:eastAsiaTheme="minorEastAsia" w:cstheme="minorBidi"/>
+          <w:noProof w:val="0"/>
+          <w:color w:val="auto"/>
+          <w:sz w:val="24"/>
+          <w:szCs w:val="24"/>
+          <w:lang w:val="es-ES" w:eastAsia="es-ES" w:bidi="ar-SA"/>
+        </w:rPr>
+        <w:t>El desarrollo del presente proyecto por parte del grupo Payo Vallecano se fundamenta en la consecución de una serie de metas que integran tanto la gestión profesional de proyectos como la aplicación técnica de conocimientos específicos. En primer lugar, se establecen los objetivos generales que se centran en la adquisición de competencias transversales esenciales para cualquier desarrollador en un entorno laboral real. Entre estos objetivos destaca la capacidad de gestionar y realizar el trabajo del área asignada ajustándose a las cargas de trabajo propias del ciclo formativo mediante una planificación temporal rigurosa. Asimismo, se busca fomentar la autonomía y la colaboración mediante la realización de consultas a las personas adecuadas y el respeto por el trabajo de los compañeros para lograr un flujo de trabajo eficiente. El equipo también debe trabajar en mantener un espíritu de innovación y actualización constante buscando habilidades para la sinergia de equipos y el liderazgo dentro del grupo. Otro pilar fundamental es la gestión eficaz de los conflictos que puedan producirse durante el desarrollo mediando y contribuyendo al establecimiento de un ambiente de trabajo agradable y actuando de forma respetuosa y tolerante. Finalmente, se pretende que cada miembro sea capaz de resolver problemas y tomar decisiones individuales siguiendo las normas y procedimientos establecidos definidos dentro del ámbito de su competencia.</w:t>
+      </w:r>
+    </w:p>
+    <w:p>
+      <w:pPr>
+        <w:spacing w:before="0" w:beforeAutospacing="off" w:after="240" w:afterAutospacing="off"/>
+        <w:jc w:val="both"/>
+        <w:rPr>
+          <w:noProof w:val="0"/>
+          <w:lang w:val="es-ES"/>
+        </w:rPr>
+      </w:pPr>
+      <w:r>
+        <w:rPr>
+          <w:rFonts w:ascii="Calibri" w:hAnsi="Calibri" w:eastAsia="" w:cs="" w:asciiTheme="minorAscii" w:hAnsiTheme="minorAscii" w:eastAsiaTheme="minorEastAsia" w:cstheme="minorBidi"/>
+          <w:noProof w:val="0"/>
+          <w:color w:val="auto"/>
+          <w:sz w:val="24"/>
+          <w:szCs w:val="24"/>
+          <w:lang w:val="es-ES" w:eastAsia="es-ES" w:bidi="ar-SA"/>
+        </w:rPr>
+        <w:t>En cuanto a los objetivos específicos vinculados a las capacidades de los módulos formativos involucrados el proyecto actúa como nexo de unión entre tres áreas fundamentales.</w:t>
+      </w:r>
+      <w:r>
+        <w:rPr>
+          <w:rFonts w:ascii="Calibri" w:hAnsi="Calibri" w:eastAsia="" w:cs="" w:asciiTheme="minorAscii" w:hAnsiTheme="minorAscii" w:eastAsiaTheme="minorEastAsia" w:cstheme="minorBidi"/>
+          <w:noProof w:val="0"/>
+          <w:color w:val="auto"/>
+          <w:sz w:val="24"/>
+          <w:szCs w:val="24"/>
+          <w:lang w:val="es-ES" w:eastAsia="es-ES" w:bidi="ar-SA"/>
+        </w:rPr>
+        <w:t xml:space="preserve"> En el ámbito de las Bases de Datos el objetivo principal es garantizar la integridad y persistencia de la información mediante la creación de bases de datos definiendo su estructura y las características de sus elementos según el modelo relacional. Esto implica diseñar modelos lógicos normalizados interpretando diagramas entidad/relación y realizar el diseño físico de las bases de datos utilizando asistentes, herramientas gráficas y el lenguaje de definición de datos. </w:t>
+      </w:r>
+      <w:r>
+        <w:rPr>
+          <w:rFonts w:ascii="Calibri" w:hAnsi="Calibri" w:eastAsia="" w:cs="" w:asciiTheme="minorAscii" w:hAnsiTheme="minorAscii" w:eastAsiaTheme="minorEastAsia" w:cstheme="minorBidi"/>
+          <w:noProof w:val="0"/>
+          <w:color w:val="auto"/>
+          <w:sz w:val="24"/>
+          <w:szCs w:val="24"/>
+          <w:lang w:val="es-ES" w:eastAsia="es-ES" w:bidi="ar-SA"/>
+        </w:rPr>
+        <w:t>Además, se debe ser capaz de consultar y modificar la información almacenada utilizando el lenguaje de manipulación de datos.</w:t>
+      </w:r>
+    </w:p>
+    <w:p>
+      <w:pPr>
+        <w:spacing w:before="0" w:beforeAutospacing="off" w:after="240" w:afterAutospacing="off"/>
+        <w:jc w:val="both"/>
+        <w:rPr>
+          <w:noProof w:val="0"/>
+          <w:lang w:val="es-ES"/>
+        </w:rPr>
+      </w:pPr>
+      <w:r>
+        <w:rPr>
+          <w:rFonts w:ascii="Calibri" w:hAnsi="Calibri" w:eastAsia="" w:cs="" w:asciiTheme="minorAscii" w:hAnsiTheme="minorAscii" w:eastAsiaTheme="minorEastAsia" w:cstheme="minorBidi"/>
+          <w:noProof w:val="0"/>
+          <w:color w:val="auto"/>
+          <w:sz w:val="24"/>
+          <w:szCs w:val="24"/>
+          <w:lang w:val="es-ES" w:eastAsia="es-ES" w:bidi="ar-SA"/>
+        </w:rPr>
+        <w:t xml:space="preserve">En el módulo de Programación el enfoque se centra en dar vida a la lógica de negocio y a la interfaz mediante el diseño de clases necesarias para seguir el patrón MVC. </w:t>
+      </w:r>
+      <w:r>
+        <w:rPr>
+          <w:rFonts w:ascii="Calibri" w:hAnsi="Calibri" w:eastAsia="" w:cs="" w:asciiTheme="minorAscii" w:hAnsiTheme="minorAscii" w:eastAsiaTheme="minorEastAsia" w:cstheme="minorBidi"/>
+          <w:noProof w:val="0"/>
+          <w:color w:val="auto"/>
+          <w:sz w:val="24"/>
+          <w:szCs w:val="24"/>
+          <w:lang w:val="es-ES" w:eastAsia="es-ES" w:bidi="ar-SA"/>
+        </w:rPr>
+        <w:t>El equipo debe implementar cada una de las clases para lograr su objetivo incluyendo clases de interfaz gráfica pertenecientes a la vista, clases que representen el modelo y clases encargadas de la lógica pertenecientes al control.</w:t>
+      </w:r>
+      <w:r>
+        <w:rPr>
+          <w:rFonts w:ascii="Calibri" w:hAnsi="Calibri" w:eastAsia="" w:cs="" w:asciiTheme="minorAscii" w:hAnsiTheme="minorAscii" w:eastAsiaTheme="minorEastAsia" w:cstheme="minorBidi"/>
+          <w:noProof w:val="0"/>
+          <w:color w:val="auto"/>
+          <w:sz w:val="24"/>
+          <w:szCs w:val="24"/>
+          <w:lang w:val="es-ES" w:eastAsia="es-ES" w:bidi="ar-SA"/>
+        </w:rPr>
+        <w:t xml:space="preserve"> Se desarrollará una aplicación que gestione información almacenada en bases de datos relacionales identificando y utilizando mecanismos de conexión lo que permitirá alcanzar la competencia completa para desarrollar componentes software en lenguajes de programación orientados a objetos.</w:t>
+      </w:r>
+    </w:p>
+    <w:p>
+      <w:pPr>
+        <w:spacing w:before="0" w:beforeAutospacing="off" w:after="240" w:afterAutospacing="off"/>
+        <w:jc w:val="both"/>
+        <w:rPr>
+          <w:noProof w:val="0"/>
+          <w:lang w:val="es-ES"/>
+        </w:rPr>
+      </w:pPr>
+      <w:r>
+        <w:rPr>
+          <w:rFonts w:ascii="Calibri" w:hAnsi="Calibri" w:eastAsia="" w:cs="" w:asciiTheme="minorAscii" w:hAnsiTheme="minorAscii" w:eastAsiaTheme="minorEastAsia" w:cstheme="minorBidi"/>
+          <w:noProof w:val="0"/>
+          <w:color w:val="auto"/>
+          <w:sz w:val="24"/>
+          <w:szCs w:val="24"/>
+          <w:lang w:val="es-ES" w:eastAsia="es-ES" w:bidi="ar-SA"/>
+        </w:rPr>
+        <w:t xml:space="preserve">Por último, el módulo de Entornos de Desarrollo asegura la calidad del software y la correcta gestión del ciclo de vida del producto realizando el análisis y el diseño de la aplicación empleando técnicas UML. Es fundamental documentar la aplicación con </w:t>
+      </w:r>
+      <w:r>
+        <w:rPr>
+          <w:rFonts w:ascii="Calibri" w:hAnsi="Calibri" w:eastAsia="" w:cs="" w:asciiTheme="minorAscii" w:hAnsiTheme="minorAscii" w:eastAsiaTheme="minorEastAsia" w:cstheme="minorBidi"/>
+          <w:noProof w:val="0"/>
+          <w:color w:val="auto"/>
+          <w:sz w:val="24"/>
+          <w:szCs w:val="24"/>
+          <w:lang w:val="es-ES" w:eastAsia="es-ES" w:bidi="ar-SA"/>
+        </w:rPr>
+        <w:t>JavaDoc</w:t>
+      </w:r>
+      <w:r>
+        <w:rPr>
+          <w:rFonts w:ascii="Calibri" w:hAnsi="Calibri" w:eastAsia="" w:cs="" w:asciiTheme="minorAscii" w:hAnsiTheme="minorAscii" w:eastAsiaTheme="minorEastAsia" w:cstheme="minorBidi"/>
+          <w:noProof w:val="0"/>
+          <w:color w:val="auto"/>
+          <w:sz w:val="24"/>
+          <w:szCs w:val="24"/>
+          <w:lang w:val="es-ES" w:eastAsia="es-ES" w:bidi="ar-SA"/>
+        </w:rPr>
+        <w:t xml:space="preserve"> y gestionar las diferentes versiones del software y el trabajo colaborativo a través de plataformas adecuadas. El equipo también llevará a cabo la depuración y testeo sobre los programas siguiendo metodologías ágiles para el desarrollo y planificación de programas asegurando así un producto final estable y funcional.</w:t>
+      </w:r>
+    </w:p>
+    <w:p/>
+    <w:p/>
+    <w:p/>
     <w:p>
       <w:pPr>
         <w:pStyle w:val="Ttulo1"/>
@@ -1481,30 +1774,256 @@
           <w:ilvl w:val="0"/>
           <w:numId w:val="1"/>
         </w:numPr>
-      </w:pPr>
-      <w:bookmarkStart w:id="4" w:name="_Toc164530070"/>
-      <w:r>
+        <w:rPr/>
+      </w:pPr>
+      <w:bookmarkStart w:name="_Toc164530070" w:id="4"/>
+      <w:r>
+        <w:rPr/>
         <w:t>Tecnologías utilizadas</w:t>
       </w:r>
       <w:bookmarkEnd w:id="4"/>
     </w:p>
     <w:p>
-      <w:r>
-        <w:t xml:space="preserve">Para este apartado se recomienda una extensión de </w:t>
-      </w:r>
-      <w:r>
-        <w:t>2</w:t>
-      </w:r>
-      <w:r>
-        <w:t xml:space="preserve"> a </w:t>
-      </w:r>
-      <w:r>
-        <w:t>3</w:t>
-      </w:r>
-      <w:r>
-        <w:t xml:space="preserve"> páginas. Enumeración de las tecnologías, herramientas y lenguajes de programación utilizados durante el desarrollo del proyecto. Enumeración de las herramientas organizativas para favorecer el trabajo en equipo.</w:t>
-      </w:r>
-    </w:p>
+      <w:pPr>
+        <w:spacing w:before="0" w:beforeAutospacing="off" w:after="120" w:afterAutospacing="off"/>
+        <w:jc w:val="both"/>
+        <w:rPr>
+          <w:noProof w:val="0"/>
+          <w:lang w:val="es-ES"/>
+        </w:rPr>
+      </w:pPr>
+      <w:r>
+        <w:rPr>
+          <w:rFonts w:ascii="Calibri" w:hAnsi="Calibri" w:eastAsia="" w:cs="" w:asciiTheme="minorAscii" w:hAnsiTheme="minorAscii" w:eastAsiaTheme="minorEastAsia" w:cstheme="minorBidi"/>
+          <w:noProof w:val="0"/>
+          <w:color w:val="auto"/>
+          <w:sz w:val="24"/>
+          <w:szCs w:val="24"/>
+          <w:lang w:val="es-ES" w:eastAsia="es-ES" w:bidi="ar-SA"/>
+        </w:rPr>
+        <w:t>Para este apartado se recomienda una extensión de 2 a 3 páginas. Enumeración de las tecnologías, herramientas y lenguajes de programación utilizados durante el desarrollo del proyecto. Enumeración de las herramientas organizativas para favorecer el trabajo en equipo.</w:t>
+      </w:r>
+    </w:p>
+    <w:p/>
+    <w:p>
+      <w:pPr>
+        <w:spacing w:before="0" w:beforeAutospacing="off" w:after="240" w:afterAutospacing="off"/>
+        <w:jc w:val="both"/>
+        <w:rPr>
+          <w:noProof w:val="0"/>
+          <w:lang w:val="es-ES"/>
+        </w:rPr>
+      </w:pPr>
+      <w:r>
+        <w:rPr>
+          <w:rFonts w:ascii="Calibri" w:hAnsi="Calibri" w:eastAsia="" w:cs="" w:asciiTheme="minorAscii" w:hAnsiTheme="minorAscii" w:eastAsiaTheme="minorEastAsia" w:cstheme="minorBidi"/>
+          <w:noProof w:val="0"/>
+          <w:color w:val="auto"/>
+          <w:sz w:val="24"/>
+          <w:szCs w:val="24"/>
+          <w:lang w:val="es-ES" w:eastAsia="es-ES" w:bidi="ar-SA"/>
+        </w:rPr>
+        <w:t xml:space="preserve">El desarrollo del proyecto integrador ha requerido la combinación de diversas herramientas técnicas y organizativas para cumplir con los estándares de calidad exigidos por el taller de la Sra. Moda. Para la construcción del núcleo de la aplicación, el entorno de desarrollo integrado (IDE) principal ha sido Eclipse, el cual ha proporcionado la infraestructura necesaria para la programación orientada a objetos en Java utilizando el patrón Modelo-Vista-Controlador. En cuanto a la persistencia de los datos, se ha empleado el sistema de gestión de bases de datos relacionales MySQL junto con MySQL </w:t>
+      </w:r>
+      <w:r>
+        <w:rPr>
+          <w:rFonts w:ascii="Calibri" w:hAnsi="Calibri" w:eastAsia="" w:cs="" w:asciiTheme="minorAscii" w:hAnsiTheme="minorAscii" w:eastAsiaTheme="minorEastAsia" w:cstheme="minorBidi"/>
+          <w:noProof w:val="0"/>
+          <w:color w:val="auto"/>
+          <w:sz w:val="24"/>
+          <w:szCs w:val="24"/>
+          <w:lang w:val="es-ES" w:eastAsia="es-ES" w:bidi="ar-SA"/>
+        </w:rPr>
+        <w:t>Workbench</w:t>
+      </w:r>
+      <w:r>
+        <w:rPr>
+          <w:rFonts w:ascii="Calibri" w:hAnsi="Calibri" w:eastAsia="" w:cs="" w:asciiTheme="minorAscii" w:hAnsiTheme="minorAscii" w:eastAsiaTheme="minorEastAsia" w:cstheme="minorBidi"/>
+          <w:noProof w:val="0"/>
+          <w:color w:val="auto"/>
+          <w:sz w:val="24"/>
+          <w:szCs w:val="24"/>
+          <w:lang w:val="es-ES" w:eastAsia="es-ES" w:bidi="ar-SA"/>
+        </w:rPr>
+        <w:t xml:space="preserve"> para el diseño físico y la administración de las tablas, índices e inserciones necesarias para el sistema de citas. El control de versiones y el trabajo colaborativo se han gestionado mediante Git </w:t>
+      </w:r>
+      <w:r>
+        <w:rPr>
+          <w:rFonts w:ascii="Calibri" w:hAnsi="Calibri" w:eastAsia="" w:cs="" w:asciiTheme="minorAscii" w:hAnsiTheme="minorAscii" w:eastAsiaTheme="minorEastAsia" w:cstheme="minorBidi"/>
+          <w:noProof w:val="0"/>
+          <w:color w:val="auto"/>
+          <w:sz w:val="24"/>
+          <w:szCs w:val="24"/>
+          <w:lang w:val="es-ES" w:eastAsia="es-ES" w:bidi="ar-SA"/>
+        </w:rPr>
+        <w:t>Bash</w:t>
+      </w:r>
+      <w:r>
+        <w:rPr>
+          <w:rFonts w:ascii="Calibri" w:hAnsi="Calibri" w:eastAsia="" w:cs="" w:asciiTheme="minorAscii" w:hAnsiTheme="minorAscii" w:eastAsiaTheme="minorEastAsia" w:cstheme="minorBidi"/>
+          <w:noProof w:val="0"/>
+          <w:color w:val="auto"/>
+          <w:sz w:val="24"/>
+          <w:szCs w:val="24"/>
+          <w:lang w:val="es-ES" w:eastAsia="es-ES" w:bidi="ar-SA"/>
+        </w:rPr>
+        <w:t xml:space="preserve"> y GitHub, permitiendo una integración fluida de los componentes desarrollados por cada miembro del equipo y el mantenimiento de la línea de desarrollo del proyecto.</w:t>
+      </w:r>
+    </w:p>
+    <w:p>
+      <w:pPr>
+        <w:spacing w:before="0" w:beforeAutospacing="off" w:after="240" w:afterAutospacing="off"/>
+        <w:jc w:val="both"/>
+        <w:rPr>
+          <w:noProof w:val="0"/>
+          <w:lang w:val="es-ES"/>
+        </w:rPr>
+      </w:pPr>
+      <w:r>
+        <w:rPr>
+          <w:rFonts w:ascii="Calibri" w:hAnsi="Calibri" w:eastAsia="" w:cs="" w:asciiTheme="minorAscii" w:hAnsiTheme="minorAscii" w:eastAsiaTheme="minorEastAsia" w:cstheme="minorBidi"/>
+          <w:noProof w:val="0"/>
+          <w:color w:val="auto"/>
+          <w:sz w:val="24"/>
+          <w:szCs w:val="24"/>
+          <w:lang w:val="es-ES" w:eastAsia="es-ES" w:bidi="ar-SA"/>
+        </w:rPr>
+        <w:t xml:space="preserve">En el ámbito del análisis y diseño conceptual, el grupo ha utilizado </w:t>
+      </w:r>
+      <w:r>
+        <w:rPr>
+          <w:rFonts w:ascii="Calibri" w:hAnsi="Calibri" w:eastAsia="" w:cs="" w:asciiTheme="minorAscii" w:hAnsiTheme="minorAscii" w:eastAsiaTheme="minorEastAsia" w:cstheme="minorBidi"/>
+          <w:noProof w:val="0"/>
+          <w:color w:val="auto"/>
+          <w:sz w:val="24"/>
+          <w:szCs w:val="24"/>
+          <w:lang w:val="es-ES" w:eastAsia="es-ES" w:bidi="ar-SA"/>
+        </w:rPr>
+        <w:t>Excalidraw</w:t>
+      </w:r>
+      <w:r>
+        <w:rPr>
+          <w:rFonts w:ascii="Calibri" w:hAnsi="Calibri" w:eastAsia="" w:cs="" w:asciiTheme="minorAscii" w:hAnsiTheme="minorAscii" w:eastAsiaTheme="minorEastAsia" w:cstheme="minorBidi"/>
+          <w:noProof w:val="0"/>
+          <w:color w:val="auto"/>
+          <w:sz w:val="24"/>
+          <w:szCs w:val="24"/>
+          <w:lang w:val="es-ES" w:eastAsia="es-ES" w:bidi="ar-SA"/>
+        </w:rPr>
+        <w:t xml:space="preserve"> y SharePoint de Microsoft 365 para la elaboración de los modelos de entidad-relación y los diagramas lógicos normalizados que estructuran la base de datos. La fase de documentación y redacción de la memoria se ha llevado a cabo de forma incremental utilizando Google </w:t>
+      </w:r>
+      <w:r>
+        <w:rPr>
+          <w:rFonts w:ascii="Calibri" w:hAnsi="Calibri" w:eastAsia="" w:cs="" w:asciiTheme="minorAscii" w:hAnsiTheme="minorAscii" w:eastAsiaTheme="minorEastAsia" w:cstheme="minorBidi"/>
+          <w:noProof w:val="0"/>
+          <w:color w:val="auto"/>
+          <w:sz w:val="24"/>
+          <w:szCs w:val="24"/>
+          <w:lang w:val="es-ES" w:eastAsia="es-ES" w:bidi="ar-SA"/>
+        </w:rPr>
+        <w:t>Docs</w:t>
+      </w:r>
+      <w:r>
+        <w:rPr>
+          <w:rFonts w:ascii="Calibri" w:hAnsi="Calibri" w:eastAsia="" w:cs="" w:asciiTheme="minorAscii" w:hAnsiTheme="minorAscii" w:eastAsiaTheme="minorEastAsia" w:cstheme="minorBidi"/>
+          <w:noProof w:val="0"/>
+          <w:color w:val="auto"/>
+          <w:sz w:val="24"/>
+          <w:szCs w:val="24"/>
+          <w:lang w:val="es-ES" w:eastAsia="es-ES" w:bidi="ar-SA"/>
+        </w:rPr>
+        <w:t xml:space="preserve"> para los borradores iniciales y Microsoft Office Word, tanto en su versión de escritorio como en la modalidad Online, para asegurar un formato profesional y una edición colaborativa en tiempo real. Para la resolución de dudas técnicas y la búsqueda de información específica sobre sintaxis o lógica de programación, se ha recurrido al motor de búsqueda de Google y al asistente de inteligencia artificial Gemini, asegurando así una toma de decisiones informada durante los distintos </w:t>
+      </w:r>
+      <w:r>
+        <w:rPr>
+          <w:rFonts w:ascii="Calibri" w:hAnsi="Calibri" w:eastAsia="" w:cs="" w:asciiTheme="minorAscii" w:hAnsiTheme="minorAscii" w:eastAsiaTheme="minorEastAsia" w:cstheme="minorBidi"/>
+          <w:noProof w:val="0"/>
+          <w:color w:val="auto"/>
+          <w:sz w:val="24"/>
+          <w:szCs w:val="24"/>
+          <w:lang w:val="es-ES" w:eastAsia="es-ES" w:bidi="ar-SA"/>
+        </w:rPr>
+        <w:t>sprints</w:t>
+      </w:r>
+      <w:r>
+        <w:rPr>
+          <w:rFonts w:ascii="Calibri" w:hAnsi="Calibri" w:eastAsia="" w:cs="" w:asciiTheme="minorAscii" w:hAnsiTheme="minorAscii" w:eastAsiaTheme="minorEastAsia" w:cstheme="minorBidi"/>
+          <w:noProof w:val="0"/>
+          <w:color w:val="auto"/>
+          <w:sz w:val="24"/>
+          <w:szCs w:val="24"/>
+          <w:lang w:val="es-ES" w:eastAsia="es-ES" w:bidi="ar-SA"/>
+        </w:rPr>
+        <w:t>.</w:t>
+      </w:r>
+    </w:p>
+    <w:p>
+      <w:pPr>
+        <w:spacing w:before="0" w:beforeAutospacing="off" w:after="240" w:afterAutospacing="off"/>
+        <w:jc w:val="both"/>
+        <w:rPr>
+          <w:noProof w:val="0"/>
+          <w:lang w:val="es-ES"/>
+        </w:rPr>
+      </w:pPr>
+      <w:r>
+        <w:rPr>
+          <w:rFonts w:ascii="Calibri" w:hAnsi="Calibri" w:eastAsia="" w:cs="" w:asciiTheme="minorAscii" w:hAnsiTheme="minorAscii" w:eastAsiaTheme="minorEastAsia" w:cstheme="minorBidi"/>
+          <w:noProof w:val="0"/>
+          <w:color w:val="auto"/>
+          <w:sz w:val="24"/>
+          <w:szCs w:val="24"/>
+          <w:lang w:val="es-ES" w:eastAsia="es-ES" w:bidi="ar-SA"/>
+        </w:rPr>
+        <w:t xml:space="preserve">La identidad visual y el apartado gráfico han sido fundamentales para captar la esencia del estudio de diseño de Edna Moda. El equipo ha utilizado herramientas de edición profesional como Adobe Photoshop y </w:t>
+      </w:r>
+      <w:r>
+        <w:rPr>
+          <w:rFonts w:ascii="Calibri" w:hAnsi="Calibri" w:eastAsia="" w:cs="" w:asciiTheme="minorAscii" w:hAnsiTheme="minorAscii" w:eastAsiaTheme="minorEastAsia" w:cstheme="minorBidi"/>
+          <w:noProof w:val="0"/>
+          <w:color w:val="auto"/>
+          <w:sz w:val="24"/>
+          <w:szCs w:val="24"/>
+          <w:lang w:val="es-ES" w:eastAsia="es-ES" w:bidi="ar-SA"/>
+        </w:rPr>
+        <w:t>Affinity</w:t>
+      </w:r>
+      <w:r>
+        <w:rPr>
+          <w:rFonts w:ascii="Calibri" w:hAnsi="Calibri" w:eastAsia="" w:cs="" w:asciiTheme="minorAscii" w:hAnsiTheme="minorAscii" w:eastAsiaTheme="minorEastAsia" w:cstheme="minorBidi"/>
+          <w:noProof w:val="0"/>
+          <w:color w:val="auto"/>
+          <w:sz w:val="24"/>
+          <w:szCs w:val="24"/>
+          <w:lang w:val="es-ES" w:eastAsia="es-ES" w:bidi="ar-SA"/>
+        </w:rPr>
+        <w:t xml:space="preserve">, además de </w:t>
+      </w:r>
+      <w:r>
+        <w:rPr>
+          <w:rFonts w:ascii="Calibri" w:hAnsi="Calibri" w:eastAsia="" w:cs="" w:asciiTheme="minorAscii" w:hAnsiTheme="minorAscii" w:eastAsiaTheme="minorEastAsia" w:cstheme="minorBidi"/>
+          <w:noProof w:val="0"/>
+          <w:color w:val="auto"/>
+          <w:sz w:val="24"/>
+          <w:szCs w:val="24"/>
+          <w:lang w:val="es-ES" w:eastAsia="es-ES" w:bidi="ar-SA"/>
+        </w:rPr>
+        <w:t>Canva</w:t>
+      </w:r>
+      <w:r>
+        <w:rPr>
+          <w:rFonts w:ascii="Calibri" w:hAnsi="Calibri" w:eastAsia="" w:cs="" w:asciiTheme="minorAscii" w:hAnsiTheme="minorAscii" w:eastAsiaTheme="minorEastAsia" w:cstheme="minorBidi"/>
+          <w:noProof w:val="0"/>
+          <w:color w:val="auto"/>
+          <w:sz w:val="24"/>
+          <w:szCs w:val="24"/>
+          <w:lang w:val="es-ES" w:eastAsia="es-ES" w:bidi="ar-SA"/>
+        </w:rPr>
+        <w:t xml:space="preserve"> para la maquetación rápida de elementos visuales y el diseño del logo. Para la fase de inspiración y búsqueda de referencias estéticas que definieran el estilo de la aplicación, se han empleado plataformas como Cosmos y Pinterest. Por último, la organización interna del grupo Payo Vallecano se ha apoyado en Trello para la asignación de tareas y el seguimiento de los requisitos según la metodología SCRUM, mientras que la comunicación inmediata y la coordinación diaria se han centralizado a través de un grupo de WhatsApp, garantizando así la fluidez necesaria para alcanzar los objetivos en los plazos establecidos.</w:t>
+      </w:r>
+    </w:p>
+    <w:p/>
+    <w:p/>
     <w:p>
       <w:pPr>
         <w:pStyle w:val="Ttulo1"/>
@@ -1513,7 +2032,7 @@
           <w:numId w:val="1"/>
         </w:numPr>
       </w:pPr>
-      <w:bookmarkStart w:id="5" w:name="_Toc164530071"/>
+      <w:bookmarkStart w:name="_Toc164530071" w:id="5"/>
       <w:r>
         <w:t>Desarrollo e implementación</w:t>
       </w:r>
@@ -1574,7 +2093,7 @@
           <w:numId w:val="1"/>
         </w:numPr>
       </w:pPr>
-      <w:bookmarkStart w:id="6" w:name="_Toc164530072"/>
+      <w:bookmarkStart w:name="_Toc164530072" w:id="6"/>
       <w:r>
         <w:t>Metodología</w:t>
       </w:r>
@@ -1638,7 +2157,7 @@
           <w:numId w:val="1"/>
         </w:numPr>
       </w:pPr>
-      <w:bookmarkStart w:id="7" w:name="_Toc164530073"/>
+      <w:bookmarkStart w:name="_Toc164530073" w:id="7"/>
       <w:r>
         <w:t>Resultados y conclusiones</w:t>
       </w:r>
@@ -1672,7 +2191,7 @@
           <w:numId w:val="1"/>
         </w:numPr>
       </w:pPr>
-      <w:bookmarkStart w:id="8" w:name="_Toc164530074"/>
+      <w:bookmarkStart w:name="_Toc164530074" w:id="8"/>
       <w:r>
         <w:t>Trabajos futuros</w:t>
       </w:r>
@@ -1695,7 +2214,7 @@
         <w:spacing w:after="160" w:line="259" w:lineRule="auto"/>
         <w:jc w:val="left"/>
         <w:rPr>
-          <w:rFonts w:ascii="Calibri" w:eastAsia="Times New Roman" w:hAnsi="Calibri" w:cs="Times New Roman"/>
+          <w:rFonts w:ascii="Calibri" w:hAnsi="Calibri" w:eastAsia="Times New Roman" w:cs="Times New Roman"/>
           <w:b/>
           <w:bCs/>
           <w:noProof/>
@@ -1713,7 +2232,7 @@
       <w:pPr>
         <w:pStyle w:val="Ttulo1"/>
       </w:pPr>
-      <w:bookmarkStart w:id="9" w:name="_Toc164530075"/>
+      <w:bookmarkStart w:name="_Toc164530075" w:id="9"/>
       <w:r>
         <w:t>Anexos</w:t>
       </w:r>
@@ -1726,7 +2245,7 @@
           <w:sz w:val="24"/>
         </w:rPr>
       </w:pPr>
-      <w:bookmarkStart w:id="10" w:name="_Toc164530076"/>
+      <w:bookmarkStart w:name="_Toc164530076" w:id="10"/>
       <w:r>
         <w:rPr>
           <w:sz w:val="24"/>
@@ -1771,7 +2290,7 @@
           <w:sz w:val="24"/>
         </w:rPr>
       </w:pPr>
-      <w:bookmarkStart w:id="11" w:name="_Toc164530077"/>
+      <w:bookmarkStart w:name="_Toc164530077" w:id="11"/>
       <w:r>
         <w:rPr>
           <w:sz w:val="24"/>
@@ -1807,7 +2326,7 @@
       <w:pPr>
         <w:pStyle w:val="Ttulo1"/>
       </w:pPr>
-      <w:bookmarkStart w:id="12" w:name="_Toc164530078"/>
+      <w:bookmarkStart w:name="_Toc164530078" w:id="12"/>
       <w:r>
         <w:rPr>
           <w:sz w:val="24"/>
@@ -1902,7 +2421,7 @@
     <w:sectPr>
       <w:headerReference w:type="default" r:id="rId12"/>
       <w:footerReference w:type="default" r:id="rId13"/>
-      <w:pgSz w:w="11906" w:h="16838"/>
+      <w:pgSz w:w="11906" w:h="16838" w:orient="portrait"/>
       <w:pgMar w:top="1418" w:right="1418" w:bottom="1418" w:left="1418" w:header="709" w:footer="709" w:gutter="0"/>
       <w:pgNumType w:start="0"/>
       <w:cols w:space="708"/>
@@ -2013,7 +2532,7 @@
 </file>
 
 <file path=word/header1.xml><?xml version="1.0" encoding="utf-8"?>
-<w:hdr xmlns:wpc="http://schemas.microsoft.com/office/word/2010/wordprocessingCanvas" xmlns:cx="http://schemas.microsoft.com/office/drawing/2014/chartex" xmlns:cx1="http://schemas.microsoft.com/office/drawing/2015/9/8/chartex" xmlns:cx2="http://schemas.microsoft.com/office/drawing/2015/10/21/chartex" xmlns:cx3="http://schemas.microsoft.com/office/drawing/2016/5/9/chartex" xmlns:cx4="http://schemas.microsoft.com/office/drawing/2016/5/10/chartex" xmlns:cx5="http://schemas.microsoft.com/office/drawing/2016/5/11/chartex" xmlns:cx6="http://schemas.microsoft.com/office/drawing/2016/5/12/chartex" xmlns:cx7="http://schemas.microsoft.com/office/drawing/2016/5/13/chartex" xmlns:cx8="http://schemas.microsoft.com/office/drawing/2016/5/14/chartex" xmlns:mc="http://schemas.openxmlformats.org/markup-compatibility/2006" xmlns:aink="http://schemas.microsoft.com/office/drawing/2016/ink" xmlns:am3d="http://schemas.microsoft.com/office/drawing/2017/model3d" xmlns:o="urn:schemas-microsoft-com:office:office" xmlns:oel="http://schemas.microsoft.com/office/2019/extlst" xmlns:r="http://schemas.openxmlformats.org/officeDocument/2006/relationships" xmlns:m="http://schemas.openxmlformats.org/officeDocument/2006/math" xmlns:v="urn:schemas-microsoft-com:vml" xmlns:wp14="http://schemas.microsoft.com/office/word/2010/wordprocessingDrawing" xmlns:wp="http://schemas.openxmlformats.org/drawingml/2006/wordprocessingDrawing" xmlns:w10="urn:schemas-microsoft-com:office:word" xmlns:w="http://schemas.openxmlformats.org/wordprocessingml/2006/main" xmlns:w14="http://schemas.microsoft.com/office/word/2010/wordml" xmlns:w15="http://schemas.microsoft.com/office/word/2012/wordml" xmlns:w16cex="http://schemas.microsoft.com/office/word/2018/wordml/cex" xmlns:w16cid="http://schemas.microsoft.com/office/word/2016/wordml/cid" xmlns:w16="http://schemas.microsoft.com/office/word/2018/wordml" xmlns:w16du="http://schemas.microsoft.com/office/word/2023/wordml/word16du" xmlns:w16sdtdh="http://schemas.microsoft.com/office/word/2020/wordml/sdtdatahash" xmlns:w16sdtfl="http://schemas.microsoft.com/office/word/2024/wordml/sdtformatlock" xmlns:w16se="http://schemas.microsoft.com/office/word/2015/wordml/symex" xmlns:wpg="http://schemas.microsoft.com/office/word/2010/wordprocessingGroup" xmlns:wpi="http://schemas.microsoft.com/office/word/2010/wordprocessingInk" xmlns:wne="http://schemas.microsoft.com/office/word/2006/wordml" xmlns:wps="http://schemas.microsoft.com/office/word/2010/wordprocessingShape" mc:Ignorable="w14 w15 w16se w16cid w16 w16cex w16sdtdh w16sdtfl w16du wp14">
+<w:hdr xmlns:wpc="http://schemas.microsoft.com/office/word/2010/wordprocessingCanvas" xmlns:cx="http://schemas.microsoft.com/office/drawing/2014/chartex" xmlns:cx1="http://schemas.microsoft.com/office/drawing/2015/9/8/chartex" xmlns:cx2="http://schemas.microsoft.com/office/drawing/2015/10/21/chartex" xmlns:cx3="http://schemas.microsoft.com/office/drawing/2016/5/9/chartex" xmlns:cx4="http://schemas.microsoft.com/office/drawing/2016/5/10/chartex" xmlns:cx5="http://schemas.microsoft.com/office/drawing/2016/5/11/chartex" xmlns:cx6="http://schemas.microsoft.com/office/drawing/2016/5/12/chartex" xmlns:cx7="http://schemas.microsoft.com/office/drawing/2016/5/13/chartex" xmlns:cx8="http://schemas.microsoft.com/office/drawing/2016/5/14/chartex" xmlns:mc="http://schemas.openxmlformats.org/markup-compatibility/2006" xmlns:aink="http://schemas.microsoft.com/office/drawing/2016/ink" xmlns:am3d="http://schemas.microsoft.com/office/drawing/2017/model3d" xmlns:o="urn:schemas-microsoft-com:office:office" xmlns:oel="http://schemas.microsoft.com/office/2019/extlst" xmlns:r="http://schemas.openxmlformats.org/officeDocument/2006/relationships" xmlns:m="http://schemas.openxmlformats.org/officeDocument/2006/math" xmlns:v="urn:schemas-microsoft-com:vml" xmlns:wp14="http://schemas.microsoft.com/office/word/2010/wordprocessingDrawing" xmlns:wp="http://schemas.openxmlformats.org/drawingml/2006/wordprocessingDrawing" xmlns:w10="urn:schemas-microsoft-com:office:word" xmlns:w="http://schemas.openxmlformats.org/wordprocessingml/2006/main" xmlns:w14="http://schemas.microsoft.com/office/word/2010/wordml" xmlns:w15="http://schemas.microsoft.com/office/word/2012/wordml" xmlns:w16cex="http://schemas.microsoft.com/office/word/2018/wordml/cex" xmlns:w16cid="http://schemas.microsoft.com/office/word/2016/wordml/cid" xmlns:w16="http://schemas.microsoft.com/office/word/2018/wordml" xmlns:w16du="http://schemas.microsoft.com/office/word/2023/wordml/word16du" xmlns:w16sdtdh="http://schemas.microsoft.com/office/word/2020/wordml/sdtdatahash" xmlns:w16sdtfl="http://schemas.microsoft.com/office/word/2024/wordml/sdtformatlock" xmlns:w16se="http://schemas.microsoft.com/office/word/2015/wordml/symex" xmlns:wpg="http://schemas.microsoft.com/office/word/2010/wordprocessingGroup" xmlns:wpi="http://schemas.microsoft.com/office/word/2010/wordprocessingInk" xmlns:wne="http://schemas.microsoft.com/office/word/2006/wordml" xmlns:wps="http://schemas.microsoft.com/office/word/2010/wordprocessingShape" xmlns:a="http://schemas.openxmlformats.org/drawingml/2006/main" xmlns:pic="http://schemas.openxmlformats.org/drawingml/2006/picture" xmlns:a14="http://schemas.microsoft.com/office/drawing/2010/main" mc:Ignorable="w14 w15 w16se w16cid w16 w16cex w16sdtdh w16sdtfl w16du wp14">
   <w:p>
     <w:pPr>
       <w:pStyle w:val="Encabezado"/>
@@ -2368,7 +2887,7 @@
   <w:docDefaults>
     <w:rPrDefault>
       <w:rPr>
-        <w:rFonts w:asciiTheme="minorHAnsi" w:eastAsiaTheme="minorHAnsi" w:hAnsiTheme="minorHAnsi" w:cstheme="minorBidi"/>
+        <w:rFonts w:asciiTheme="minorHAnsi" w:hAnsiTheme="minorHAnsi" w:eastAsiaTheme="minorHAnsi" w:cstheme="minorBidi"/>
         <w:sz w:val="22"/>
         <w:szCs w:val="22"/>
         <w:lang w:val="es-ES" w:eastAsia="en-US" w:bidi="ar-SA"/>
@@ -2383,14 +2902,14 @@
   <w:latentStyles w:defLockedState="0" w:defUIPriority="99" w:defSemiHidden="0" w:defUnhideWhenUsed="0" w:defQFormat="0" w:count="376">
     <w:lsdException w:name="Normal" w:uiPriority="0" w:qFormat="1"/>
     <w:lsdException w:name="heading 1" w:uiPriority="0" w:qFormat="1"/>
-    <w:lsdException w:name="heading 2" w:semiHidden="1" w:uiPriority="9" w:unhideWhenUsed="1" w:qFormat="1"/>
-    <w:lsdException w:name="heading 3" w:semiHidden="1" w:uiPriority="9" w:unhideWhenUsed="1" w:qFormat="1"/>
-    <w:lsdException w:name="heading 4" w:semiHidden="1" w:uiPriority="9" w:unhideWhenUsed="1" w:qFormat="1"/>
-    <w:lsdException w:name="heading 5" w:semiHidden="1" w:uiPriority="9" w:unhideWhenUsed="1" w:qFormat="1"/>
-    <w:lsdException w:name="heading 6" w:semiHidden="1" w:uiPriority="9" w:unhideWhenUsed="1" w:qFormat="1"/>
-    <w:lsdException w:name="heading 7" w:semiHidden="1" w:uiPriority="9" w:unhideWhenUsed="1" w:qFormat="1"/>
-    <w:lsdException w:name="heading 8" w:semiHidden="1" w:uiPriority="9" w:unhideWhenUsed="1" w:qFormat="1"/>
-    <w:lsdException w:name="heading 9" w:semiHidden="1" w:uiPriority="9" w:unhideWhenUsed="1" w:qFormat="1"/>
+    <w:lsdException w:name="heading 2" w:uiPriority="9" w:semiHidden="1" w:unhideWhenUsed="1" w:qFormat="1"/>
+    <w:lsdException w:name="heading 3" w:uiPriority="9" w:semiHidden="1" w:unhideWhenUsed="1" w:qFormat="1"/>
+    <w:lsdException w:name="heading 4" w:uiPriority="9" w:semiHidden="1" w:unhideWhenUsed="1" w:qFormat="1"/>
+    <w:lsdException w:name="heading 5" w:uiPriority="9" w:semiHidden="1" w:unhideWhenUsed="1" w:qFormat="1"/>
+    <w:lsdException w:name="heading 6" w:uiPriority="9" w:semiHidden="1" w:unhideWhenUsed="1" w:qFormat="1"/>
+    <w:lsdException w:name="heading 7" w:uiPriority="9" w:semiHidden="1" w:unhideWhenUsed="1" w:qFormat="1"/>
+    <w:lsdException w:name="heading 8" w:uiPriority="9" w:semiHidden="1" w:unhideWhenUsed="1" w:qFormat="1"/>
+    <w:lsdException w:name="heading 9" w:uiPriority="9" w:semiHidden="1" w:unhideWhenUsed="1" w:qFormat="1"/>
     <w:lsdException w:name="index 1" w:semiHidden="1" w:unhideWhenUsed="1"/>
     <w:lsdException w:name="index 2" w:semiHidden="1" w:unhideWhenUsed="1"/>
     <w:lsdException w:name="index 3" w:semiHidden="1" w:unhideWhenUsed="1"/>
@@ -2400,22 +2919,22 @@
     <w:lsdException w:name="index 7" w:semiHidden="1" w:unhideWhenUsed="1"/>
     <w:lsdException w:name="index 8" w:semiHidden="1" w:unhideWhenUsed="1"/>
     <w:lsdException w:name="index 9" w:semiHidden="1" w:unhideWhenUsed="1"/>
-    <w:lsdException w:name="toc 1" w:semiHidden="1" w:uiPriority="39" w:unhideWhenUsed="1"/>
-    <w:lsdException w:name="toc 2" w:semiHidden="1" w:uiPriority="39" w:unhideWhenUsed="1"/>
-    <w:lsdException w:name="toc 3" w:semiHidden="1" w:uiPriority="39" w:unhideWhenUsed="1"/>
-    <w:lsdException w:name="toc 4" w:semiHidden="1" w:uiPriority="39" w:unhideWhenUsed="1"/>
-    <w:lsdException w:name="toc 5" w:semiHidden="1" w:uiPriority="39" w:unhideWhenUsed="1"/>
-    <w:lsdException w:name="toc 6" w:semiHidden="1" w:uiPriority="39" w:unhideWhenUsed="1"/>
-    <w:lsdException w:name="toc 7" w:semiHidden="1" w:uiPriority="39" w:unhideWhenUsed="1"/>
-    <w:lsdException w:name="toc 8" w:semiHidden="1" w:uiPriority="39" w:unhideWhenUsed="1"/>
-    <w:lsdException w:name="toc 9" w:semiHidden="1" w:uiPriority="39" w:unhideWhenUsed="1"/>
+    <w:lsdException w:name="toc 1" w:uiPriority="39" w:semiHidden="1" w:unhideWhenUsed="1"/>
+    <w:lsdException w:name="toc 2" w:uiPriority="39" w:semiHidden="1" w:unhideWhenUsed="1"/>
+    <w:lsdException w:name="toc 3" w:uiPriority="39" w:semiHidden="1" w:unhideWhenUsed="1"/>
+    <w:lsdException w:name="toc 4" w:uiPriority="39" w:semiHidden="1" w:unhideWhenUsed="1"/>
+    <w:lsdException w:name="toc 5" w:uiPriority="39" w:semiHidden="1" w:unhideWhenUsed="1"/>
+    <w:lsdException w:name="toc 6" w:uiPriority="39" w:semiHidden="1" w:unhideWhenUsed="1"/>
+    <w:lsdException w:name="toc 7" w:uiPriority="39" w:semiHidden="1" w:unhideWhenUsed="1"/>
+    <w:lsdException w:name="toc 8" w:uiPriority="39" w:semiHidden="1" w:unhideWhenUsed="1"/>
+    <w:lsdException w:name="toc 9" w:uiPriority="39" w:semiHidden="1" w:unhideWhenUsed="1"/>
     <w:lsdException w:name="Normal Indent" w:semiHidden="1" w:unhideWhenUsed="1"/>
     <w:lsdException w:name="footnote text" w:semiHidden="1" w:unhideWhenUsed="1"/>
     <w:lsdException w:name="annotation text" w:semiHidden="1" w:unhideWhenUsed="1"/>
     <w:lsdException w:name="header" w:semiHidden="1" w:unhideWhenUsed="1"/>
     <w:lsdException w:name="footer" w:semiHidden="1" w:unhideWhenUsed="1"/>
     <w:lsdException w:name="index heading" w:semiHidden="1" w:unhideWhenUsed="1"/>
-    <w:lsdException w:name="caption" w:semiHidden="1" w:uiPriority="35" w:unhideWhenUsed="1" w:qFormat="1"/>
+    <w:lsdException w:name="caption" w:uiPriority="35" w:semiHidden="1" w:unhideWhenUsed="1" w:qFormat="1"/>
     <w:lsdException w:name="table of figures" w:semiHidden="1" w:unhideWhenUsed="1"/>
     <w:lsdException w:name="envelope address" w:semiHidden="1" w:unhideWhenUsed="1"/>
     <w:lsdException w:name="envelope return" w:semiHidden="1" w:unhideWhenUsed="1"/>
@@ -2446,7 +2965,7 @@
     <w:lsdException w:name="Title" w:uiPriority="10" w:qFormat="1"/>
     <w:lsdException w:name="Closing" w:semiHidden="1" w:unhideWhenUsed="1"/>
     <w:lsdException w:name="Signature" w:semiHidden="1" w:unhideWhenUsed="1"/>
-    <w:lsdException w:name="Default Paragraph Font" w:semiHidden="1" w:uiPriority="1" w:unhideWhenUsed="1"/>
+    <w:lsdException w:name="Default Paragraph Font" w:uiPriority="1" w:semiHidden="1" w:unhideWhenUsed="1"/>
     <w:lsdException w:name="Body Text" w:semiHidden="1" w:unhideWhenUsed="1"/>
     <w:lsdException w:name="Body Text Indent" w:semiHidden="1" w:unhideWhenUsed="1"/>
     <w:lsdException w:name="List Continue" w:semiHidden="1" w:unhideWhenUsed="1"/>
@@ -2475,7 +2994,7 @@
     <w:lsdException w:name="E-mail Signature" w:semiHidden="1" w:unhideWhenUsed="1"/>
     <w:lsdException w:name="HTML Top of Form" w:semiHidden="1" w:unhideWhenUsed="1"/>
     <w:lsdException w:name="HTML Bottom of Form" w:semiHidden="1" w:unhideWhenUsed="1"/>
-    <w:lsdException w:name="Normal (Web)" w:semiHidden="1" w:uiPriority="0" w:unhideWhenUsed="1"/>
+    <w:lsdException w:name="Normal (Web)" w:uiPriority="0" w:semiHidden="1" w:unhideWhenUsed="1"/>
     <w:lsdException w:name="HTML Acronym" w:semiHidden="1" w:unhideWhenUsed="1"/>
     <w:lsdException w:name="HTML Address" w:semiHidden="1" w:unhideWhenUsed="1"/>
     <w:lsdException w:name="HTML Cite" w:semiHidden="1" w:unhideWhenUsed="1"/>
@@ -2646,8 +3165,8 @@
     <w:lsdException w:name="Subtle Reference" w:uiPriority="31" w:qFormat="1"/>
     <w:lsdException w:name="Intense Reference" w:uiPriority="32" w:qFormat="1"/>
     <w:lsdException w:name="Book Title" w:uiPriority="33" w:qFormat="1"/>
-    <w:lsdException w:name="Bibliography" w:semiHidden="1" w:uiPriority="37" w:unhideWhenUsed="1"/>
-    <w:lsdException w:name="TOC Heading" w:semiHidden="1" w:uiPriority="39" w:unhideWhenUsed="1" w:qFormat="1"/>
+    <w:lsdException w:name="Bibliography" w:uiPriority="37" w:semiHidden="1" w:unhideWhenUsed="1"/>
+    <w:lsdException w:name="TOC Heading" w:uiPriority="39" w:semiHidden="1" w:unhideWhenUsed="1" w:qFormat="1"/>
     <w:lsdException w:name="Plain Table 1" w:uiPriority="41"/>
     <w:lsdException w:name="Plain Table 2" w:uiPriority="42"/>
     <w:lsdException w:name="Plain Table 3" w:uiPriority="43"/>
@@ -2758,7 +3277,7 @@
     <w:lsdException w:name="Unresolved Mention" w:semiHidden="1" w:unhideWhenUsed="1"/>
     <w:lsdException w:name="Smart Link" w:semiHidden="1" w:unhideWhenUsed="1"/>
   </w:latentStyles>
-  <w:style w:type="paragraph" w:default="1" w:styleId="Normal">
+  <w:style w:type="paragraph" w:styleId="Normal" w:default="1">
     <w:name w:val="Normal"/>
     <w:qFormat/>
     <w:rsid w:val="00AC38AD"/>
@@ -2785,7 +3304,7 @@
       <w:outlineLvl w:val="0"/>
     </w:pPr>
     <w:rPr>
-      <w:rFonts w:ascii="Calibri" w:eastAsia="Times New Roman" w:hAnsi="Calibri" w:cs="Times New Roman"/>
+      <w:rFonts w:ascii="Calibri" w:hAnsi="Calibri" w:eastAsia="Times New Roman" w:cs="Times New Roman"/>
       <w:b/>
       <w:bCs/>
       <w:noProof/>
@@ -2795,13 +3314,13 @@
       <w:szCs w:val="32"/>
     </w:rPr>
   </w:style>
-  <w:style w:type="character" w:default="1" w:styleId="Fuentedeprrafopredeter">
+  <w:style w:type="character" w:styleId="Fuentedeprrafopredeter" w:default="1">
     <w:name w:val="Default Paragraph Font"/>
     <w:uiPriority w:val="1"/>
     <w:semiHidden/>
     <w:unhideWhenUsed/>
   </w:style>
-  <w:style w:type="table" w:default="1" w:styleId="Tablanormal">
+  <w:style w:type="table" w:styleId="Tablanormal" w:default="1">
     <w:name w:val="Normal Table"/>
     <w:uiPriority w:val="99"/>
     <w:semiHidden/>
@@ -2816,19 +3335,19 @@
       </w:tblCellMar>
     </w:tblPr>
   </w:style>
-  <w:style w:type="numbering" w:default="1" w:styleId="Sinlista">
+  <w:style w:type="numbering" w:styleId="Sinlista" w:default="1">
     <w:name w:val="No List"/>
     <w:uiPriority w:val="99"/>
     <w:semiHidden/>
     <w:unhideWhenUsed/>
   </w:style>
-  <w:style w:type="character" w:customStyle="1" w:styleId="Ttulo1Car">
+  <w:style w:type="character" w:styleId="Ttulo1Car" w:customStyle="1">
     <w:name w:val="Título 1 Car"/>
     <w:basedOn w:val="Fuentedeprrafopredeter"/>
     <w:link w:val="Ttulo1"/>
     <w:rsid w:val="00AC38AD"/>
     <w:rPr>
-      <w:rFonts w:ascii="Calibri" w:eastAsia="Times New Roman" w:hAnsi="Calibri" w:cs="Times New Roman"/>
+      <w:rFonts w:ascii="Calibri" w:hAnsi="Calibri" w:eastAsia="Times New Roman" w:cs="Times New Roman"/>
       <w:b/>
       <w:bCs/>
       <w:noProof/>
@@ -2847,7 +3366,7 @@
       <w:spacing w:before="100" w:beforeAutospacing="1" w:after="100" w:afterAutospacing="1" w:line="240" w:lineRule="auto"/>
     </w:pPr>
     <w:rPr>
-      <w:rFonts w:ascii="Times New Roman" w:eastAsia="Times New Roman" w:hAnsi="Times New Roman" w:cs="Times New Roman"/>
+      <w:rFonts w:ascii="Times New Roman" w:hAnsi="Times New Roman" w:eastAsia="Times New Roman" w:cs="Times New Roman"/>
       <w:szCs w:val="24"/>
     </w:rPr>
   </w:style>
@@ -2875,7 +3394,7 @@
       <w:spacing w:after="0" w:line="240" w:lineRule="auto"/>
     </w:pPr>
   </w:style>
-  <w:style w:type="character" w:customStyle="1" w:styleId="EncabezadoCar">
+  <w:style w:type="character" w:styleId="EncabezadoCar" w:customStyle="1">
     <w:name w:val="Encabezado Car"/>
     <w:basedOn w:val="Fuentedeprrafopredeter"/>
     <w:link w:val="Encabezado"/>
@@ -2902,7 +3421,7 @@
       <w:spacing w:after="0" w:line="240" w:lineRule="auto"/>
     </w:pPr>
   </w:style>
-  <w:style w:type="character" w:customStyle="1" w:styleId="PiedepginaCar">
+  <w:style w:type="character" w:styleId="PiedepginaCar" w:customStyle="1">
     <w:name w:val="Pie de página Car"/>
     <w:basedOn w:val="Fuentedeprrafopredeter"/>
     <w:link w:val="Piedepgina"/>
@@ -2928,7 +3447,7 @@
       <w:outlineLvl w:val="9"/>
     </w:pPr>
     <w:rPr>
-      <w:rFonts w:asciiTheme="majorHAnsi" w:eastAsiaTheme="majorEastAsia" w:hAnsiTheme="majorHAnsi" w:cstheme="majorBidi"/>
+      <w:rFonts w:asciiTheme="majorHAnsi" w:hAnsiTheme="majorHAnsi" w:eastAsiaTheme="majorEastAsia" w:cstheme="majorBidi"/>
       <w:b w:val="0"/>
       <w:bCs w:val="0"/>
       <w:noProof w:val="0"/>
@@ -2952,7 +3471,7 @@
 </file>
 
 <file path=word/theme/theme1.xml><?xml version="1.0" encoding="utf-8"?>
-<a:theme xmlns:a="http://schemas.openxmlformats.org/drawingml/2006/main" name="Tema de Office">
+<a:theme xmlns:a="http://schemas.openxmlformats.org/drawingml/2006/main" xmlns:thm15="http://schemas.microsoft.com/office/thememl/2012/main" name="Tema de Office">
   <a:themeElements>
     <a:clrScheme name="Office">
       <a:dk1>

</xml_diff>

<commit_message>
Añadido logo del grupo a la memoria + PDF 1er Sprint
</commit_message>
<xml_diff>
--- a/Documentacion/Memoria Proyecto Integrador.docx
+++ b/Documentacion/Memoria Proyecto Integrador.docx
@@ -1,6 +1,6 @@
 
 <file path=word/document.xml><?xml version="1.0" encoding="utf-8"?>
-<w:document xmlns:wpc="http://schemas.microsoft.com/office/word/2010/wordprocessingCanvas" xmlns:cx="http://schemas.microsoft.com/office/drawing/2014/chartex" xmlns:cx1="http://schemas.microsoft.com/office/drawing/2015/9/8/chartex" xmlns:cx2="http://schemas.microsoft.com/office/drawing/2015/10/21/chartex" xmlns:cx3="http://schemas.microsoft.com/office/drawing/2016/5/9/chartex" xmlns:cx4="http://schemas.microsoft.com/office/drawing/2016/5/10/chartex" xmlns:cx5="http://schemas.microsoft.com/office/drawing/2016/5/11/chartex" xmlns:cx6="http://schemas.microsoft.com/office/drawing/2016/5/12/chartex" xmlns:cx7="http://schemas.microsoft.com/office/drawing/2016/5/13/chartex" xmlns:cx8="http://schemas.microsoft.com/office/drawing/2016/5/14/chartex" xmlns:mc="http://schemas.openxmlformats.org/markup-compatibility/2006" xmlns:aink="http://schemas.microsoft.com/office/drawing/2016/ink" xmlns:am3d="http://schemas.microsoft.com/office/drawing/2017/model3d" xmlns:o="urn:schemas-microsoft-com:office:office" xmlns:oel="http://schemas.microsoft.com/office/2019/extlst" xmlns:r="http://schemas.openxmlformats.org/officeDocument/2006/relationships" xmlns:m="http://schemas.openxmlformats.org/officeDocument/2006/math" xmlns:v="urn:schemas-microsoft-com:vml" xmlns:wp14="http://schemas.microsoft.com/office/word/2010/wordprocessingDrawing" xmlns:wp="http://schemas.openxmlformats.org/drawingml/2006/wordprocessingDrawing" xmlns:w10="urn:schemas-microsoft-com:office:word" xmlns:w="http://schemas.openxmlformats.org/wordprocessingml/2006/main" xmlns:w14="http://schemas.microsoft.com/office/word/2010/wordml" xmlns:w15="http://schemas.microsoft.com/office/word/2012/wordml" xmlns:w16cex="http://schemas.microsoft.com/office/word/2018/wordml/cex" xmlns:w16cid="http://schemas.microsoft.com/office/word/2016/wordml/cid" xmlns:w16="http://schemas.microsoft.com/office/word/2018/wordml" xmlns:w16du="http://schemas.microsoft.com/office/word/2023/wordml/word16du" xmlns:w16sdtdh="http://schemas.microsoft.com/office/word/2020/wordml/sdtdatahash" xmlns:w16sdtfl="http://schemas.microsoft.com/office/word/2024/wordml/sdtformatlock" xmlns:w16se="http://schemas.microsoft.com/office/word/2015/wordml/symex" xmlns:wpg="http://schemas.microsoft.com/office/word/2010/wordprocessingGroup" xmlns:wpi="http://schemas.microsoft.com/office/word/2010/wordprocessingInk" xmlns:wne="http://schemas.microsoft.com/office/word/2006/wordml" xmlns:wps="http://schemas.microsoft.com/office/word/2010/wordprocessingShape" xmlns:a="http://schemas.openxmlformats.org/drawingml/2006/main" xmlns:pic="http://schemas.openxmlformats.org/drawingml/2006/picture" xmlns:a14="http://schemas.microsoft.com/office/drawing/2010/main" mc:Ignorable="w14 w15 w16se w16cid w16 w16cex w16sdtdh w16sdtfl w16du wp14">
+<w:document xmlns:wpc="http://schemas.microsoft.com/office/word/2010/wordprocessingCanvas" xmlns:cx="http://schemas.microsoft.com/office/drawing/2014/chartex" xmlns:cx1="http://schemas.microsoft.com/office/drawing/2015/9/8/chartex" xmlns:cx2="http://schemas.microsoft.com/office/drawing/2015/10/21/chartex" xmlns:cx3="http://schemas.microsoft.com/office/drawing/2016/5/9/chartex" xmlns:cx4="http://schemas.microsoft.com/office/drawing/2016/5/10/chartex" xmlns:cx5="http://schemas.microsoft.com/office/drawing/2016/5/11/chartex" xmlns:cx6="http://schemas.microsoft.com/office/drawing/2016/5/12/chartex" xmlns:cx7="http://schemas.microsoft.com/office/drawing/2016/5/13/chartex" xmlns:cx8="http://schemas.microsoft.com/office/drawing/2016/5/14/chartex" xmlns:mc="http://schemas.openxmlformats.org/markup-compatibility/2006" xmlns:aink="http://schemas.microsoft.com/office/drawing/2016/ink" xmlns:am3d="http://schemas.microsoft.com/office/drawing/2017/model3d" xmlns:o="urn:schemas-microsoft-com:office:office" xmlns:oel="http://schemas.microsoft.com/office/2019/extlst" xmlns:r="http://schemas.openxmlformats.org/officeDocument/2006/relationships" xmlns:m="http://schemas.openxmlformats.org/officeDocument/2006/math" xmlns:v="urn:schemas-microsoft-com:vml" xmlns:wp14="http://schemas.microsoft.com/office/word/2010/wordprocessingDrawing" xmlns:wp="http://schemas.openxmlformats.org/drawingml/2006/wordprocessingDrawing" xmlns:w10="urn:schemas-microsoft-com:office:word" xmlns:w="http://schemas.openxmlformats.org/wordprocessingml/2006/main" xmlns:w14="http://schemas.microsoft.com/office/word/2010/wordml" xmlns:w15="http://schemas.microsoft.com/office/word/2012/wordml" xmlns:w16cex="http://schemas.microsoft.com/office/word/2018/wordml/cex" xmlns:w16cid="http://schemas.microsoft.com/office/word/2016/wordml/cid" xmlns:w16="http://schemas.microsoft.com/office/word/2018/wordml" xmlns:w16du="http://schemas.microsoft.com/office/word/2023/wordml/word16du" xmlns:w16sdtdh="http://schemas.microsoft.com/office/word/2020/wordml/sdtdatahash" xmlns:w16sdtfl="http://schemas.microsoft.com/office/word/2024/wordml/sdtformatlock" xmlns:w16se="http://schemas.microsoft.com/office/word/2015/wordml/symex" xmlns:wpg="http://schemas.microsoft.com/office/word/2010/wordprocessingGroup" xmlns:wpi="http://schemas.microsoft.com/office/word/2010/wordprocessingInk" xmlns:wne="http://schemas.microsoft.com/office/word/2006/wordml" xmlns:wps="http://schemas.microsoft.com/office/word/2010/wordprocessingShape" mc:Ignorable="w14 w15 w16se w16cid w16 w16cex w16sdtdh w16sdtfl w16du wp14">
   <w:body>
     <w:sdt>
       <w:sdtPr>
@@ -132,18 +132,16 @@
               <w:sz w:val="52"/>
               <w:szCs w:val="72"/>
             </w:rPr>
-            <w:t>Payo Vallecano</w:t>
+            <w:t>Payo Vallecan</w:t>
           </w:r>
-        </w:p>
-        <w:p>
-          <w:pPr>
-            <w:jc w:val="center"/>
-          </w:pPr>
-        </w:p>
-        <w:p>
-          <w:pPr>
-            <w:jc w:val="center"/>
-          </w:pPr>
+          <w:r>
+            <w:rPr>
+              <w:rFonts w:asciiTheme="majorHAnsi" w:hAnsiTheme="majorHAnsi"/>
+              <w:sz w:val="52"/>
+              <w:szCs w:val="72"/>
+            </w:rPr>
+            <w:t>o</w:t>
+          </w:r>
         </w:p>
         <w:p>
           <w:pPr>
@@ -151,45 +149,59 @@
           </w:pPr>
           <w:r>
             <w:rPr>
-              <w:rFonts w:asciiTheme="majorHAnsi" w:hAnsiTheme="majorHAnsi"/>
-              <w:sz w:val="52"/>
-              <w:szCs w:val="72"/>
+              <w:noProof/>
             </w:rPr>
-            <w:t>[LOG</w:t>
-          </w:r>
-          <w:r>
-            <w:rPr>
-              <w:rFonts w:asciiTheme="majorHAnsi" w:hAnsiTheme="majorHAnsi"/>
-              <w:sz w:val="52"/>
-              <w:szCs w:val="72"/>
-            </w:rPr>
-            <w:t>O</w:t>
-          </w:r>
-          <w:r>
-            <w:rPr>
-              <w:rFonts w:asciiTheme="majorHAnsi" w:hAnsiTheme="majorHAnsi"/>
-              <w:sz w:val="52"/>
-              <w:szCs w:val="72"/>
-            </w:rPr>
-            <w:t>]</w:t>
+            <w:drawing>
+              <wp:inline distT="0" distB="0" distL="0" distR="0" wp14:anchorId="56DAD1B8" wp14:editId="550B3D84">
+                <wp:extent cx="2238375" cy="2238375"/>
+                <wp:effectExtent l="0" t="0" r="0" b="0"/>
+                <wp:docPr id="29408032" name="Imagen 1"/>
+                <wp:cNvGraphicFramePr>
+                  <a:graphicFrameLocks xmlns:a="http://schemas.openxmlformats.org/drawingml/2006/main" noChangeAspect="1"/>
+                </wp:cNvGraphicFramePr>
+                <a:graphic xmlns:a="http://schemas.openxmlformats.org/drawingml/2006/main">
+                  <a:graphicData uri="http://schemas.openxmlformats.org/drawingml/2006/picture">
+                    <pic:pic xmlns:pic="http://schemas.openxmlformats.org/drawingml/2006/picture">
+                      <pic:nvPicPr>
+                        <pic:cNvPr id="0" name="Picture 1"/>
+                        <pic:cNvPicPr>
+                          <a:picLocks noChangeAspect="1" noChangeArrowheads="1"/>
+                        </pic:cNvPicPr>
+                      </pic:nvPicPr>
+                      <pic:blipFill>
+                        <a:blip r:embed="rId12">
+                          <a:extLst>
+                            <a:ext uri="{28A0092B-C50C-407E-A947-70E740481C1C}">
+                              <a14:useLocalDpi xmlns:a14="http://schemas.microsoft.com/office/drawing/2010/main" val="0"/>
+                            </a:ext>
+                          </a:extLst>
+                        </a:blip>
+                        <a:srcRect/>
+                        <a:stretch>
+                          <a:fillRect/>
+                        </a:stretch>
+                      </pic:blipFill>
+                      <pic:spPr bwMode="auto">
+                        <a:xfrm>
+                          <a:off x="0" y="0"/>
+                          <a:ext cx="2238375" cy="2238375"/>
+                        </a:xfrm>
+                        <a:prstGeom prst="rect">
+                          <a:avLst/>
+                        </a:prstGeom>
+                        <a:noFill/>
+                        <a:ln>
+                          <a:noFill/>
+                        </a:ln>
+                      </pic:spPr>
+                    </pic:pic>
+                  </a:graphicData>
+                </a:graphic>
+              </wp:inline>
+            </w:drawing>
           </w:r>
         </w:p>
-        <w:p>
-          <w:pPr>
-            <w:jc w:val="center"/>
-          </w:pPr>
-        </w:p>
-        <w:p>
-          <w:pPr>
-            <w:jc w:val="center"/>
-          </w:pPr>
-        </w:p>
-        <w:p>
-          <w:pPr>
-            <w:pStyle w:val="Normal"/>
-            <w:jc w:val="center"/>
-          </w:pPr>
-        </w:p>
+        <w:p/>
         <w:p>
           <w:pPr>
             <w:jc w:val="center"/>
@@ -242,26 +254,22 @@
     </w:sdt>
     <w:sdt>
       <w:sdtPr>
+        <w:rPr>
+          <w:rFonts w:asciiTheme="minorHAnsi" w:eastAsiaTheme="minorEastAsia" w:hAnsiTheme="minorHAnsi" w:cstheme="minorBidi"/>
+          <w:color w:val="auto"/>
+          <w:sz w:val="24"/>
+          <w:szCs w:val="24"/>
+        </w:rPr>
         <w:id w:val="-1659147511"/>
         <w:docPartObj>
           <w:docPartGallery w:val="Table of Contents"/>
           <w:docPartUnique/>
         </w:docPartObj>
-        <w:rPr>
-          <w:rFonts w:ascii="Calibri" w:hAnsi="Calibri" w:eastAsia="" w:cs="" w:asciiTheme="minorAscii" w:hAnsiTheme="minorAscii" w:eastAsiaTheme="minorEastAsia" w:cstheme="minorBidi"/>
-          <w:color w:val="auto"/>
-          <w:sz w:val="24"/>
-          <w:szCs w:val="24"/>
-        </w:rPr>
       </w:sdtPr>
       <w:sdtEndPr>
         <w:rPr>
-          <w:rFonts w:ascii="Calibri" w:hAnsi="Calibri" w:eastAsia="" w:cs="" w:asciiTheme="minorAscii" w:hAnsiTheme="minorAscii" w:eastAsiaTheme="minorEastAsia" w:cstheme="minorBidi"/>
-          <w:b w:val="1"/>
-          <w:bCs w:val="1"/>
-          <w:color w:val="auto"/>
-          <w:sz w:val="24"/>
-          <w:szCs w:val="24"/>
+          <w:b/>
+          <w:bCs/>
         </w:rPr>
       </w:sdtEndPr>
       <w:sdtContent>
@@ -309,7 +317,7 @@
           <w:r>
             <w:fldChar w:fldCharType="separate"/>
           </w:r>
-          <w:hyperlink w:history="1" w:anchor="_Toc164530067">
+          <w:hyperlink w:anchor="_Toc164530067" w:history="1">
             <w:r>
               <w:rPr>
                 <w:rStyle w:val="Hipervnculo"/>
@@ -382,7 +390,7 @@
               <w14:ligatures w14:val="standardContextual"/>
             </w:rPr>
           </w:pPr>
-          <w:hyperlink w:history="1" w:anchor="_Toc164530068">
+          <w:hyperlink w:anchor="_Toc164530068" w:history="1">
             <w:r>
               <w:rPr>
                 <w:rStyle w:val="Hipervnculo"/>
@@ -472,7 +480,7 @@
               <w14:ligatures w14:val="standardContextual"/>
             </w:rPr>
           </w:pPr>
-          <w:hyperlink w:history="1" w:anchor="_Toc164530069">
+          <w:hyperlink w:anchor="_Toc164530069" w:history="1">
             <w:r>
               <w:rPr>
                 <w:rStyle w:val="Hipervnculo"/>
@@ -536,7 +544,7 @@
                 <w:noProof/>
                 <w:webHidden/>
               </w:rPr>
-              <w:t>3</w:t>
+              <w:t>4</w:t>
             </w:r>
             <w:r>
               <w:rPr>
@@ -562,7 +570,7 @@
               <w14:ligatures w14:val="standardContextual"/>
             </w:rPr>
           </w:pPr>
-          <w:hyperlink w:history="1" w:anchor="_Toc164530070">
+          <w:hyperlink w:anchor="_Toc164530070" w:history="1">
             <w:r>
               <w:rPr>
                 <w:rStyle w:val="Hipervnculo"/>
@@ -626,7 +634,7 @@
                 <w:noProof/>
                 <w:webHidden/>
               </w:rPr>
-              <w:t>3</w:t>
+              <w:t>6</w:t>
             </w:r>
             <w:r>
               <w:rPr>
@@ -652,7 +660,7 @@
               <w14:ligatures w14:val="standardContextual"/>
             </w:rPr>
           </w:pPr>
-          <w:hyperlink w:history="1" w:anchor="_Toc164530071">
+          <w:hyperlink w:anchor="_Toc164530071" w:history="1">
             <w:r>
               <w:rPr>
                 <w:rStyle w:val="Hipervnculo"/>
@@ -716,7 +724,7 @@
                 <w:noProof/>
                 <w:webHidden/>
               </w:rPr>
-              <w:t>3</w:t>
+              <w:t>7</w:t>
             </w:r>
             <w:r>
               <w:rPr>
@@ -742,7 +750,7 @@
               <w14:ligatures w14:val="standardContextual"/>
             </w:rPr>
           </w:pPr>
-          <w:hyperlink w:history="1" w:anchor="_Toc164530072">
+          <w:hyperlink w:anchor="_Toc164530072" w:history="1">
             <w:r>
               <w:rPr>
                 <w:rStyle w:val="Hipervnculo"/>
@@ -806,7 +814,7 @@
                 <w:noProof/>
                 <w:webHidden/>
               </w:rPr>
-              <w:t>3</w:t>
+              <w:t>7</w:t>
             </w:r>
             <w:r>
               <w:rPr>
@@ -832,7 +840,7 @@
               <w14:ligatures w14:val="standardContextual"/>
             </w:rPr>
           </w:pPr>
-          <w:hyperlink w:history="1" w:anchor="_Toc164530073">
+          <w:hyperlink w:anchor="_Toc164530073" w:history="1">
             <w:r>
               <w:rPr>
                 <w:rStyle w:val="Hipervnculo"/>
@@ -896,7 +904,7 @@
                 <w:noProof/>
                 <w:webHidden/>
               </w:rPr>
-              <w:t>4</w:t>
+              <w:t>7</w:t>
             </w:r>
             <w:r>
               <w:rPr>
@@ -922,7 +930,7 @@
               <w14:ligatures w14:val="standardContextual"/>
             </w:rPr>
           </w:pPr>
-          <w:hyperlink w:history="1" w:anchor="_Toc164530074">
+          <w:hyperlink w:anchor="_Toc164530074" w:history="1">
             <w:r>
               <w:rPr>
                 <w:rStyle w:val="Hipervnculo"/>
@@ -986,7 +994,7 @@
                 <w:noProof/>
                 <w:webHidden/>
               </w:rPr>
-              <w:t>4</w:t>
+              <w:t>8</w:t>
             </w:r>
             <w:r>
               <w:rPr>
@@ -1011,7 +1019,7 @@
               <w14:ligatures w14:val="standardContextual"/>
             </w:rPr>
           </w:pPr>
-          <w:hyperlink w:history="1" w:anchor="_Toc164530075">
+          <w:hyperlink w:anchor="_Toc164530075" w:history="1">
             <w:r>
               <w:rPr>
                 <w:rStyle w:val="Hipervnculo"/>
@@ -1059,7 +1067,7 @@
                 <w:noProof/>
                 <w:webHidden/>
               </w:rPr>
-              <w:t>5</w:t>
+              <w:t>9</w:t>
             </w:r>
             <w:r>
               <w:rPr>
@@ -1084,7 +1092,7 @@
               <w14:ligatures w14:val="standardContextual"/>
             </w:rPr>
           </w:pPr>
-          <w:hyperlink w:history="1" w:anchor="_Toc164530076">
+          <w:hyperlink w:anchor="_Toc164530076" w:history="1">
             <w:r>
               <w:rPr>
                 <w:rStyle w:val="Hipervnculo"/>
@@ -1131,7 +1139,7 @@
                 <w:noProof/>
                 <w:webHidden/>
               </w:rPr>
-              <w:t>5</w:t>
+              <w:t>9</w:t>
             </w:r>
             <w:r>
               <w:rPr>
@@ -1156,7 +1164,7 @@
               <w14:ligatures w14:val="standardContextual"/>
             </w:rPr>
           </w:pPr>
-          <w:hyperlink w:history="1" w:anchor="_Toc164530077">
+          <w:hyperlink w:anchor="_Toc164530077" w:history="1">
             <w:r>
               <w:rPr>
                 <w:rStyle w:val="Hipervnculo"/>
@@ -1203,7 +1211,7 @@
                 <w:noProof/>
                 <w:webHidden/>
               </w:rPr>
-              <w:t>5</w:t>
+              <w:t>9</w:t>
             </w:r>
             <w:r>
               <w:rPr>
@@ -1228,7 +1236,7 @@
               <w14:ligatures w14:val="standardContextual"/>
             </w:rPr>
           </w:pPr>
-          <w:hyperlink w:history="1" w:anchor="_Toc164530078">
+          <w:hyperlink w:anchor="_Toc164530078" w:history="1">
             <w:r>
               <w:rPr>
                 <w:rStyle w:val="Hipervnculo"/>
@@ -1275,7 +1283,7 @@
                 <w:noProof/>
                 <w:webHidden/>
               </w:rPr>
-              <w:t>5</w:t>
+              <w:t>9</w:t>
             </w:r>
             <w:r>
               <w:rPr>
@@ -1391,8 +1399,8 @@
       <w:pPr>
         <w:pStyle w:val="Ttulo1"/>
       </w:pPr>
-      <w:bookmarkStart w:name="_Toc92297615" w:id="0"/>
-      <w:bookmarkStart w:name="_Toc164530067" w:id="1"/>
+      <w:bookmarkStart w:id="0" w:name="_Toc92297615"/>
+      <w:bookmarkStart w:id="1" w:name="_Toc164530067"/>
       <w:r>
         <w:t>Resumen</w:t>
       </w:r>
@@ -1443,155 +1451,92 @@
           <w:ilvl w:val="0"/>
           <w:numId w:val="1"/>
         </w:numPr>
-        <w:rPr/>
-      </w:pPr>
-      <w:bookmarkStart w:name="_Toc164530068" w:id="2"/>
-      <w:r>
-        <w:rPr/>
+      </w:pPr>
+      <w:bookmarkStart w:id="2" w:name="_Toc164530068"/>
+      <w:r>
         <w:t>Introducción</w:t>
       </w:r>
       <w:bookmarkEnd w:id="2"/>
     </w:p>
     <w:p>
       <w:pPr>
-        <w:spacing w:before="0" w:beforeAutospacing="off" w:after="240" w:afterAutospacing="off"/>
-        <w:rPr>
-          <w:noProof w:val="0"/>
-          <w:lang w:val="es-ES"/>
-        </w:rPr>
-      </w:pPr>
-      <w:r>
-        <w:rPr>
-          <w:rFonts w:ascii="Calibri" w:hAnsi="Calibri" w:eastAsia="" w:cs="" w:asciiTheme="minorAscii" w:hAnsiTheme="minorAscii" w:eastAsiaTheme="minorEastAsia" w:cstheme="minorBidi"/>
-          <w:noProof w:val="0"/>
-          <w:color w:val="auto"/>
-          <w:sz w:val="24"/>
+        <w:spacing w:after="240"/>
+      </w:pPr>
+      <w:r>
+        <w:rPr>
           <w:szCs w:val="24"/>
-          <w:lang w:val="es-ES" w:eastAsia="es-ES" w:bidi="ar-SA"/>
-        </w:rPr>
-        <w:t xml:space="preserve">El presente documento detalla el desarrollo del Proyecto Integrador para el primer curso del Ciclo Formativo de Grado Superior en Desarrollo de Aplicaciones Web (DAW) durante el año académico 2025-26. El equipo de trabajo encargado de este proyecto, denominado Payo Vallecano, integrado por Diego Jordá, Diego Librado y Pablo del </w:t>
-      </w:r>
-      <w:r>
-        <w:rPr>
-          <w:rFonts w:ascii="Calibri" w:hAnsi="Calibri" w:eastAsia="" w:cs="" w:asciiTheme="minorAscii" w:hAnsiTheme="minorAscii" w:eastAsiaTheme="minorEastAsia" w:cstheme="minorBidi"/>
-          <w:noProof w:val="0"/>
-          <w:color w:val="auto"/>
-          <w:sz w:val="24"/>
+        </w:rPr>
+        <w:t>El presente documento detalla el desarrollo del Proyecto Integrador para el primer curso del Ciclo Formativo de Grado Superior en Desarrollo de Aplicaciones Web (DAW) durante el año académico 2025-26. El equipo de trabajo encargado de este proyecto, denominado Payo Vallecano, integrado por Diego Jordá, Diego Librado y Pablo del Castillo , ha asumido el reto de diseñar y ejecutar una solución tecnológica integral que responda a las necesidades de gestión de un cliente real, aplicando los conocimientos técnicos adquiridos en los módulos de Programación, Bases de Datos y Entornos de Desarrollo.</w:t>
+      </w:r>
+    </w:p>
+    <w:p>
+      <w:pPr>
+        <w:spacing w:after="240"/>
+      </w:pPr>
+      <w:r>
+        <w:rPr>
           <w:szCs w:val="24"/>
-          <w:lang w:val="es-ES" w:eastAsia="es-ES" w:bidi="ar-SA"/>
-        </w:rPr>
-        <w:t>Castillo , ha</w:t>
-      </w:r>
-      <w:r>
-        <w:rPr>
-          <w:rFonts w:ascii="Calibri" w:hAnsi="Calibri" w:eastAsia="" w:cs="" w:asciiTheme="minorAscii" w:hAnsiTheme="minorAscii" w:eastAsiaTheme="minorEastAsia" w:cstheme="minorBidi"/>
-          <w:noProof w:val="0"/>
-          <w:color w:val="auto"/>
-          <w:sz w:val="24"/>
+        </w:rPr>
+        <w:t>El contexto del proyecto se sitúa en el taller de sastrería de la reconocida diseñadora de vestimenta superheroica Edna Moda. La naturaleza exclusiva y particular de su clientela, compuesta por tanto superhéroes como de supervillanos, exige una organización precisa y eficiente que los métodos tradicionales ya no pueden garantizar. Por ello, se nos ha encomendado la creación de una aplicación de gestión de citas personalizada que permita administrar de forma centralizada tanto la información de los clientes y sus trajes como el flujo de trabajo en los distintos talleres del estudio.</w:t>
+      </w:r>
+    </w:p>
+    <w:p>
+      <w:pPr>
+        <w:spacing w:after="240"/>
+      </w:pPr>
+      <w:r>
+        <w:rPr>
           <w:szCs w:val="24"/>
-          <w:lang w:val="es-ES" w:eastAsia="es-ES" w:bidi="ar-SA"/>
-        </w:rPr>
-        <w:t xml:space="preserve"> asumido el reto de diseñar y ejecutar una solución tecnológica integral que responda a las necesidades de gestión de un cliente real, aplicando los conocimientos técnicos adquiridos en los módulos de Programación, Bases de Datos y Entornos de Desarrollo.</w:t>
-      </w:r>
-    </w:p>
-    <w:p>
-      <w:pPr>
-        <w:spacing w:before="0" w:beforeAutospacing="off" w:after="240" w:afterAutospacing="off"/>
-        <w:rPr>
-          <w:noProof w:val="0"/>
-          <w:lang w:val="es-ES"/>
-        </w:rPr>
-      </w:pPr>
-      <w:r>
-        <w:rPr>
-          <w:rFonts w:ascii="Calibri" w:hAnsi="Calibri" w:eastAsia="" w:cs="" w:asciiTheme="minorAscii" w:hAnsiTheme="minorAscii" w:eastAsiaTheme="minorEastAsia" w:cstheme="minorBidi"/>
-          <w:noProof w:val="0"/>
-          <w:color w:val="auto"/>
-          <w:sz w:val="24"/>
+        </w:rPr>
+        <w:t>La aplicación propuesta debe permitir realizar un ciclo completo de gestión de datos, incluyendo la creación, consulta, modificación y borrado (</w:t>
+      </w:r>
+      <w:proofErr w:type="spellStart"/>
+      <w:r>
+        <w:rPr>
           <w:szCs w:val="24"/>
-          <w:lang w:val="es-ES" w:eastAsia="es-ES" w:bidi="ar-SA"/>
-        </w:rPr>
-        <w:t>El contexto del proyecto se sitúa en el taller de sastrería de la reconocida diseñadora de vestimenta superheroica Edna Moda. La naturaleza exclusiva y particular de su clientela, compuesta por tanto superhéroes como de supervillanos, exige una organización precisa y eficiente que los métodos tradicionales ya no pueden garantizar. Por ello, se nos ha encomendado la creación de una aplicación de gestión de citas personalizada que permita administrar de forma centralizada tanto la información de los clientes y sus trajes como el flujo de trabajo en los distintos talleres del estudio.</w:t>
-      </w:r>
-    </w:p>
-    <w:p>
-      <w:pPr>
-        <w:spacing w:before="0" w:beforeAutospacing="off" w:after="240" w:afterAutospacing="off"/>
-        <w:rPr>
-          <w:noProof w:val="0"/>
-          <w:lang w:val="es-ES"/>
-        </w:rPr>
-      </w:pPr>
-      <w:r>
-        <w:rPr>
-          <w:rFonts w:ascii="Calibri" w:hAnsi="Calibri" w:eastAsia="" w:cs="" w:asciiTheme="minorAscii" w:hAnsiTheme="minorAscii" w:eastAsiaTheme="minorEastAsia" w:cstheme="minorBidi"/>
-          <w:noProof w:val="0"/>
-          <w:color w:val="auto"/>
-          <w:sz w:val="24"/>
+        </w:rPr>
+        <w:t>CRUD</w:t>
+      </w:r>
+      <w:proofErr w:type="spellEnd"/>
+      <w:r>
+        <w:rPr>
           <w:szCs w:val="24"/>
-          <w:lang w:val="es-ES" w:eastAsia="es-ES" w:bidi="ar-SA"/>
-        </w:rPr>
-        <w:t>La aplicación propuesta debe permitir realizar un ciclo completo de gestión de datos, incluyendo la creación, consulta, modificación y borrado (CRUD) de clientes y citas. Para lograr una operatividad óptima, el sistema diferenciará entre varios perfiles de usuario dentro del taller: aprendices, oficiales y maestros, cada uno con niveles de acceso y permisos específicos adaptados a su rango y responsabilidad dentro de la empresa. Los maestros tendrán el control total del inventario de talleres y la agenda global, mientras que los oficiales y aprendices gestionarán sus tareas operativas directas.</w:t>
-      </w:r>
-    </w:p>
-    <w:p>
-      <w:pPr>
-        <w:spacing w:before="0" w:beforeAutospacing="off" w:after="240" w:afterAutospacing="off"/>
-        <w:rPr>
-          <w:noProof w:val="0"/>
-          <w:lang w:val="es-ES"/>
-        </w:rPr>
-      </w:pPr>
-      <w:r>
-        <w:rPr>
-          <w:rFonts w:ascii="Calibri" w:hAnsi="Calibri" w:eastAsia="" w:cs="" w:asciiTheme="minorAscii" w:hAnsiTheme="minorAscii" w:eastAsiaTheme="minorEastAsia" w:cstheme="minorBidi"/>
-          <w:noProof w:val="0"/>
-          <w:color w:val="auto"/>
-          <w:sz w:val="24"/>
+        </w:rPr>
+        <w:t>) de clientes y citas. Para lograr una operatividad óptima, el sistema diferenciará entre varios perfiles de usuario dentro del taller: aprendices, oficiales y maestros, cada uno con niveles de acceso y permisos específicos adaptados a su rango y responsabilidad dentro de la empresa. Los maestros tendrán el control total del inventario de talleres y la agenda global, mientras que los oficiales y aprendices gestionarán sus tareas operativas directas.</w:t>
+      </w:r>
+    </w:p>
+    <w:p>
+      <w:pPr>
+        <w:spacing w:after="240"/>
+      </w:pPr>
+      <w:r>
+        <w:rPr>
           <w:szCs w:val="24"/>
-          <w:lang w:val="es-ES" w:eastAsia="es-ES" w:bidi="ar-SA"/>
         </w:rPr>
         <w:t>Uno de los desafíos más singulares de esta propuesta, que hemos decidido abordar como un valor añadido, es la implementación de una lógica de seguridad para la agenda. Dado que el taller atiende a facciones enfrentadas, el sistema debe ser capaz de identificar si un cliente es héroe o villano para evitar que coincidan en el tiempo y el espacio. La aplicación garantizará un margen de seguridad de al menos una hora entre citas de clientes con intereses opuestos para prevenir incidentes en la sede.</w:t>
       </w:r>
     </w:p>
     <w:p>
       <w:pPr>
-        <w:spacing w:before="0" w:beforeAutospacing="off" w:after="240" w:afterAutospacing="off"/>
-        <w:rPr>
-          <w:noProof w:val="0"/>
-          <w:lang w:val="es-ES"/>
-        </w:rPr>
-      </w:pPr>
-      <w:r>
-        <w:rPr>
-          <w:rFonts w:ascii="Calibri" w:hAnsi="Calibri" w:eastAsia="" w:cs="" w:asciiTheme="minorAscii" w:hAnsiTheme="minorAscii" w:eastAsiaTheme="minorEastAsia" w:cstheme="minorBidi"/>
-          <w:noProof w:val="0"/>
-          <w:color w:val="auto"/>
-          <w:sz w:val="24"/>
+        <w:spacing w:after="240"/>
+      </w:pPr>
+      <w:r>
+        <w:rPr>
           <w:szCs w:val="24"/>
-          <w:lang w:val="es-ES" w:eastAsia="es-ES" w:bidi="ar-SA"/>
         </w:rPr>
         <w:t xml:space="preserve">Desde el punto de vista metodológico, el proyecto se desarrolla bajo el marco de trabajo SCRUM, lo que permite al equipo una adaptación constante a los requisitos y una entrega incremental de valor a través de diferentes </w:t>
       </w:r>
-      <w:r>
-        <w:rPr>
-          <w:rFonts w:ascii="Calibri" w:hAnsi="Calibri" w:eastAsia="" w:cs="" w:asciiTheme="minorAscii" w:hAnsiTheme="minorAscii" w:eastAsiaTheme="minorEastAsia" w:cstheme="minorBidi"/>
-          <w:noProof w:val="0"/>
-          <w:color w:val="auto"/>
-          <w:sz w:val="24"/>
+      <w:proofErr w:type="spellStart"/>
+      <w:r>
+        <w:rPr>
           <w:szCs w:val="24"/>
-          <w:lang w:val="es-ES" w:eastAsia="es-ES" w:bidi="ar-SA"/>
         </w:rPr>
         <w:t>sprints</w:t>
       </w:r>
-      <w:r>
-        <w:rPr>
-          <w:rFonts w:ascii="Calibri" w:hAnsi="Calibri" w:eastAsia="" w:cs="" w:asciiTheme="minorAscii" w:hAnsiTheme="minorAscii" w:eastAsiaTheme="minorEastAsia" w:cstheme="minorBidi"/>
-          <w:noProof w:val="0"/>
-          <w:color w:val="auto"/>
-          <w:sz w:val="24"/>
+      <w:proofErr w:type="spellEnd"/>
+      <w:r>
+        <w:rPr>
           <w:szCs w:val="24"/>
-          <w:lang w:val="es-ES" w:eastAsia="es-ES" w:bidi="ar-SA"/>
         </w:rPr>
         <w:t>. La integración de tecnologías como el lenguaje de programación Java, el uso de bases de datos relacionales MySQL y el control de versiones mediante GitHub asegura un entorno de desarrollo profesional y colaborativo. Con este enfoque, buscamos no solo cumplir con las especificaciones técnicas, sino también demostrar capacidad de resolución de problemas y gestión eficaz del trabajo en equipo en un entorno de desarrollo real.</w:t>
       </w:r>
@@ -1605,161 +1550,109 @@
           <w:ilvl w:val="0"/>
           <w:numId w:val="1"/>
         </w:numPr>
-        <w:rPr/>
-      </w:pPr>
-      <w:bookmarkStart w:name="_Toc164530069" w:id="3"/>
-      <w:r>
-        <w:rPr/>
+      </w:pPr>
+      <w:bookmarkStart w:id="3" w:name="_Toc164530069"/>
+      <w:r>
         <w:t>Objetivos</w:t>
       </w:r>
       <w:bookmarkEnd w:id="3"/>
     </w:p>
     <w:p>
       <w:pPr>
-        <w:spacing w:before="0" w:beforeAutospacing="off" w:after="240" w:afterAutospacing="off"/>
-        <w:jc w:val="both"/>
-        <w:rPr>
-          <w:noProof w:val="0"/>
-          <w:lang w:val="es-ES"/>
-        </w:rPr>
-      </w:pPr>
-      <w:r>
-        <w:rPr>
-          <w:rFonts w:ascii="Calibri" w:hAnsi="Calibri" w:eastAsia="" w:cs="" w:asciiTheme="minorAscii" w:hAnsiTheme="minorAscii" w:eastAsiaTheme="minorEastAsia" w:cstheme="minorBidi"/>
-          <w:noProof w:val="0"/>
-          <w:color w:val="auto"/>
-          <w:sz w:val="24"/>
+        <w:spacing w:after="240"/>
+      </w:pPr>
+      <w:r>
+        <w:rPr>
           <w:szCs w:val="24"/>
-          <w:lang w:val="es-ES" w:eastAsia="es-ES" w:bidi="ar-SA"/>
         </w:rPr>
         <w:t>El desarrollo del presente proyecto por parte del grupo Payo Vallecano se fundamenta en la consecución de una serie de metas que integran tanto la gestión profesional de proyectos como la aplicación técnica de conocimientos específicos. En primer lugar, se establecen los objetivos generales que se centran en la adquisición de competencias transversales esenciales para cualquier desarrollador en un entorno laboral real. Entre estos objetivos destaca la capacidad de gestionar y realizar el trabajo del área asignada ajustándose a las cargas de trabajo propias del ciclo formativo mediante una planificación temporal rigurosa. Asimismo, se busca fomentar la autonomía y la colaboración mediante la realización de consultas a las personas adecuadas y el respeto por el trabajo de los compañeros para lograr un flujo de trabajo eficiente. El equipo también debe trabajar en mantener un espíritu de innovación y actualización constante buscando habilidades para la sinergia de equipos y el liderazgo dentro del grupo. Otro pilar fundamental es la gestión eficaz de los conflictos que puedan producirse durante el desarrollo mediando y contribuyendo al establecimiento de un ambiente de trabajo agradable y actuando de forma respetuosa y tolerante. Finalmente, se pretende que cada miembro sea capaz de resolver problemas y tomar decisiones individuales siguiendo las normas y procedimientos establecidos definidos dentro del ámbito de su competencia.</w:t>
       </w:r>
     </w:p>
     <w:p>
       <w:pPr>
-        <w:spacing w:before="0" w:beforeAutospacing="off" w:after="240" w:afterAutospacing="off"/>
-        <w:jc w:val="both"/>
-        <w:rPr>
-          <w:noProof w:val="0"/>
-          <w:lang w:val="es-ES"/>
-        </w:rPr>
-      </w:pPr>
-      <w:r>
-        <w:rPr>
-          <w:rFonts w:ascii="Calibri" w:hAnsi="Calibri" w:eastAsia="" w:cs="" w:asciiTheme="minorAscii" w:hAnsiTheme="minorAscii" w:eastAsiaTheme="minorEastAsia" w:cstheme="minorBidi"/>
-          <w:noProof w:val="0"/>
-          <w:color w:val="auto"/>
-          <w:sz w:val="24"/>
+        <w:spacing w:after="240"/>
+      </w:pPr>
+      <w:r>
+        <w:rPr>
           <w:szCs w:val="24"/>
-          <w:lang w:val="es-ES" w:eastAsia="es-ES" w:bidi="ar-SA"/>
-        </w:rPr>
-        <w:t>En cuanto a los objetivos específicos vinculados a las capacidades de los módulos formativos involucrados el proyecto actúa como nexo de unión entre tres áreas fundamentales.</w:t>
-      </w:r>
-      <w:r>
-        <w:rPr>
-          <w:rFonts w:ascii="Calibri" w:hAnsi="Calibri" w:eastAsia="" w:cs="" w:asciiTheme="minorAscii" w:hAnsiTheme="minorAscii" w:eastAsiaTheme="minorEastAsia" w:cstheme="minorBidi"/>
-          <w:noProof w:val="0"/>
-          <w:color w:val="auto"/>
-          <w:sz w:val="24"/>
+        </w:rPr>
+        <w:t xml:space="preserve">En cuanto a los objetivos específicos vinculados a las capacidades de los módulos formativos involucrados el proyecto actúa como </w:t>
+      </w:r>
+      <w:proofErr w:type="gramStart"/>
+      <w:r>
+        <w:rPr>
           <w:szCs w:val="24"/>
-          <w:lang w:val="es-ES" w:eastAsia="es-ES" w:bidi="ar-SA"/>
-        </w:rPr>
-        <w:t xml:space="preserve"> En el ámbito de las Bases de Datos el objetivo principal es garantizar la integridad y persistencia de la información mediante la creación de bases de datos definiendo su estructura y las características de sus elementos según el modelo relacional. Esto implica diseñar modelos lógicos normalizados interpretando diagramas entidad/relación y realizar el diseño físico de las bases de datos utilizando asistentes, herramientas gráficas y el lenguaje de definición de datos. </w:t>
-      </w:r>
-      <w:r>
-        <w:rPr>
-          <w:rFonts w:ascii="Calibri" w:hAnsi="Calibri" w:eastAsia="" w:cs="" w:asciiTheme="minorAscii" w:hAnsiTheme="minorAscii" w:eastAsiaTheme="minorEastAsia" w:cstheme="minorBidi"/>
-          <w:noProof w:val="0"/>
-          <w:color w:val="auto"/>
-          <w:sz w:val="24"/>
+        </w:rPr>
+        <w:t>nexo de unión</w:t>
+      </w:r>
+      <w:proofErr w:type="gramEnd"/>
+      <w:r>
+        <w:rPr>
           <w:szCs w:val="24"/>
-          <w:lang w:val="es-ES" w:eastAsia="es-ES" w:bidi="ar-SA"/>
-        </w:rPr>
-        <w:t>Además, se debe ser capaz de consultar y modificar la información almacenada utilizando el lenguaje de manipulación de datos.</w:t>
-      </w:r>
-    </w:p>
-    <w:p>
-      <w:pPr>
-        <w:spacing w:before="0" w:beforeAutospacing="off" w:after="240" w:afterAutospacing="off"/>
-        <w:jc w:val="both"/>
-        <w:rPr>
-          <w:noProof w:val="0"/>
-          <w:lang w:val="es-ES"/>
-        </w:rPr>
-      </w:pPr>
-      <w:r>
-        <w:rPr>
-          <w:rFonts w:ascii="Calibri" w:hAnsi="Calibri" w:eastAsia="" w:cs="" w:asciiTheme="minorAscii" w:hAnsiTheme="minorAscii" w:eastAsiaTheme="minorEastAsia" w:cstheme="minorBidi"/>
-          <w:noProof w:val="0"/>
-          <w:color w:val="auto"/>
-          <w:sz w:val="24"/>
+        </w:rPr>
+        <w:t xml:space="preserve"> entre tres áreas fundamentales. En el ámbito de las Bases de Datos el objetivo principal es garantizar la integridad y persistencia de la información mediante la creación de bases de datos definiendo su estructura y las características de sus elementos según el modelo relacional. Esto implica diseñar modelos lógicos normalizados interpretando diagramas entidad/relación y realizar el diseño físico de las bases de datos utilizando asistentes, herramientas gráficas y el lenguaje de definición de datos. Además, se debe ser capaz de consultar y modificar la información almacenada utilizando el lenguaje de manipulación de datos.</w:t>
+      </w:r>
+    </w:p>
+    <w:p>
+      <w:pPr>
+        <w:spacing w:after="240"/>
+      </w:pPr>
+      <w:r>
+        <w:rPr>
           <w:szCs w:val="24"/>
-          <w:lang w:val="es-ES" w:eastAsia="es-ES" w:bidi="ar-SA"/>
-        </w:rPr>
-        <w:t xml:space="preserve">En el módulo de Programación el enfoque se centra en dar vida a la lógica de negocio y a la interfaz mediante el diseño de clases necesarias para seguir el patrón MVC. </w:t>
-      </w:r>
-      <w:r>
-        <w:rPr>
-          <w:rFonts w:ascii="Calibri" w:hAnsi="Calibri" w:eastAsia="" w:cs="" w:asciiTheme="minorAscii" w:hAnsiTheme="minorAscii" w:eastAsiaTheme="minorEastAsia" w:cstheme="minorBidi"/>
-          <w:noProof w:val="0"/>
-          <w:color w:val="auto"/>
-          <w:sz w:val="24"/>
+        </w:rPr>
+        <w:t xml:space="preserve">En el módulo de Programación el enfoque se centra en dar vida a la lógica de negocio y a la interfaz mediante el diseño de clases necesarias para seguir el patrón </w:t>
+      </w:r>
+      <w:proofErr w:type="spellStart"/>
+      <w:r>
+        <w:rPr>
           <w:szCs w:val="24"/>
-          <w:lang w:val="es-ES" w:eastAsia="es-ES" w:bidi="ar-SA"/>
-        </w:rPr>
-        <w:t>El equipo debe implementar cada una de las clases para lograr su objetivo incluyendo clases de interfaz gráfica pertenecientes a la vista, clases que representen el modelo y clases encargadas de la lógica pertenecientes al control.</w:t>
-      </w:r>
-      <w:r>
-        <w:rPr>
-          <w:rFonts w:ascii="Calibri" w:hAnsi="Calibri" w:eastAsia="" w:cs="" w:asciiTheme="minorAscii" w:hAnsiTheme="minorAscii" w:eastAsiaTheme="minorEastAsia" w:cstheme="minorBidi"/>
-          <w:noProof w:val="0"/>
-          <w:color w:val="auto"/>
-          <w:sz w:val="24"/>
+        </w:rPr>
+        <w:t>MVC</w:t>
+      </w:r>
+      <w:proofErr w:type="spellEnd"/>
+      <w:r>
+        <w:rPr>
           <w:szCs w:val="24"/>
-          <w:lang w:val="es-ES" w:eastAsia="es-ES" w:bidi="ar-SA"/>
-        </w:rPr>
-        <w:t xml:space="preserve"> Se desarrollará una aplicación que gestione información almacenada en bases de datos relacionales identificando y utilizando mecanismos de conexión lo que permitirá alcanzar la competencia completa para desarrollar componentes software en lenguajes de programación orientados a objetos.</w:t>
-      </w:r>
-    </w:p>
-    <w:p>
-      <w:pPr>
-        <w:spacing w:before="0" w:beforeAutospacing="off" w:after="240" w:afterAutospacing="off"/>
-        <w:jc w:val="both"/>
-        <w:rPr>
-          <w:noProof w:val="0"/>
-          <w:lang w:val="es-ES"/>
-        </w:rPr>
-      </w:pPr>
-      <w:r>
-        <w:rPr>
-          <w:rFonts w:ascii="Calibri" w:hAnsi="Calibri" w:eastAsia="" w:cs="" w:asciiTheme="minorAscii" w:hAnsiTheme="minorAscii" w:eastAsiaTheme="minorEastAsia" w:cstheme="minorBidi"/>
-          <w:noProof w:val="0"/>
-          <w:color w:val="auto"/>
-          <w:sz w:val="24"/>
+        </w:rPr>
+        <w:t>. El equipo debe implementar cada una de las clases para lograr su objetivo incluyendo clases de interfaz gráfica pertenecientes a la vista, clases que representen el modelo y clases encargadas de la lógica pertenecientes al control. Se desarrollará una aplicación que gestione información almacenada en bases de datos relacionales identificando y utilizando mecanismos de conexión lo que permitirá alcanzar la competencia completa para desarrollar componentes software en lenguajes de programación orientados a objetos.</w:t>
+      </w:r>
+    </w:p>
+    <w:p>
+      <w:pPr>
+        <w:spacing w:after="240"/>
+      </w:pPr>
+      <w:r>
+        <w:rPr>
           <w:szCs w:val="24"/>
-          <w:lang w:val="es-ES" w:eastAsia="es-ES" w:bidi="ar-SA"/>
-        </w:rPr>
-        <w:t xml:space="preserve">Por último, el módulo de Entornos de Desarrollo asegura la calidad del software y la correcta gestión del ciclo de vida del producto realizando el análisis y el diseño de la aplicación empleando técnicas UML. Es fundamental documentar la aplicación con </w:t>
-      </w:r>
-      <w:r>
-        <w:rPr>
-          <w:rFonts w:ascii="Calibri" w:hAnsi="Calibri" w:eastAsia="" w:cs="" w:asciiTheme="minorAscii" w:hAnsiTheme="minorAscii" w:eastAsiaTheme="minorEastAsia" w:cstheme="minorBidi"/>
-          <w:noProof w:val="0"/>
-          <w:color w:val="auto"/>
-          <w:sz w:val="24"/>
+        </w:rPr>
+        <w:t xml:space="preserve">Por último, el módulo de Entornos de Desarrollo asegura la calidad del software y la correcta gestión del ciclo de vida del producto realizando el análisis y el diseño de la aplicación empleando técnicas </w:t>
+      </w:r>
+      <w:proofErr w:type="spellStart"/>
+      <w:r>
+        <w:rPr>
           <w:szCs w:val="24"/>
-          <w:lang w:val="es-ES" w:eastAsia="es-ES" w:bidi="ar-SA"/>
+        </w:rPr>
+        <w:t>UML</w:t>
+      </w:r>
+      <w:proofErr w:type="spellEnd"/>
+      <w:r>
+        <w:rPr>
+          <w:szCs w:val="24"/>
+        </w:rPr>
+        <w:t xml:space="preserve">. Es fundamental documentar la aplicación con </w:t>
+      </w:r>
+      <w:proofErr w:type="spellStart"/>
+      <w:r>
+        <w:rPr>
+          <w:szCs w:val="24"/>
         </w:rPr>
         <w:t>JavaDoc</w:t>
       </w:r>
-      <w:r>
-        <w:rPr>
-          <w:rFonts w:ascii="Calibri" w:hAnsi="Calibri" w:eastAsia="" w:cs="" w:asciiTheme="minorAscii" w:hAnsiTheme="minorAscii" w:eastAsiaTheme="minorEastAsia" w:cstheme="minorBidi"/>
-          <w:noProof w:val="0"/>
-          <w:color w:val="auto"/>
-          <w:sz w:val="24"/>
+      <w:proofErr w:type="spellEnd"/>
+      <w:r>
+        <w:rPr>
           <w:szCs w:val="24"/>
-          <w:lang w:val="es-ES" w:eastAsia="es-ES" w:bidi="ar-SA"/>
         </w:rPr>
         <w:t xml:space="preserve"> y gestionar las diferentes versiones del software y el trabajo colaborativo a través de plataformas adecuadas. El equipo también llevará a cabo la depuración y testeo sobre los programas siguiendo metodologías ágiles para el desarrollo y planificación de programas asegurando así un producto final estable y funcional.</w:t>
       </w:r>
@@ -1774,32 +1667,17 @@
           <w:ilvl w:val="0"/>
           <w:numId w:val="1"/>
         </w:numPr>
-        <w:rPr/>
-      </w:pPr>
-      <w:bookmarkStart w:name="_Toc164530070" w:id="4"/>
-      <w:r>
-        <w:rPr/>
+      </w:pPr>
+      <w:bookmarkStart w:id="4" w:name="_Toc164530070"/>
+      <w:r>
         <w:t>Tecnologías utilizadas</w:t>
       </w:r>
       <w:bookmarkEnd w:id="4"/>
     </w:p>
     <w:p>
-      <w:pPr>
-        <w:spacing w:before="0" w:beforeAutospacing="off" w:after="120" w:afterAutospacing="off"/>
-        <w:jc w:val="both"/>
-        <w:rPr>
-          <w:noProof w:val="0"/>
-          <w:lang w:val="es-ES"/>
-        </w:rPr>
-      </w:pPr>
-      <w:r>
-        <w:rPr>
-          <w:rFonts w:ascii="Calibri" w:hAnsi="Calibri" w:eastAsia="" w:cs="" w:asciiTheme="minorAscii" w:hAnsiTheme="minorAscii" w:eastAsiaTheme="minorEastAsia" w:cstheme="minorBidi"/>
-          <w:noProof w:val="0"/>
-          <w:color w:val="auto"/>
-          <w:sz w:val="24"/>
+      <w:r>
+        <w:rPr>
           <w:szCs w:val="24"/>
-          <w:lang w:val="es-ES" w:eastAsia="es-ES" w:bidi="ar-SA"/>
         </w:rPr>
         <w:t>Para este apartado se recomienda una extensión de 2 a 3 páginas. Enumeración de las tecnologías, herramientas y lenguajes de programación utilizados durante el desarrollo del proyecto. Enumeración de las herramientas organizativas para favorecer el trabajo en equipo.</w:t>
       </w:r>
@@ -1807,217 +1685,103 @@
     <w:p/>
     <w:p>
       <w:pPr>
-        <w:spacing w:before="0" w:beforeAutospacing="off" w:after="240" w:afterAutospacing="off"/>
-        <w:jc w:val="both"/>
-        <w:rPr>
-          <w:noProof w:val="0"/>
-          <w:lang w:val="es-ES"/>
-        </w:rPr>
-      </w:pPr>
-      <w:r>
-        <w:rPr>
-          <w:rFonts w:ascii="Calibri" w:hAnsi="Calibri" w:eastAsia="" w:cs="" w:asciiTheme="minorAscii" w:hAnsiTheme="minorAscii" w:eastAsiaTheme="minorEastAsia" w:cstheme="minorBidi"/>
-          <w:noProof w:val="0"/>
-          <w:color w:val="auto"/>
-          <w:sz w:val="24"/>
+        <w:spacing w:after="240"/>
+      </w:pPr>
+      <w:r>
+        <w:rPr>
           <w:szCs w:val="24"/>
-          <w:lang w:val="es-ES" w:eastAsia="es-ES" w:bidi="ar-SA"/>
         </w:rPr>
         <w:t xml:space="preserve">El desarrollo del proyecto integrador ha requerido la combinación de diversas herramientas técnicas y organizativas para cumplir con los estándares de calidad exigidos por el taller de la Sra. Moda. Para la construcción del núcleo de la aplicación, el entorno de desarrollo integrado (IDE) principal ha sido Eclipse, el cual ha proporcionado la infraestructura necesaria para la programación orientada a objetos en Java utilizando el patrón Modelo-Vista-Controlador. En cuanto a la persistencia de los datos, se ha empleado el sistema de gestión de bases de datos relacionales MySQL junto con MySQL </w:t>
       </w:r>
-      <w:r>
-        <w:rPr>
-          <w:rFonts w:ascii="Calibri" w:hAnsi="Calibri" w:eastAsia="" w:cs="" w:asciiTheme="minorAscii" w:hAnsiTheme="minorAscii" w:eastAsiaTheme="minorEastAsia" w:cstheme="minorBidi"/>
-          <w:noProof w:val="0"/>
-          <w:color w:val="auto"/>
-          <w:sz w:val="24"/>
+      <w:proofErr w:type="spellStart"/>
+      <w:r>
+        <w:rPr>
           <w:szCs w:val="24"/>
-          <w:lang w:val="es-ES" w:eastAsia="es-ES" w:bidi="ar-SA"/>
         </w:rPr>
         <w:t>Workbench</w:t>
       </w:r>
-      <w:r>
-        <w:rPr>
-          <w:rFonts w:ascii="Calibri" w:hAnsi="Calibri" w:eastAsia="" w:cs="" w:asciiTheme="minorAscii" w:hAnsiTheme="minorAscii" w:eastAsiaTheme="minorEastAsia" w:cstheme="minorBidi"/>
-          <w:noProof w:val="0"/>
-          <w:color w:val="auto"/>
-          <w:sz w:val="24"/>
+      <w:proofErr w:type="spellEnd"/>
+      <w:r>
+        <w:rPr>
           <w:szCs w:val="24"/>
-          <w:lang w:val="es-ES" w:eastAsia="es-ES" w:bidi="ar-SA"/>
-        </w:rPr>
-        <w:t xml:space="preserve"> para el diseño físico y la administración de las tablas, índices e inserciones necesarias para el sistema de citas. El control de versiones y el trabajo colaborativo se han gestionado mediante Git </w:t>
-      </w:r>
-      <w:r>
-        <w:rPr>
-          <w:rFonts w:ascii="Calibri" w:hAnsi="Calibri" w:eastAsia="" w:cs="" w:asciiTheme="minorAscii" w:hAnsiTheme="minorAscii" w:eastAsiaTheme="minorEastAsia" w:cstheme="minorBidi"/>
-          <w:noProof w:val="0"/>
-          <w:color w:val="auto"/>
-          <w:sz w:val="24"/>
+        </w:rPr>
+        <w:t xml:space="preserve"> para el diseño físico y la administración de las tablas, índices e inserciones necesarias para el sistema de citas. El control de versiones y el trabajo colaborativo se han gestionado mediante Git Bash y GitHub, permitiendo una integración fluida de los componentes desarrollados por cada miembro del equipo y el mantenimiento de la línea de desarrollo del proyecto.</w:t>
+      </w:r>
+    </w:p>
+    <w:p>
+      <w:pPr>
+        <w:spacing w:after="240"/>
+      </w:pPr>
+      <w:r>
+        <w:rPr>
           <w:szCs w:val="24"/>
-          <w:lang w:val="es-ES" w:eastAsia="es-ES" w:bidi="ar-SA"/>
-        </w:rPr>
-        <w:t>Bash</w:t>
-      </w:r>
-      <w:r>
-        <w:rPr>
-          <w:rFonts w:ascii="Calibri" w:hAnsi="Calibri" w:eastAsia="" w:cs="" w:asciiTheme="minorAscii" w:hAnsiTheme="minorAscii" w:eastAsiaTheme="minorEastAsia" w:cstheme="minorBidi"/>
-          <w:noProof w:val="0"/>
-          <w:color w:val="auto"/>
-          <w:sz w:val="24"/>
+        </w:rPr>
+        <w:t xml:space="preserve">En el ámbito del análisis y diseño conceptual, el grupo ha utilizado </w:t>
+      </w:r>
+      <w:proofErr w:type="spellStart"/>
+      <w:r>
+        <w:rPr>
           <w:szCs w:val="24"/>
-          <w:lang w:val="es-ES" w:eastAsia="es-ES" w:bidi="ar-SA"/>
-        </w:rPr>
-        <w:t xml:space="preserve"> y GitHub, permitiendo una integración fluida de los componentes desarrollados por cada miembro del equipo y el mantenimiento de la línea de desarrollo del proyecto.</w:t>
-      </w:r>
-    </w:p>
-    <w:p>
-      <w:pPr>
-        <w:spacing w:before="0" w:beforeAutospacing="off" w:after="240" w:afterAutospacing="off"/>
-        <w:jc w:val="both"/>
-        <w:rPr>
-          <w:noProof w:val="0"/>
-          <w:lang w:val="es-ES"/>
-        </w:rPr>
-      </w:pPr>
-      <w:r>
-        <w:rPr>
-          <w:rFonts w:ascii="Calibri" w:hAnsi="Calibri" w:eastAsia="" w:cs="" w:asciiTheme="minorAscii" w:hAnsiTheme="minorAscii" w:eastAsiaTheme="minorEastAsia" w:cstheme="minorBidi"/>
-          <w:noProof w:val="0"/>
-          <w:color w:val="auto"/>
-          <w:sz w:val="24"/>
+        </w:rPr>
+        <w:t>Excalidraw</w:t>
+      </w:r>
+      <w:proofErr w:type="spellEnd"/>
+      <w:r>
+        <w:rPr>
           <w:szCs w:val="24"/>
-          <w:lang w:val="es-ES" w:eastAsia="es-ES" w:bidi="ar-SA"/>
-        </w:rPr>
-        <w:t xml:space="preserve">En el ámbito del análisis y diseño conceptual, el grupo ha utilizado </w:t>
-      </w:r>
-      <w:r>
-        <w:rPr>
-          <w:rFonts w:ascii="Calibri" w:hAnsi="Calibri" w:eastAsia="" w:cs="" w:asciiTheme="minorAscii" w:hAnsiTheme="minorAscii" w:eastAsiaTheme="minorEastAsia" w:cstheme="minorBidi"/>
-          <w:noProof w:val="0"/>
-          <w:color w:val="auto"/>
-          <w:sz w:val="24"/>
+        </w:rPr>
+        <w:t xml:space="preserve"> y SharePoint de Microsoft 365 para la elaboración de los modelos de entidad-relación y los diagramas lógicos normalizados que estructuran la base de datos. La fase de documentación y redacción de la memoria se ha llevado a cabo de forma incremental utilizando Google </w:t>
+      </w:r>
+      <w:proofErr w:type="spellStart"/>
+      <w:r>
+        <w:rPr>
           <w:szCs w:val="24"/>
-          <w:lang w:val="es-ES" w:eastAsia="es-ES" w:bidi="ar-SA"/>
-        </w:rPr>
-        <w:t>Excalidraw</w:t>
-      </w:r>
-      <w:r>
-        <w:rPr>
-          <w:rFonts w:ascii="Calibri" w:hAnsi="Calibri" w:eastAsia="" w:cs="" w:asciiTheme="minorAscii" w:hAnsiTheme="minorAscii" w:eastAsiaTheme="minorEastAsia" w:cstheme="minorBidi"/>
-          <w:noProof w:val="0"/>
-          <w:color w:val="auto"/>
-          <w:sz w:val="24"/>
+        </w:rPr>
+        <w:t>Docs</w:t>
+      </w:r>
+      <w:proofErr w:type="spellEnd"/>
+      <w:r>
+        <w:rPr>
           <w:szCs w:val="24"/>
-          <w:lang w:val="es-ES" w:eastAsia="es-ES" w:bidi="ar-SA"/>
-        </w:rPr>
-        <w:t xml:space="preserve"> y SharePoint de Microsoft 365 para la elaboración de los modelos de entidad-relación y los diagramas lógicos normalizados que estructuran la base de datos. La fase de documentación y redacción de la memoria se ha llevado a cabo de forma incremental utilizando Google </w:t>
-      </w:r>
-      <w:r>
-        <w:rPr>
-          <w:rFonts w:ascii="Calibri" w:hAnsi="Calibri" w:eastAsia="" w:cs="" w:asciiTheme="minorAscii" w:hAnsiTheme="minorAscii" w:eastAsiaTheme="minorEastAsia" w:cstheme="minorBidi"/>
-          <w:noProof w:val="0"/>
-          <w:color w:val="auto"/>
-          <w:sz w:val="24"/>
+        </w:rPr>
+        <w:t xml:space="preserve"> para los borradores iniciales y Microsoft Office Word, tanto en su versión de escritorio como en la modalidad Online, para asegurar un formato profesional y una edición colaborativa en tiempo real. Para la resolución de dudas técnicas y la búsqueda de información específica sobre sintaxis o lógica de programación, se ha recurrido al motor de búsqueda de Google y al asistente de inteligencia artificial Gemini, asegurando así una toma de decisiones informada durante los distintos </w:t>
+      </w:r>
+      <w:proofErr w:type="spellStart"/>
+      <w:r>
+        <w:rPr>
           <w:szCs w:val="24"/>
-          <w:lang w:val="es-ES" w:eastAsia="es-ES" w:bidi="ar-SA"/>
-        </w:rPr>
-        <w:t>Docs</w:t>
-      </w:r>
-      <w:r>
-        <w:rPr>
-          <w:rFonts w:ascii="Calibri" w:hAnsi="Calibri" w:eastAsia="" w:cs="" w:asciiTheme="minorAscii" w:hAnsiTheme="minorAscii" w:eastAsiaTheme="minorEastAsia" w:cstheme="minorBidi"/>
-          <w:noProof w:val="0"/>
-          <w:color w:val="auto"/>
-          <w:sz w:val="24"/>
+        </w:rPr>
+        <w:t>sprints</w:t>
+      </w:r>
+      <w:proofErr w:type="spellEnd"/>
+      <w:r>
+        <w:rPr>
           <w:szCs w:val="24"/>
-          <w:lang w:val="es-ES" w:eastAsia="es-ES" w:bidi="ar-SA"/>
-        </w:rPr>
-        <w:t xml:space="preserve"> para los borradores iniciales y Microsoft Office Word, tanto en su versión de escritorio como en la modalidad Online, para asegurar un formato profesional y una edición colaborativa en tiempo real. Para la resolución de dudas técnicas y la búsqueda de información específica sobre sintaxis o lógica de programación, se ha recurrido al motor de búsqueda de Google y al asistente de inteligencia artificial Gemini, asegurando así una toma de decisiones informada durante los distintos </w:t>
-      </w:r>
-      <w:r>
-        <w:rPr>
-          <w:rFonts w:ascii="Calibri" w:hAnsi="Calibri" w:eastAsia="" w:cs="" w:asciiTheme="minorAscii" w:hAnsiTheme="minorAscii" w:eastAsiaTheme="minorEastAsia" w:cstheme="minorBidi"/>
-          <w:noProof w:val="0"/>
-          <w:color w:val="auto"/>
-          <w:sz w:val="24"/>
+        </w:rPr>
+        <w:t>.</w:t>
+      </w:r>
+    </w:p>
+    <w:p>
+      <w:pPr>
+        <w:spacing w:after="240"/>
+      </w:pPr>
+      <w:r>
+        <w:rPr>
           <w:szCs w:val="24"/>
-          <w:lang w:val="es-ES" w:eastAsia="es-ES" w:bidi="ar-SA"/>
-        </w:rPr>
-        <w:t>sprints</w:t>
-      </w:r>
-      <w:r>
-        <w:rPr>
-          <w:rFonts w:ascii="Calibri" w:hAnsi="Calibri" w:eastAsia="" w:cs="" w:asciiTheme="minorAscii" w:hAnsiTheme="minorAscii" w:eastAsiaTheme="minorEastAsia" w:cstheme="minorBidi"/>
-          <w:noProof w:val="0"/>
-          <w:color w:val="auto"/>
-          <w:sz w:val="24"/>
+        </w:rPr>
+        <w:t xml:space="preserve">La identidad visual y el apartado gráfico han sido fundamentales para captar la esencia del estudio de diseño de Edna Moda. El equipo ha utilizado herramientas de edición profesional como Adobe Photoshop y Affinity, además de </w:t>
+      </w:r>
+      <w:proofErr w:type="spellStart"/>
+      <w:r>
+        <w:rPr>
           <w:szCs w:val="24"/>
-          <w:lang w:val="es-ES" w:eastAsia="es-ES" w:bidi="ar-SA"/>
-        </w:rPr>
-        <w:t>.</w:t>
-      </w:r>
-    </w:p>
-    <w:p>
-      <w:pPr>
-        <w:spacing w:before="0" w:beforeAutospacing="off" w:after="240" w:afterAutospacing="off"/>
-        <w:jc w:val="both"/>
-        <w:rPr>
-          <w:noProof w:val="0"/>
-          <w:lang w:val="es-ES"/>
-        </w:rPr>
-      </w:pPr>
-      <w:r>
-        <w:rPr>
-          <w:rFonts w:ascii="Calibri" w:hAnsi="Calibri" w:eastAsia="" w:cs="" w:asciiTheme="minorAscii" w:hAnsiTheme="minorAscii" w:eastAsiaTheme="minorEastAsia" w:cstheme="minorBidi"/>
-          <w:noProof w:val="0"/>
-          <w:color w:val="auto"/>
-          <w:sz w:val="24"/>
+        </w:rPr>
+        <w:t>Canva</w:t>
+      </w:r>
+      <w:proofErr w:type="spellEnd"/>
+      <w:r>
+        <w:rPr>
           <w:szCs w:val="24"/>
-          <w:lang w:val="es-ES" w:eastAsia="es-ES" w:bidi="ar-SA"/>
-        </w:rPr>
-        <w:t xml:space="preserve">La identidad visual y el apartado gráfico han sido fundamentales para captar la esencia del estudio de diseño de Edna Moda. El equipo ha utilizado herramientas de edición profesional como Adobe Photoshop y </w:t>
-      </w:r>
-      <w:r>
-        <w:rPr>
-          <w:rFonts w:ascii="Calibri" w:hAnsi="Calibri" w:eastAsia="" w:cs="" w:asciiTheme="minorAscii" w:hAnsiTheme="minorAscii" w:eastAsiaTheme="minorEastAsia" w:cstheme="minorBidi"/>
-          <w:noProof w:val="0"/>
-          <w:color w:val="auto"/>
-          <w:sz w:val="24"/>
-          <w:szCs w:val="24"/>
-          <w:lang w:val="es-ES" w:eastAsia="es-ES" w:bidi="ar-SA"/>
-        </w:rPr>
-        <w:t>Affinity</w:t>
-      </w:r>
-      <w:r>
-        <w:rPr>
-          <w:rFonts w:ascii="Calibri" w:hAnsi="Calibri" w:eastAsia="" w:cs="" w:asciiTheme="minorAscii" w:hAnsiTheme="minorAscii" w:eastAsiaTheme="minorEastAsia" w:cstheme="minorBidi"/>
-          <w:noProof w:val="0"/>
-          <w:color w:val="auto"/>
-          <w:sz w:val="24"/>
-          <w:szCs w:val="24"/>
-          <w:lang w:val="es-ES" w:eastAsia="es-ES" w:bidi="ar-SA"/>
-        </w:rPr>
-        <w:t xml:space="preserve">, además de </w:t>
-      </w:r>
-      <w:r>
-        <w:rPr>
-          <w:rFonts w:ascii="Calibri" w:hAnsi="Calibri" w:eastAsia="" w:cs="" w:asciiTheme="minorAscii" w:hAnsiTheme="minorAscii" w:eastAsiaTheme="minorEastAsia" w:cstheme="minorBidi"/>
-          <w:noProof w:val="0"/>
-          <w:color w:val="auto"/>
-          <w:sz w:val="24"/>
-          <w:szCs w:val="24"/>
-          <w:lang w:val="es-ES" w:eastAsia="es-ES" w:bidi="ar-SA"/>
-        </w:rPr>
-        <w:t>Canva</w:t>
-      </w:r>
-      <w:r>
-        <w:rPr>
-          <w:rFonts w:ascii="Calibri" w:hAnsi="Calibri" w:eastAsia="" w:cs="" w:asciiTheme="minorAscii" w:hAnsiTheme="minorAscii" w:eastAsiaTheme="minorEastAsia" w:cstheme="minorBidi"/>
-          <w:noProof w:val="0"/>
-          <w:color w:val="auto"/>
-          <w:sz w:val="24"/>
-          <w:szCs w:val="24"/>
-          <w:lang w:val="es-ES" w:eastAsia="es-ES" w:bidi="ar-SA"/>
         </w:rPr>
         <w:t xml:space="preserve"> para la maquetación rápida de elementos visuales y el diseño del logo. Para la fase de inspiración y búsqueda de referencias estéticas que definieran el estilo de la aplicación, se han empleado plataformas como Cosmos y Pinterest. Por último, la organización interna del grupo Payo Vallecano se ha apoyado en Trello para la asignación de tareas y el seguimiento de los requisitos según la metodología SCRUM, mientras que la comunicación inmediata y la coordinación diaria se han centralizado a través de un grupo de WhatsApp, garantizando así la fluidez necesaria para alcanzar los objetivos en los plazos establecidos.</w:t>
       </w:r>
@@ -2032,7 +1796,7 @@
           <w:numId w:val="1"/>
         </w:numPr>
       </w:pPr>
-      <w:bookmarkStart w:name="_Toc164530071" w:id="5"/>
+      <w:bookmarkStart w:id="5" w:name="_Toc164530071"/>
       <w:r>
         <w:t>Desarrollo e implementación</w:t>
       </w:r>
@@ -2093,7 +1857,7 @@
           <w:numId w:val="1"/>
         </w:numPr>
       </w:pPr>
-      <w:bookmarkStart w:name="_Toc164530072" w:id="6"/>
+      <w:bookmarkStart w:id="6" w:name="_Toc164530072"/>
       <w:r>
         <w:t>Metodología</w:t>
       </w:r>
@@ -2119,7 +1883,15 @@
         <w:t>/o</w:t>
       </w:r>
       <w:r>
-        <w:t xml:space="preserve"> Burndown chart, y </w:t>
+        <w:t xml:space="preserve"> </w:t>
+      </w:r>
+      <w:proofErr w:type="spellStart"/>
+      <w:r>
+        <w:t>Burndown</w:t>
+      </w:r>
+      <w:proofErr w:type="spellEnd"/>
+      <w:r>
+        <w:t xml:space="preserve"> chart, y </w:t>
       </w:r>
       <w:r>
         <w:t>añadir</w:t>
@@ -2157,7 +1929,7 @@
           <w:numId w:val="1"/>
         </w:numPr>
       </w:pPr>
-      <w:bookmarkStart w:name="_Toc164530073" w:id="7"/>
+      <w:bookmarkStart w:id="7" w:name="_Toc164530073"/>
       <w:r>
         <w:t>Resultados y conclusiones</w:t>
       </w:r>
@@ -2191,7 +1963,7 @@
           <w:numId w:val="1"/>
         </w:numPr>
       </w:pPr>
-      <w:bookmarkStart w:name="_Toc164530074" w:id="8"/>
+      <w:bookmarkStart w:id="8" w:name="_Toc164530074"/>
       <w:r>
         <w:t>Trabajos futuros</w:t>
       </w:r>
@@ -2214,7 +1986,7 @@
         <w:spacing w:after="160" w:line="259" w:lineRule="auto"/>
         <w:jc w:val="left"/>
         <w:rPr>
-          <w:rFonts w:ascii="Calibri" w:hAnsi="Calibri" w:eastAsia="Times New Roman" w:cs="Times New Roman"/>
+          <w:rFonts w:ascii="Calibri" w:eastAsia="Times New Roman" w:hAnsi="Calibri" w:cs="Times New Roman"/>
           <w:b/>
           <w:bCs/>
           <w:noProof/>
@@ -2232,7 +2004,7 @@
       <w:pPr>
         <w:pStyle w:val="Ttulo1"/>
       </w:pPr>
-      <w:bookmarkStart w:name="_Toc164530075" w:id="9"/>
+      <w:bookmarkStart w:id="9" w:name="_Toc164530075"/>
       <w:r>
         <w:t>Anexos</w:t>
       </w:r>
@@ -2245,7 +2017,7 @@
           <w:sz w:val="24"/>
         </w:rPr>
       </w:pPr>
-      <w:bookmarkStart w:name="_Toc164530076" w:id="10"/>
+      <w:bookmarkStart w:id="10" w:name="_Toc164530076"/>
       <w:r>
         <w:rPr>
           <w:sz w:val="24"/>
@@ -2290,7 +2062,7 @@
           <w:sz w:val="24"/>
         </w:rPr>
       </w:pPr>
-      <w:bookmarkStart w:name="_Toc164530077" w:id="11"/>
+      <w:bookmarkStart w:id="11" w:name="_Toc164530077"/>
       <w:r>
         <w:rPr>
           <w:sz w:val="24"/>
@@ -2316,8 +2088,13 @@
         <w:t>Incluirse en este anexo capturas de la aplicación, a modo de manual de usuario</w:t>
       </w:r>
       <w:r>
-        <w:t>, incluyendo tanto el acceso de usuario, como de admin</w:t>
-      </w:r>
+        <w:t xml:space="preserve">, incluyendo tanto el acceso de usuario, como de </w:t>
+      </w:r>
+      <w:proofErr w:type="spellStart"/>
+      <w:r>
+        <w:t>admin</w:t>
+      </w:r>
+      <w:proofErr w:type="spellEnd"/>
       <w:r>
         <w:t>.</w:t>
       </w:r>
@@ -2326,7 +2103,7 @@
       <w:pPr>
         <w:pStyle w:val="Ttulo1"/>
       </w:pPr>
-      <w:bookmarkStart w:name="_Toc164530078" w:id="12"/>
+      <w:bookmarkStart w:id="12" w:name="_Toc164530078"/>
       <w:r>
         <w:rPr>
           <w:sz w:val="24"/>
@@ -2419,9 +2196,9 @@
     </w:p>
     <w:p/>
     <w:sectPr>
-      <w:headerReference w:type="default" r:id="rId12"/>
-      <w:footerReference w:type="default" r:id="rId13"/>
-      <w:pgSz w:w="11906" w:h="16838" w:orient="portrait"/>
+      <w:headerReference w:type="default" r:id="rId13"/>
+      <w:footerReference w:type="default" r:id="rId14"/>
+      <w:pgSz w:w="11906" w:h="16838"/>
       <w:pgMar w:top="1418" w:right="1418" w:bottom="1418" w:left="1418" w:header="709" w:footer="709" w:gutter="0"/>
       <w:pgNumType w:start="0"/>
       <w:cols w:space="708"/>
@@ -2532,7 +2309,7 @@
 </file>
 
 <file path=word/header1.xml><?xml version="1.0" encoding="utf-8"?>
-<w:hdr xmlns:wpc="http://schemas.microsoft.com/office/word/2010/wordprocessingCanvas" xmlns:cx="http://schemas.microsoft.com/office/drawing/2014/chartex" xmlns:cx1="http://schemas.microsoft.com/office/drawing/2015/9/8/chartex" xmlns:cx2="http://schemas.microsoft.com/office/drawing/2015/10/21/chartex" xmlns:cx3="http://schemas.microsoft.com/office/drawing/2016/5/9/chartex" xmlns:cx4="http://schemas.microsoft.com/office/drawing/2016/5/10/chartex" xmlns:cx5="http://schemas.microsoft.com/office/drawing/2016/5/11/chartex" xmlns:cx6="http://schemas.microsoft.com/office/drawing/2016/5/12/chartex" xmlns:cx7="http://schemas.microsoft.com/office/drawing/2016/5/13/chartex" xmlns:cx8="http://schemas.microsoft.com/office/drawing/2016/5/14/chartex" xmlns:mc="http://schemas.openxmlformats.org/markup-compatibility/2006" xmlns:aink="http://schemas.microsoft.com/office/drawing/2016/ink" xmlns:am3d="http://schemas.microsoft.com/office/drawing/2017/model3d" xmlns:o="urn:schemas-microsoft-com:office:office" xmlns:oel="http://schemas.microsoft.com/office/2019/extlst" xmlns:r="http://schemas.openxmlformats.org/officeDocument/2006/relationships" xmlns:m="http://schemas.openxmlformats.org/officeDocument/2006/math" xmlns:v="urn:schemas-microsoft-com:vml" xmlns:wp14="http://schemas.microsoft.com/office/word/2010/wordprocessingDrawing" xmlns:wp="http://schemas.openxmlformats.org/drawingml/2006/wordprocessingDrawing" xmlns:w10="urn:schemas-microsoft-com:office:word" xmlns:w="http://schemas.openxmlformats.org/wordprocessingml/2006/main" xmlns:w14="http://schemas.microsoft.com/office/word/2010/wordml" xmlns:w15="http://schemas.microsoft.com/office/word/2012/wordml" xmlns:w16cex="http://schemas.microsoft.com/office/word/2018/wordml/cex" xmlns:w16cid="http://schemas.microsoft.com/office/word/2016/wordml/cid" xmlns:w16="http://schemas.microsoft.com/office/word/2018/wordml" xmlns:w16du="http://schemas.microsoft.com/office/word/2023/wordml/word16du" xmlns:w16sdtdh="http://schemas.microsoft.com/office/word/2020/wordml/sdtdatahash" xmlns:w16sdtfl="http://schemas.microsoft.com/office/word/2024/wordml/sdtformatlock" xmlns:w16se="http://schemas.microsoft.com/office/word/2015/wordml/symex" xmlns:wpg="http://schemas.microsoft.com/office/word/2010/wordprocessingGroup" xmlns:wpi="http://schemas.microsoft.com/office/word/2010/wordprocessingInk" xmlns:wne="http://schemas.microsoft.com/office/word/2006/wordml" xmlns:wps="http://schemas.microsoft.com/office/word/2010/wordprocessingShape" xmlns:a="http://schemas.openxmlformats.org/drawingml/2006/main" xmlns:pic="http://schemas.openxmlformats.org/drawingml/2006/picture" xmlns:a14="http://schemas.microsoft.com/office/drawing/2010/main" mc:Ignorable="w14 w15 w16se w16cid w16 w16cex w16sdtdh w16sdtfl w16du wp14">
+<w:hdr xmlns:wpc="http://schemas.microsoft.com/office/word/2010/wordprocessingCanvas" xmlns:cx="http://schemas.microsoft.com/office/drawing/2014/chartex" xmlns:cx1="http://schemas.microsoft.com/office/drawing/2015/9/8/chartex" xmlns:cx2="http://schemas.microsoft.com/office/drawing/2015/10/21/chartex" xmlns:cx3="http://schemas.microsoft.com/office/drawing/2016/5/9/chartex" xmlns:cx4="http://schemas.microsoft.com/office/drawing/2016/5/10/chartex" xmlns:cx5="http://schemas.microsoft.com/office/drawing/2016/5/11/chartex" xmlns:cx6="http://schemas.microsoft.com/office/drawing/2016/5/12/chartex" xmlns:cx7="http://schemas.microsoft.com/office/drawing/2016/5/13/chartex" xmlns:cx8="http://schemas.microsoft.com/office/drawing/2016/5/14/chartex" xmlns:mc="http://schemas.openxmlformats.org/markup-compatibility/2006" xmlns:aink="http://schemas.microsoft.com/office/drawing/2016/ink" xmlns:am3d="http://schemas.microsoft.com/office/drawing/2017/model3d" xmlns:o="urn:schemas-microsoft-com:office:office" xmlns:oel="http://schemas.microsoft.com/office/2019/extlst" xmlns:r="http://schemas.openxmlformats.org/officeDocument/2006/relationships" xmlns:m="http://schemas.openxmlformats.org/officeDocument/2006/math" xmlns:v="urn:schemas-microsoft-com:vml" xmlns:wp14="http://schemas.microsoft.com/office/word/2010/wordprocessingDrawing" xmlns:wp="http://schemas.openxmlformats.org/drawingml/2006/wordprocessingDrawing" xmlns:w10="urn:schemas-microsoft-com:office:word" xmlns:w="http://schemas.openxmlformats.org/wordprocessingml/2006/main" xmlns:w14="http://schemas.microsoft.com/office/word/2010/wordml" xmlns:w15="http://schemas.microsoft.com/office/word/2012/wordml" xmlns:w16cex="http://schemas.microsoft.com/office/word/2018/wordml/cex" xmlns:w16cid="http://schemas.microsoft.com/office/word/2016/wordml/cid" xmlns:w16="http://schemas.microsoft.com/office/word/2018/wordml" xmlns:w16du="http://schemas.microsoft.com/office/word/2023/wordml/word16du" xmlns:w16sdtdh="http://schemas.microsoft.com/office/word/2020/wordml/sdtdatahash" xmlns:w16sdtfl="http://schemas.microsoft.com/office/word/2024/wordml/sdtformatlock" xmlns:w16se="http://schemas.microsoft.com/office/word/2015/wordml/symex" xmlns:wpg="http://schemas.microsoft.com/office/word/2010/wordprocessingGroup" xmlns:wpi="http://schemas.microsoft.com/office/word/2010/wordprocessingInk" xmlns:wne="http://schemas.microsoft.com/office/word/2006/wordml" xmlns:wps="http://schemas.microsoft.com/office/word/2010/wordprocessingShape" mc:Ignorable="w14 w15 w16se w16cid w16 w16cex w16sdtdh w16sdtfl w16du wp14">
   <w:p>
     <w:pPr>
       <w:pStyle w:val="Encabezado"/>
@@ -2887,7 +2664,7 @@
   <w:docDefaults>
     <w:rPrDefault>
       <w:rPr>
-        <w:rFonts w:asciiTheme="minorHAnsi" w:hAnsiTheme="minorHAnsi" w:eastAsiaTheme="minorHAnsi" w:cstheme="minorBidi"/>
+        <w:rFonts w:asciiTheme="minorHAnsi" w:eastAsiaTheme="minorHAnsi" w:hAnsiTheme="minorHAnsi" w:cstheme="minorBidi"/>
         <w:sz w:val="22"/>
         <w:szCs w:val="22"/>
         <w:lang w:val="es-ES" w:eastAsia="en-US" w:bidi="ar-SA"/>
@@ -2902,14 +2679,14 @@
   <w:latentStyles w:defLockedState="0" w:defUIPriority="99" w:defSemiHidden="0" w:defUnhideWhenUsed="0" w:defQFormat="0" w:count="376">
     <w:lsdException w:name="Normal" w:uiPriority="0" w:qFormat="1"/>
     <w:lsdException w:name="heading 1" w:uiPriority="0" w:qFormat="1"/>
-    <w:lsdException w:name="heading 2" w:uiPriority="9" w:semiHidden="1" w:unhideWhenUsed="1" w:qFormat="1"/>
-    <w:lsdException w:name="heading 3" w:uiPriority="9" w:semiHidden="1" w:unhideWhenUsed="1" w:qFormat="1"/>
-    <w:lsdException w:name="heading 4" w:uiPriority="9" w:semiHidden="1" w:unhideWhenUsed="1" w:qFormat="1"/>
-    <w:lsdException w:name="heading 5" w:uiPriority="9" w:semiHidden="1" w:unhideWhenUsed="1" w:qFormat="1"/>
-    <w:lsdException w:name="heading 6" w:uiPriority="9" w:semiHidden="1" w:unhideWhenUsed="1" w:qFormat="1"/>
-    <w:lsdException w:name="heading 7" w:uiPriority="9" w:semiHidden="1" w:unhideWhenUsed="1" w:qFormat="1"/>
-    <w:lsdException w:name="heading 8" w:uiPriority="9" w:semiHidden="1" w:unhideWhenUsed="1" w:qFormat="1"/>
-    <w:lsdException w:name="heading 9" w:uiPriority="9" w:semiHidden="1" w:unhideWhenUsed="1" w:qFormat="1"/>
+    <w:lsdException w:name="heading 2" w:semiHidden="1" w:uiPriority="9" w:unhideWhenUsed="1" w:qFormat="1"/>
+    <w:lsdException w:name="heading 3" w:semiHidden="1" w:uiPriority="9" w:unhideWhenUsed="1" w:qFormat="1"/>
+    <w:lsdException w:name="heading 4" w:semiHidden="1" w:uiPriority="9" w:unhideWhenUsed="1" w:qFormat="1"/>
+    <w:lsdException w:name="heading 5" w:semiHidden="1" w:uiPriority="9" w:unhideWhenUsed="1" w:qFormat="1"/>
+    <w:lsdException w:name="heading 6" w:semiHidden="1" w:uiPriority="9" w:unhideWhenUsed="1" w:qFormat="1"/>
+    <w:lsdException w:name="heading 7" w:semiHidden="1" w:uiPriority="9" w:unhideWhenUsed="1" w:qFormat="1"/>
+    <w:lsdException w:name="heading 8" w:semiHidden="1" w:uiPriority="9" w:unhideWhenUsed="1" w:qFormat="1"/>
+    <w:lsdException w:name="heading 9" w:semiHidden="1" w:uiPriority="9" w:unhideWhenUsed="1" w:qFormat="1"/>
     <w:lsdException w:name="index 1" w:semiHidden="1" w:unhideWhenUsed="1"/>
     <w:lsdException w:name="index 2" w:semiHidden="1" w:unhideWhenUsed="1"/>
     <w:lsdException w:name="index 3" w:semiHidden="1" w:unhideWhenUsed="1"/>
@@ -2919,22 +2696,22 @@
     <w:lsdException w:name="index 7" w:semiHidden="1" w:unhideWhenUsed="1"/>
     <w:lsdException w:name="index 8" w:semiHidden="1" w:unhideWhenUsed="1"/>
     <w:lsdException w:name="index 9" w:semiHidden="1" w:unhideWhenUsed="1"/>
-    <w:lsdException w:name="toc 1" w:uiPriority="39" w:semiHidden="1" w:unhideWhenUsed="1"/>
-    <w:lsdException w:name="toc 2" w:uiPriority="39" w:semiHidden="1" w:unhideWhenUsed="1"/>
-    <w:lsdException w:name="toc 3" w:uiPriority="39" w:semiHidden="1" w:unhideWhenUsed="1"/>
-    <w:lsdException w:name="toc 4" w:uiPriority="39" w:semiHidden="1" w:unhideWhenUsed="1"/>
-    <w:lsdException w:name="toc 5" w:uiPriority="39" w:semiHidden="1" w:unhideWhenUsed="1"/>
-    <w:lsdException w:name="toc 6" w:uiPriority="39" w:semiHidden="1" w:unhideWhenUsed="1"/>
-    <w:lsdException w:name="toc 7" w:uiPriority="39" w:semiHidden="1" w:unhideWhenUsed="1"/>
-    <w:lsdException w:name="toc 8" w:uiPriority="39" w:semiHidden="1" w:unhideWhenUsed="1"/>
-    <w:lsdException w:name="toc 9" w:uiPriority="39" w:semiHidden="1" w:unhideWhenUsed="1"/>
+    <w:lsdException w:name="toc 1" w:semiHidden="1" w:uiPriority="39" w:unhideWhenUsed="1"/>
+    <w:lsdException w:name="toc 2" w:semiHidden="1" w:uiPriority="39" w:unhideWhenUsed="1"/>
+    <w:lsdException w:name="toc 3" w:semiHidden="1" w:uiPriority="39" w:unhideWhenUsed="1"/>
+    <w:lsdException w:name="toc 4" w:semiHidden="1" w:uiPriority="39" w:unhideWhenUsed="1"/>
+    <w:lsdException w:name="toc 5" w:semiHidden="1" w:uiPriority="39" w:unhideWhenUsed="1"/>
+    <w:lsdException w:name="toc 6" w:semiHidden="1" w:uiPriority="39" w:unhideWhenUsed="1"/>
+    <w:lsdException w:name="toc 7" w:semiHidden="1" w:uiPriority="39" w:unhideWhenUsed="1"/>
+    <w:lsdException w:name="toc 8" w:semiHidden="1" w:uiPriority="39" w:unhideWhenUsed="1"/>
+    <w:lsdException w:name="toc 9" w:semiHidden="1" w:uiPriority="39" w:unhideWhenUsed="1"/>
     <w:lsdException w:name="Normal Indent" w:semiHidden="1" w:unhideWhenUsed="1"/>
     <w:lsdException w:name="footnote text" w:semiHidden="1" w:unhideWhenUsed="1"/>
     <w:lsdException w:name="annotation text" w:semiHidden="1" w:unhideWhenUsed="1"/>
     <w:lsdException w:name="header" w:semiHidden="1" w:unhideWhenUsed="1"/>
     <w:lsdException w:name="footer" w:semiHidden="1" w:unhideWhenUsed="1"/>
     <w:lsdException w:name="index heading" w:semiHidden="1" w:unhideWhenUsed="1"/>
-    <w:lsdException w:name="caption" w:uiPriority="35" w:semiHidden="1" w:unhideWhenUsed="1" w:qFormat="1"/>
+    <w:lsdException w:name="caption" w:semiHidden="1" w:uiPriority="35" w:unhideWhenUsed="1" w:qFormat="1"/>
     <w:lsdException w:name="table of figures" w:semiHidden="1" w:unhideWhenUsed="1"/>
     <w:lsdException w:name="envelope address" w:semiHidden="1" w:unhideWhenUsed="1"/>
     <w:lsdException w:name="envelope return" w:semiHidden="1" w:unhideWhenUsed="1"/>
@@ -2965,7 +2742,7 @@
     <w:lsdException w:name="Title" w:uiPriority="10" w:qFormat="1"/>
     <w:lsdException w:name="Closing" w:semiHidden="1" w:unhideWhenUsed="1"/>
     <w:lsdException w:name="Signature" w:semiHidden="1" w:unhideWhenUsed="1"/>
-    <w:lsdException w:name="Default Paragraph Font" w:uiPriority="1" w:semiHidden="1" w:unhideWhenUsed="1"/>
+    <w:lsdException w:name="Default Paragraph Font" w:semiHidden="1" w:uiPriority="1" w:unhideWhenUsed="1"/>
     <w:lsdException w:name="Body Text" w:semiHidden="1" w:unhideWhenUsed="1"/>
     <w:lsdException w:name="Body Text Indent" w:semiHidden="1" w:unhideWhenUsed="1"/>
     <w:lsdException w:name="List Continue" w:semiHidden="1" w:unhideWhenUsed="1"/>
@@ -2994,7 +2771,7 @@
     <w:lsdException w:name="E-mail Signature" w:semiHidden="1" w:unhideWhenUsed="1"/>
     <w:lsdException w:name="HTML Top of Form" w:semiHidden="1" w:unhideWhenUsed="1"/>
     <w:lsdException w:name="HTML Bottom of Form" w:semiHidden="1" w:unhideWhenUsed="1"/>
-    <w:lsdException w:name="Normal (Web)" w:uiPriority="0" w:semiHidden="1" w:unhideWhenUsed="1"/>
+    <w:lsdException w:name="Normal (Web)" w:semiHidden="1" w:uiPriority="0" w:unhideWhenUsed="1"/>
     <w:lsdException w:name="HTML Acronym" w:semiHidden="1" w:unhideWhenUsed="1"/>
     <w:lsdException w:name="HTML Address" w:semiHidden="1" w:unhideWhenUsed="1"/>
     <w:lsdException w:name="HTML Cite" w:semiHidden="1" w:unhideWhenUsed="1"/>
@@ -3165,8 +2942,8 @@
     <w:lsdException w:name="Subtle Reference" w:uiPriority="31" w:qFormat="1"/>
     <w:lsdException w:name="Intense Reference" w:uiPriority="32" w:qFormat="1"/>
     <w:lsdException w:name="Book Title" w:uiPriority="33" w:qFormat="1"/>
-    <w:lsdException w:name="Bibliography" w:uiPriority="37" w:semiHidden="1" w:unhideWhenUsed="1"/>
-    <w:lsdException w:name="TOC Heading" w:uiPriority="39" w:semiHidden="1" w:unhideWhenUsed="1" w:qFormat="1"/>
+    <w:lsdException w:name="Bibliography" w:semiHidden="1" w:uiPriority="37" w:unhideWhenUsed="1"/>
+    <w:lsdException w:name="TOC Heading" w:semiHidden="1" w:uiPriority="39" w:unhideWhenUsed="1" w:qFormat="1"/>
     <w:lsdException w:name="Plain Table 1" w:uiPriority="41"/>
     <w:lsdException w:name="Plain Table 2" w:uiPriority="42"/>
     <w:lsdException w:name="Plain Table 3" w:uiPriority="43"/>
@@ -3277,7 +3054,7 @@
     <w:lsdException w:name="Unresolved Mention" w:semiHidden="1" w:unhideWhenUsed="1"/>
     <w:lsdException w:name="Smart Link" w:semiHidden="1" w:unhideWhenUsed="1"/>
   </w:latentStyles>
-  <w:style w:type="paragraph" w:styleId="Normal" w:default="1">
+  <w:style w:type="paragraph" w:default="1" w:styleId="Normal">
     <w:name w:val="Normal"/>
     <w:qFormat/>
     <w:rsid w:val="00AC38AD"/>
@@ -3304,7 +3081,7 @@
       <w:outlineLvl w:val="0"/>
     </w:pPr>
     <w:rPr>
-      <w:rFonts w:ascii="Calibri" w:hAnsi="Calibri" w:eastAsia="Times New Roman" w:cs="Times New Roman"/>
+      <w:rFonts w:ascii="Calibri" w:eastAsia="Times New Roman" w:hAnsi="Calibri" w:cs="Times New Roman"/>
       <w:b/>
       <w:bCs/>
       <w:noProof/>
@@ -3314,13 +3091,13 @@
       <w:szCs w:val="32"/>
     </w:rPr>
   </w:style>
-  <w:style w:type="character" w:styleId="Fuentedeprrafopredeter" w:default="1">
+  <w:style w:type="character" w:default="1" w:styleId="Fuentedeprrafopredeter">
     <w:name w:val="Default Paragraph Font"/>
     <w:uiPriority w:val="1"/>
     <w:semiHidden/>
     <w:unhideWhenUsed/>
   </w:style>
-  <w:style w:type="table" w:styleId="Tablanormal" w:default="1">
+  <w:style w:type="table" w:default="1" w:styleId="Tablanormal">
     <w:name w:val="Normal Table"/>
     <w:uiPriority w:val="99"/>
     <w:semiHidden/>
@@ -3335,19 +3112,19 @@
       </w:tblCellMar>
     </w:tblPr>
   </w:style>
-  <w:style w:type="numbering" w:styleId="Sinlista" w:default="1">
+  <w:style w:type="numbering" w:default="1" w:styleId="Sinlista">
     <w:name w:val="No List"/>
     <w:uiPriority w:val="99"/>
     <w:semiHidden/>
     <w:unhideWhenUsed/>
   </w:style>
-  <w:style w:type="character" w:styleId="Ttulo1Car" w:customStyle="1">
+  <w:style w:type="character" w:customStyle="1" w:styleId="Ttulo1Car">
     <w:name w:val="Título 1 Car"/>
     <w:basedOn w:val="Fuentedeprrafopredeter"/>
     <w:link w:val="Ttulo1"/>
     <w:rsid w:val="00AC38AD"/>
     <w:rPr>
-      <w:rFonts w:ascii="Calibri" w:hAnsi="Calibri" w:eastAsia="Times New Roman" w:cs="Times New Roman"/>
+      <w:rFonts w:ascii="Calibri" w:eastAsia="Times New Roman" w:hAnsi="Calibri" w:cs="Times New Roman"/>
       <w:b/>
       <w:bCs/>
       <w:noProof/>
@@ -3366,7 +3143,7 @@
       <w:spacing w:before="100" w:beforeAutospacing="1" w:after="100" w:afterAutospacing="1" w:line="240" w:lineRule="auto"/>
     </w:pPr>
     <w:rPr>
-      <w:rFonts w:ascii="Times New Roman" w:hAnsi="Times New Roman" w:eastAsia="Times New Roman" w:cs="Times New Roman"/>
+      <w:rFonts w:ascii="Times New Roman" w:eastAsia="Times New Roman" w:hAnsi="Times New Roman" w:cs="Times New Roman"/>
       <w:szCs w:val="24"/>
     </w:rPr>
   </w:style>
@@ -3394,7 +3171,7 @@
       <w:spacing w:after="0" w:line="240" w:lineRule="auto"/>
     </w:pPr>
   </w:style>
-  <w:style w:type="character" w:styleId="EncabezadoCar" w:customStyle="1">
+  <w:style w:type="character" w:customStyle="1" w:styleId="EncabezadoCar">
     <w:name w:val="Encabezado Car"/>
     <w:basedOn w:val="Fuentedeprrafopredeter"/>
     <w:link w:val="Encabezado"/>
@@ -3421,7 +3198,7 @@
       <w:spacing w:after="0" w:line="240" w:lineRule="auto"/>
     </w:pPr>
   </w:style>
-  <w:style w:type="character" w:styleId="PiedepginaCar" w:customStyle="1">
+  <w:style w:type="character" w:customStyle="1" w:styleId="PiedepginaCar">
     <w:name w:val="Pie de página Car"/>
     <w:basedOn w:val="Fuentedeprrafopredeter"/>
     <w:link w:val="Piedepgina"/>
@@ -3447,7 +3224,7 @@
       <w:outlineLvl w:val="9"/>
     </w:pPr>
     <w:rPr>
-      <w:rFonts w:asciiTheme="majorHAnsi" w:hAnsiTheme="majorHAnsi" w:eastAsiaTheme="majorEastAsia" w:cstheme="majorBidi"/>
+      <w:rFonts w:asciiTheme="majorHAnsi" w:eastAsiaTheme="majorEastAsia" w:hAnsiTheme="majorHAnsi" w:cstheme="majorBidi"/>
       <w:b w:val="0"/>
       <w:bCs w:val="0"/>
       <w:noProof w:val="0"/>
@@ -3471,7 +3248,7 @@
 </file>
 
 <file path=word/theme/theme1.xml><?xml version="1.0" encoding="utf-8"?>
-<a:theme xmlns:a="http://schemas.openxmlformats.org/drawingml/2006/main" xmlns:thm15="http://schemas.microsoft.com/office/thememl/2012/main" name="Tema de Office">
+<a:theme xmlns:a="http://schemas.openxmlformats.org/drawingml/2006/main" name="Tema de Office">
   <a:themeElements>
     <a:clrScheme name="Office">
       <a:dk1>
@@ -3732,18 +3509,15 @@
 </file>
 
 <file path=customXml/item1.xml><?xml version="1.0" encoding="utf-8"?>
-<p:properties xmlns:p="http://schemas.microsoft.com/office/2006/metadata/properties" xmlns:xsi="http://www.w3.org/2001/XMLSchema-instance" xmlns:pc="http://schemas.microsoft.com/office/infopath/2007/PartnerControls">
-  <documentManagement>
-    <_activity xmlns="fd8a73f8-f815-4fba-aad8-7d5d42663f91" xsi:nil="true"/>
-  </documentManagement>
-</p:properties>
+<?mso-contentType ?>
+<FormTemplates xmlns="http://schemas.microsoft.com/sharepoint/v3/contenttype/forms">
+  <Display>DocumentLibraryForm</Display>
+  <Edit>DocumentLibraryForm</Edit>
+  <New>DocumentLibraryForm</New>
+</FormTemplates>
 </file>
 
 <file path=customXml/item2.xml><?xml version="1.0" encoding="utf-8"?>
-<b:Sources xmlns:b="http://schemas.openxmlformats.org/officeDocument/2006/bibliography" xmlns="http://schemas.openxmlformats.org/officeDocument/2006/bibliography" SelectedStyle="/APASixthEditionOfficeOnline.xsl" StyleName="APA" Version="6"/>
-</file>
-
-<file path=customXml/item3.xml><?xml version="1.0" encoding="utf-8"?>
 <ct:contentTypeSchema xmlns:ct="http://schemas.microsoft.com/office/2006/metadata/contentType" xmlns:ma="http://schemas.microsoft.com/office/2006/metadata/properties/metaAttributes" ct:_="" ma:_="" ma:contentTypeName="Document" ma:contentTypeID="0x0101003771EF6F4DD57D4BB341978B0C699B9F" ma:contentTypeVersion="5" ma:contentTypeDescription="Create a new document." ma:contentTypeScope="" ma:versionID="06868b8f65cc4d54ae1303708550a388">
   <xsd:schema xmlns:xsd="http://www.w3.org/2001/XMLSchema" xmlns:xs="http://www.w3.org/2001/XMLSchema" xmlns:p="http://schemas.microsoft.com/office/2006/metadata/properties" xmlns:ns3="fd8a73f8-f815-4fba-aad8-7d5d42663f91" targetNamespace="http://schemas.microsoft.com/office/2006/metadata/properties" ma:root="true" ma:fieldsID="d2cd9717685c60f99e0cb70942fdffc5" ns3:_="">
     <xsd:import namespace="fd8a73f8-f815-4fba-aad8-7d5d42663f91"/>
@@ -3893,34 +3667,27 @@
 </ct:contentTypeSchema>
 </file>
 
+<file path=customXml/item3.xml><?xml version="1.0" encoding="utf-8"?>
+<b:Sources xmlns:b="http://schemas.openxmlformats.org/officeDocument/2006/bibliography" xmlns="http://schemas.openxmlformats.org/officeDocument/2006/bibliography" SelectedStyle="/APASixthEditionOfficeOnline.xsl" StyleName="APA" Version="6"/>
+</file>
+
 <file path=customXml/item4.xml><?xml version="1.0" encoding="utf-8"?>
-<?mso-contentType ?>
-<FormTemplates xmlns="http://schemas.microsoft.com/sharepoint/v3/contenttype/forms">
-  <Display>DocumentLibraryForm</Display>
-  <Edit>DocumentLibraryForm</Edit>
-  <New>DocumentLibraryForm</New>
-</FormTemplates>
+<p:properties xmlns:p="http://schemas.microsoft.com/office/2006/metadata/properties" xmlns:xsi="http://www.w3.org/2001/XMLSchema-instance" xmlns:pc="http://schemas.microsoft.com/office/infopath/2007/PartnerControls">
+  <documentManagement>
+    <_activity xmlns="fd8a73f8-f815-4fba-aad8-7d5d42663f91" xsi:nil="true"/>
+  </documentManagement>
+</p:properties>
 </file>
 
 <file path=customXml/itemProps1.xml><?xml version="1.0" encoding="utf-8"?>
-<ds:datastoreItem xmlns:ds="http://schemas.openxmlformats.org/officeDocument/2006/customXml" ds:itemID="{F5965877-3DCA-4AA9-B0CE-C0B104DB6983}">
+<ds:datastoreItem xmlns:ds="http://schemas.openxmlformats.org/officeDocument/2006/customXml" ds:itemID="{98966CDD-637B-4D63-95C4-03CFA3699F1F}">
   <ds:schemaRefs>
-    <ds:schemaRef ds:uri="http://schemas.microsoft.com/office/2006/metadata/properties"/>
-    <ds:schemaRef ds:uri="http://schemas.microsoft.com/office/infopath/2007/PartnerControls"/>
-    <ds:schemaRef ds:uri="fd8a73f8-f815-4fba-aad8-7d5d42663f91"/>
+    <ds:schemaRef ds:uri="http://schemas.microsoft.com/sharepoint/v3/contenttype/forms"/>
   </ds:schemaRefs>
 </ds:datastoreItem>
 </file>
 
 <file path=customXml/itemProps2.xml><?xml version="1.0" encoding="utf-8"?>
-<ds:datastoreItem xmlns:ds="http://schemas.openxmlformats.org/officeDocument/2006/customXml" ds:itemID="{B84EB3CA-A7A5-E449-AC80-CF8C7BFFBCE0}">
-  <ds:schemaRefs>
-    <ds:schemaRef ds:uri="http://schemas.openxmlformats.org/officeDocument/2006/bibliography"/>
-  </ds:schemaRefs>
-</ds:datastoreItem>
-</file>
-
-<file path=customXml/itemProps3.xml><?xml version="1.0" encoding="utf-8"?>
 <ds:datastoreItem xmlns:ds="http://schemas.openxmlformats.org/officeDocument/2006/customXml" ds:itemID="{31BF955A-D32C-45E3-B821-FAF3A835F9A4}">
   <ds:schemaRefs>
     <ds:schemaRef ds:uri="http://schemas.microsoft.com/office/2006/metadata/contentType"/>
@@ -3938,10 +3705,20 @@
 </ds:datastoreItem>
 </file>
 
+<file path=customXml/itemProps3.xml><?xml version="1.0" encoding="utf-8"?>
+<ds:datastoreItem xmlns:ds="http://schemas.openxmlformats.org/officeDocument/2006/customXml" ds:itemID="{B84EB3CA-A7A5-E449-AC80-CF8C7BFFBCE0}">
+  <ds:schemaRefs>
+    <ds:schemaRef ds:uri="http://schemas.openxmlformats.org/officeDocument/2006/bibliography"/>
+  </ds:schemaRefs>
+</ds:datastoreItem>
+</file>
+
 <file path=customXml/itemProps4.xml><?xml version="1.0" encoding="utf-8"?>
-<ds:datastoreItem xmlns:ds="http://schemas.openxmlformats.org/officeDocument/2006/customXml" ds:itemID="{98966CDD-637B-4D63-95C4-03CFA3699F1F}">
+<ds:datastoreItem xmlns:ds="http://schemas.openxmlformats.org/officeDocument/2006/customXml" ds:itemID="{F5965877-3DCA-4AA9-B0CE-C0B104DB6983}">
   <ds:schemaRefs>
-    <ds:schemaRef ds:uri="http://schemas.microsoft.com/sharepoint/v3/contenttype/forms"/>
+    <ds:schemaRef ds:uri="http://schemas.microsoft.com/office/2006/metadata/properties"/>
+    <ds:schemaRef ds:uri="http://schemas.microsoft.com/office/infopath/2007/PartnerControls"/>
+    <ds:schemaRef ds:uri="fd8a73f8-f815-4fba-aad8-7d5d42663f91"/>
   </ds:schemaRefs>
 </ds:datastoreItem>
 </file>
</xml_diff>

<commit_message>
Apartados de la memoria sprint 2
</commit_message>
<xml_diff>
--- a/Documentacion/Memoria Proyecto Integrador.docx
+++ b/Documentacion/Memoria Proyecto Integrador.docx
@@ -1402,6 +1402,7 @@
       <w:bookmarkStart w:id="0" w:name="_Toc92297615"/>
       <w:bookmarkStart w:id="1" w:name="_Toc164530067"/>
       <w:r>
+        <w:lastRenderedPageBreak/>
         <w:t>Resumen</w:t>
       </w:r>
       <w:bookmarkEnd w:id="0"/>
@@ -1454,6 +1455,7 @@
       </w:pPr>
       <w:bookmarkStart w:id="2" w:name="_Toc164530068"/>
       <w:r>
+        <w:lastRenderedPageBreak/>
         <w:t>Introducción</w:t>
       </w:r>
       <w:bookmarkEnd w:id="2"/>
@@ -1488,57 +1490,30 @@
         <w:rPr>
           <w:szCs w:val="24"/>
         </w:rPr>
-        <w:t>La aplicación propuesta debe permitir realizar un ciclo completo de gestión de datos, incluyendo la creación, consulta, modificación y borrado (</w:t>
-      </w:r>
-      <w:proofErr w:type="spellStart"/>
+        <w:t>La aplicación propuesta debe permitir realizar un ciclo completo de gestión de datos, incluyendo la creación, consulta, modificación y borrado (CRUD) de clientes y citas. Para lograr una operatividad óptima, el sistema diferenciará entre varios perfiles de usuario dentro del taller: aprendices, oficiales y maestros, cada uno con niveles de acceso y permisos específicos adaptados a su rango y responsabilidad dentro de la empresa. Los maestros tendrán el control total del inventario de talleres y la agenda global, mientras que los oficiales y aprendices gestionarán sus tareas operativas directas.</w:t>
+      </w:r>
+    </w:p>
+    <w:p>
+      <w:pPr>
+        <w:spacing w:after="240"/>
+      </w:pPr>
       <w:r>
         <w:rPr>
           <w:szCs w:val="24"/>
         </w:rPr>
-        <w:t>CRUD</w:t>
-      </w:r>
-      <w:proofErr w:type="spellEnd"/>
+        <w:t>Uno de los desafíos más singulares de esta propuesta, que hemos decidido abordar como un valor añadido, es la implementación de una lógica de seguridad para la agenda. Dado que el taller atiende a facciones enfrentadas, el sistema debe ser capaz de identificar si un cliente es héroe o villano para evitar que coincidan en el tiempo y el espacio. La aplicación garantizará un margen de seguridad de al menos una hora entre citas de clientes con intereses opuestos para prevenir incidentes en la sede.</w:t>
+      </w:r>
+    </w:p>
+    <w:p>
+      <w:pPr>
+        <w:spacing w:after="240"/>
+      </w:pPr>
       <w:r>
         <w:rPr>
           <w:szCs w:val="24"/>
         </w:rPr>
-        <w:t>) de clientes y citas. Para lograr una operatividad óptima, el sistema diferenciará entre varios perfiles de usuario dentro del taller: aprendices, oficiales y maestros, cada uno con niveles de acceso y permisos específicos adaptados a su rango y responsabilidad dentro de la empresa. Los maestros tendrán el control total del inventario de talleres y la agenda global, mientras que los oficiales y aprendices gestionarán sus tareas operativas directas.</w:t>
-      </w:r>
-    </w:p>
-    <w:p>
-      <w:pPr>
-        <w:spacing w:after="240"/>
-      </w:pPr>
-      <w:r>
-        <w:rPr>
-          <w:szCs w:val="24"/>
-        </w:rPr>
-        <w:t>Uno de los desafíos más singulares de esta propuesta, que hemos decidido abordar como un valor añadido, es la implementación de una lógica de seguridad para la agenda. Dado que el taller atiende a facciones enfrentadas, el sistema debe ser capaz de identificar si un cliente es héroe o villano para evitar que coincidan en el tiempo y el espacio. La aplicación garantizará un margen de seguridad de al menos una hora entre citas de clientes con intereses opuestos para prevenir incidentes en la sede.</w:t>
-      </w:r>
-    </w:p>
-    <w:p>
-      <w:pPr>
-        <w:spacing w:after="240"/>
-      </w:pPr>
-      <w:r>
-        <w:rPr>
-          <w:szCs w:val="24"/>
-        </w:rPr>
-        <w:t xml:space="preserve">Desde el punto de vista metodológico, el proyecto se desarrolla bajo el marco de trabajo SCRUM, lo que permite al equipo una adaptación constante a los requisitos y una entrega incremental de valor a través de diferentes </w:t>
-      </w:r>
-      <w:proofErr w:type="spellStart"/>
-      <w:r>
-        <w:rPr>
-          <w:szCs w:val="24"/>
-        </w:rPr>
-        <w:t>sprints</w:t>
-      </w:r>
-      <w:proofErr w:type="spellEnd"/>
-      <w:r>
-        <w:rPr>
-          <w:szCs w:val="24"/>
-        </w:rPr>
-        <w:t>. La integración de tecnologías como el lenguaje de programación Java, el uso de bases de datos relacionales MySQL y el control de versiones mediante GitHub asegura un entorno de desarrollo profesional y colaborativo. Con este enfoque, buscamos no solo cumplir con las especificaciones técnicas, sino también demostrar capacidad de resolución de problemas y gestión eficaz del trabajo en equipo en un entorno de desarrollo real.</w:t>
+        <w:lastRenderedPageBreak/>
+        <w:t>Desde el punto de vista metodológico, el proyecto se desarrolla bajo el marco de trabajo SCRUM, lo que permite al equipo una adaptación constante a los requisitos y una entrega incremental de valor a través de diferentes sprints. La integración de tecnologías como el lenguaje de programación Java, el uso de bases de datos relacionales MySQL y el control de versiones mediante GitHub asegura un entorno de desarrollo profesional y colaborativo. Con este enfoque, buscamos no solo cumplir con las especificaciones técnicas, sino también demostrar capacidad de resolución de problemas y gestión eficaz del trabajo en equipo en un entorno de desarrollo real.</w:t>
       </w:r>
     </w:p>
     <w:p/>
@@ -1590,7 +1565,14 @@
         <w:rPr>
           <w:szCs w:val="24"/>
         </w:rPr>
-        <w:t xml:space="preserve"> entre tres áreas fundamentales. En el ámbito de las Bases de Datos el objetivo principal es garantizar la integridad y persistencia de la información mediante la creación de bases de datos definiendo su estructura y las características de sus elementos según el modelo relacional. Esto implica diseñar modelos lógicos normalizados interpretando diagramas entidad/relación y realizar el diseño físico de las bases de datos utilizando asistentes, herramientas gráficas y el lenguaje de definición de datos. Además, se debe ser capaz de consultar y modificar la información almacenada utilizando el lenguaje de manipulación de datos.</w:t>
+        <w:t xml:space="preserve"> entre tres áreas fundamentales. En el </w:t>
+      </w:r>
+      <w:r>
+        <w:rPr>
+          <w:szCs w:val="24"/>
+        </w:rPr>
+        <w:lastRenderedPageBreak/>
+        <w:t>ámbito de las Bases de Datos el objetivo principal es garantizar la integridad y persistencia de la información mediante la creación de bases de datos definiendo su estructura y las características de sus elementos según el modelo relacional. Esto implica diseñar modelos lógicos normalizados interpretando diagramas entidad/relación y realizar el diseño físico de las bases de datos utilizando asistentes, herramientas gráficas y el lenguaje de definición de datos. Además, se debe ser capaz de consultar y modificar la información almacenada utilizando el lenguaje de manipulación de datos.</w:t>
       </w:r>
     </w:p>
     <w:p>
@@ -1601,46 +1583,18 @@
         <w:rPr>
           <w:szCs w:val="24"/>
         </w:rPr>
-        <w:t xml:space="preserve">En el módulo de Programación el enfoque se centra en dar vida a la lógica de negocio y a la interfaz mediante el diseño de clases necesarias para seguir el patrón </w:t>
-      </w:r>
-      <w:proofErr w:type="spellStart"/>
+        <w:t>En el módulo de Programación el enfoque se centra en dar vida a la lógica de negocio y a la interfaz mediante el diseño de clases necesarias para seguir el patrón MVC. El equipo debe implementar cada una de las clases para lograr su objetivo incluyendo clases de interfaz gráfica pertenecientes a la vista, clases que representen el modelo y clases encargadas de la lógica pertenecientes al control. Se desarrollará una aplicación que gestione información almacenada en bases de datos relacionales identificando y utilizando mecanismos de conexión lo que permitirá alcanzar la competencia completa para desarrollar componentes software en lenguajes de programación orientados a objetos.</w:t>
+      </w:r>
+    </w:p>
+    <w:p>
+      <w:pPr>
+        <w:spacing w:after="240"/>
+      </w:pPr>
       <w:r>
         <w:rPr>
           <w:szCs w:val="24"/>
         </w:rPr>
-        <w:t>MVC</w:t>
-      </w:r>
-      <w:proofErr w:type="spellEnd"/>
-      <w:r>
-        <w:rPr>
-          <w:szCs w:val="24"/>
-        </w:rPr>
-        <w:t>. El equipo debe implementar cada una de las clases para lograr su objetivo incluyendo clases de interfaz gráfica pertenecientes a la vista, clases que representen el modelo y clases encargadas de la lógica pertenecientes al control. Se desarrollará una aplicación que gestione información almacenada en bases de datos relacionales identificando y utilizando mecanismos de conexión lo que permitirá alcanzar la competencia completa para desarrollar componentes software en lenguajes de programación orientados a objetos.</w:t>
-      </w:r>
-    </w:p>
-    <w:p>
-      <w:pPr>
-        <w:spacing w:after="240"/>
-      </w:pPr>
-      <w:r>
-        <w:rPr>
-          <w:szCs w:val="24"/>
-        </w:rPr>
-        <w:t xml:space="preserve">Por último, el módulo de Entornos de Desarrollo asegura la calidad del software y la correcta gestión del ciclo de vida del producto realizando el análisis y el diseño de la aplicación empleando técnicas </w:t>
-      </w:r>
-      <w:proofErr w:type="spellStart"/>
-      <w:r>
-        <w:rPr>
-          <w:szCs w:val="24"/>
-        </w:rPr>
-        <w:t>UML</w:t>
-      </w:r>
-      <w:proofErr w:type="spellEnd"/>
-      <w:r>
-        <w:rPr>
-          <w:szCs w:val="24"/>
-        </w:rPr>
-        <w:t xml:space="preserve">. Es fundamental documentar la aplicación con </w:t>
+        <w:t xml:space="preserve">Por último, el módulo de Entornos de Desarrollo asegura la calidad del software y la correcta gestión del ciclo de vida del producto realizando el análisis y el diseño de la aplicación empleando técnicas UML. Es fundamental documentar la aplicación con </w:t>
       </w:r>
       <w:proofErr w:type="spellStart"/>
       <w:r>
@@ -1675,14 +1629,37 @@
       <w:bookmarkEnd w:id="4"/>
     </w:p>
     <w:p>
+      <w:pPr>
+        <w:spacing w:after="240"/>
+      </w:pPr>
       <w:r>
         <w:rPr>
           <w:szCs w:val="24"/>
         </w:rPr>
-        <w:t>Para este apartado se recomienda una extensión de 2 a 3 páginas. Enumeración de las tecnologías, herramientas y lenguajes de programación utilizados durante el desarrollo del proyecto. Enumeración de las herramientas organizativas para favorecer el trabajo en equipo.</w:t>
-      </w:r>
-    </w:p>
-    <w:p/>
+        <w:t xml:space="preserve">El desarrollo del proyecto integrador ha requerido la combinación de diversas herramientas técnicas y organizativas para cumplir con los estándares de calidad exigidos por el taller de la </w:t>
+      </w:r>
+      <w:r>
+        <w:rPr>
+          <w:szCs w:val="24"/>
+        </w:rPr>
+        <w:lastRenderedPageBreak/>
+        <w:t xml:space="preserve">Sra. Moda. Para la construcción del núcleo de la aplicación, el entorno de desarrollo integrado (IDE) principal ha sido Eclipse, el cual ha proporcionado la infraestructura necesaria para la programación orientada a objetos en Java utilizando el patrón Modelo-Vista-Controlador. En cuanto a la persistencia de los datos, se ha empleado el sistema de gestión de bases de datos relacionales MySQL junto con MySQL </w:t>
+      </w:r>
+      <w:proofErr w:type="spellStart"/>
+      <w:r>
+        <w:rPr>
+          <w:szCs w:val="24"/>
+        </w:rPr>
+        <w:t>Workbench</w:t>
+      </w:r>
+      <w:proofErr w:type="spellEnd"/>
+      <w:r>
+        <w:rPr>
+          <w:szCs w:val="24"/>
+        </w:rPr>
+        <w:t xml:space="preserve"> para el diseño físico y la administración de las tablas, índices e inserciones necesarias para el sistema de citas. El control de versiones y el trabajo colaborativo se han gestionado mediante Git Bash y GitHub, permitiendo una integración fluida de los componentes desarrollados por cada miembro del equipo y el mantenimiento de la línea de desarrollo del proyecto.</w:t>
+      </w:r>
+    </w:p>
     <w:p>
       <w:pPr>
         <w:spacing w:after="240"/>
@@ -1691,74 +1668,35 @@
         <w:rPr>
           <w:szCs w:val="24"/>
         </w:rPr>
-        <w:t xml:space="preserve">El desarrollo del proyecto integrador ha requerido la combinación de diversas herramientas técnicas y organizativas para cumplir con los estándares de calidad exigidos por el taller de la Sra. Moda. Para la construcción del núcleo de la aplicación, el entorno de desarrollo integrado (IDE) principal ha sido Eclipse, el cual ha proporcionado la infraestructura necesaria para la programación orientada a objetos en Java utilizando el patrón Modelo-Vista-Controlador. En cuanto a la persistencia de los datos, se ha empleado el sistema de gestión de bases de datos relacionales MySQL junto con MySQL </w:t>
+        <w:t xml:space="preserve">En el ámbito del análisis y diseño conceptual, el grupo ha utilizado </w:t>
       </w:r>
       <w:proofErr w:type="spellStart"/>
       <w:r>
         <w:rPr>
           <w:szCs w:val="24"/>
         </w:rPr>
-        <w:t>Workbench</w:t>
+        <w:t>Excalidraw</w:t>
       </w:r>
       <w:proofErr w:type="spellEnd"/>
       <w:r>
         <w:rPr>
           <w:szCs w:val="24"/>
         </w:rPr>
-        <w:t xml:space="preserve"> para el diseño físico y la administración de las tablas, índices e inserciones necesarias para el sistema de citas. El control de versiones y el trabajo colaborativo se han gestionado mediante Git Bash y GitHub, permitiendo una integración fluida de los componentes desarrollados por cada miembro del equipo y el mantenimiento de la línea de desarrollo del proyecto.</w:t>
-      </w:r>
-    </w:p>
-    <w:p>
-      <w:pPr>
-        <w:spacing w:after="240"/>
-      </w:pPr>
+        <w:t xml:space="preserve"> y SharePoint de Microsoft 365 para la elaboración de los modelos de entidad-relación y los diagramas lógicos normalizados que estructuran la base de datos. La fase de documentación y redacción de la memoria se ha llevado a cabo de forma incremental utilizando Google </w:t>
+      </w:r>
+      <w:proofErr w:type="spellStart"/>
       <w:r>
         <w:rPr>
           <w:szCs w:val="24"/>
         </w:rPr>
-        <w:t xml:space="preserve">En el ámbito del análisis y diseño conceptual, el grupo ha utilizado </w:t>
-      </w:r>
-      <w:proofErr w:type="spellStart"/>
+        <w:t>Docs</w:t>
+      </w:r>
+      <w:proofErr w:type="spellEnd"/>
       <w:r>
         <w:rPr>
           <w:szCs w:val="24"/>
         </w:rPr>
-        <w:t>Excalidraw</w:t>
-      </w:r>
-      <w:proofErr w:type="spellEnd"/>
-      <w:r>
-        <w:rPr>
-          <w:szCs w:val="24"/>
-        </w:rPr>
-        <w:t xml:space="preserve"> y SharePoint de Microsoft 365 para la elaboración de los modelos de entidad-relación y los diagramas lógicos normalizados que estructuran la base de datos. La fase de documentación y redacción de la memoria se ha llevado a cabo de forma incremental utilizando Google </w:t>
-      </w:r>
-      <w:proofErr w:type="spellStart"/>
-      <w:r>
-        <w:rPr>
-          <w:szCs w:val="24"/>
-        </w:rPr>
-        <w:t>Docs</w:t>
-      </w:r>
-      <w:proofErr w:type="spellEnd"/>
-      <w:r>
-        <w:rPr>
-          <w:szCs w:val="24"/>
-        </w:rPr>
-        <w:t xml:space="preserve"> para los borradores iniciales y Microsoft Office Word, tanto en su versión de escritorio como en la modalidad Online, para asegurar un formato profesional y una edición colaborativa en tiempo real. Para la resolución de dudas técnicas y la búsqueda de información específica sobre sintaxis o lógica de programación, se ha recurrido al motor de búsqueda de Google y al asistente de inteligencia artificial Gemini, asegurando así una toma de decisiones informada durante los distintos </w:t>
-      </w:r>
-      <w:proofErr w:type="spellStart"/>
-      <w:r>
-        <w:rPr>
-          <w:szCs w:val="24"/>
-        </w:rPr>
-        <w:t>sprints</w:t>
-      </w:r>
-      <w:proofErr w:type="spellEnd"/>
-      <w:r>
-        <w:rPr>
-          <w:szCs w:val="24"/>
-        </w:rPr>
-        <w:t>.</w:t>
+        <w:t xml:space="preserve"> para los borradores iniciales y Microsoft Office Word, tanto en su versión de escritorio como en la modalidad Online, para asegurar un formato profesional y una edición colaborativa en tiempo real. Para la resolución de dudas técnicas y la búsqueda de información específica sobre sintaxis o lógica de programación, se ha recurrido al motor de búsqueda de Google y al asistente de inteligencia artificial Gemini, asegurando así una toma de decisiones informada durante los distintos sprints.</w:t>
       </w:r>
     </w:p>
     <w:p>
@@ -1865,60 +1803,702 @@
     </w:p>
     <w:p>
       <w:r>
-        <w:t xml:space="preserve">Para este apartado se recomienda una extensión de 3 a </w:t>
-      </w:r>
-      <w:r>
-        <w:t>6</w:t>
-      </w:r>
-      <w:r>
-        <w:t xml:space="preserve"> páginas. Explicación de cómo se ha aplicado la metodología Scrum al trabajo, representando el flujo de trabajo con</w:t>
-      </w:r>
-      <w:r>
-        <w:t xml:space="preserve"> un Diagrama de Gantt,</w:t>
-      </w:r>
-      <w:r>
-        <w:t xml:space="preserve"> Sprint Backlog y</w:t>
-      </w:r>
-      <w:r>
-        <w:t>/o</w:t>
+        <w:t xml:space="preserve">Para el proyecto se utilizará la metodología ágil SCRUM, un </w:t>
+      </w:r>
+      <w:proofErr w:type="spellStart"/>
+      <w:r>
+        <w:t>framework</w:t>
+      </w:r>
+      <w:proofErr w:type="spellEnd"/>
+      <w:r>
+        <w:t xml:space="preserve"> de desarrollo ágil de software para gestionar el desarrollo de productos.</w:t>
+      </w:r>
+    </w:p>
+    <w:p>
+      <w:r>
+        <w:t>Se define como una estrategia flexible e integral de desarrollo de producto donde un equipo trabaja como una unidad para alcanzar un objetivo: los retos asumen un enfoque secuencial del desarrollo de producto, y se habilita a los equipos para organizarse por sí mismos, animando a la colaboración presencial u online de todos los miembros del equipo, así como a una comunicación diaria cara a cara de todos los miembros y perfiles en el proyecto.</w:t>
+      </w:r>
+    </w:p>
+    <w:p>
+      <w:r>
+        <w:t>Una idea clave de SCRUM es el reconocimiento de que, durante el desarrollo del proyecto, el cliente puede cambiar de idea sobre lo que quiere o necesita, y que puede haber cambios imprevistos no especificados en la planificación original.</w:t>
+      </w:r>
+    </w:p>
+    <w:p>
+      <w:r>
+        <w:t>SCRUM adopta una aproximación práctica que plantea que el problema no se puede entender de forma integral desde un principio, y que supone un desafío y una oportunidad para la capacidad de los miembros del equipo de desarrollo el adaptarse al cambio y encontrar soluciones a los nuevos problemas.</w:t>
+      </w:r>
+    </w:p>
+    <w:p>
+      <w:r>
+        <w:t xml:space="preserve">La elección de esta metodología responde a la necesidad de mantener una estrategia flexible e integral de desarrollo de producto, donde nuestro equipo ha funcionado </w:t>
+      </w:r>
+      <w:r>
+        <w:t>unido</w:t>
+      </w:r>
+      <w:r>
+        <w:t xml:space="preserve"> para alcanzar el objetiv</w:t>
+      </w:r>
+      <w:r>
+        <w:t>o</w:t>
+      </w:r>
+      <w:r>
+        <w:t xml:space="preserve">. Frente a las metodologías tradicionales, SCRUM nos ha permitido asumir un enfoque secuencial e iterativo del desarrollo de producto, habilitándonos para organizarnos </w:t>
+      </w:r>
+      <w:r>
+        <w:lastRenderedPageBreak/>
+        <w:t xml:space="preserve">por nosotros mismos. Esto ha fomentado una comunicación diaria (tanto </w:t>
+      </w:r>
+      <w:r>
+        <w:t xml:space="preserve">en las </w:t>
+      </w:r>
+      <w:proofErr w:type="spellStart"/>
+      <w:r>
+        <w:t>dailys</w:t>
+      </w:r>
+      <w:proofErr w:type="spellEnd"/>
+      <w:r>
+        <w:t xml:space="preserve"> como </w:t>
+      </w:r>
+      <w:r>
+        <w:t xml:space="preserve">en el grupo de </w:t>
+      </w:r>
+      <w:proofErr w:type="spellStart"/>
+      <w:r>
+        <w:t>Whatsapp</w:t>
+      </w:r>
+      <w:proofErr w:type="spellEnd"/>
+      <w:r>
+        <w:t>) entre todos los miembros.</w:t>
+      </w:r>
+    </w:p>
+    <w:p>
+      <w:r>
+        <w:t>El desarrollo del proyecto se ha llevado a cabo íntegramente a lo largo del tercer trimestre, estructurado en ciclos de trabajo cortos y regulares. Los sprints han tenido una duración de 2 semanas cada uno.</w:t>
       </w:r>
       <w:r>
         <w:t xml:space="preserve"> </w:t>
       </w:r>
+      <w:r>
+        <w:t xml:space="preserve">Al final de cada sprint, hemos realizado una </w:t>
+      </w:r>
+      <w:r>
+        <w:t>reunión</w:t>
+      </w:r>
+      <w:r>
+        <w:t xml:space="preserve"> del proyecto</w:t>
+      </w:r>
+      <w:r>
+        <w:t xml:space="preserve"> junto a la tutora</w:t>
+      </w:r>
+      <w:r>
+        <w:t xml:space="preserve"> </w:t>
+      </w:r>
+      <w:r>
+        <w:t>para evaluar</w:t>
+      </w:r>
+      <w:r>
+        <w:t xml:space="preserve"> los objetivos conseguido</w:t>
+      </w:r>
+      <w:r>
+        <w:t>s en el sprint</w:t>
+      </w:r>
+      <w:r>
+        <w:t xml:space="preserve">. En estas reuniones hemos identificado oportunidades de mejora en el Development Team (DT), puliendo nuestra comunicación y prácticas. </w:t>
+      </w:r>
+    </w:p>
+    <w:p>
+      <w:r>
+        <w:t>A continuación, se detalla lo que se pedía en cada sprint:</w:t>
+      </w:r>
+    </w:p>
+    <w:p>
+      <w:r>
+        <w:rPr>
+          <w:b/>
+          <w:bCs/>
+        </w:rPr>
+        <w:t>Sprint #1: 3 de marzo – 16 de marzo</w:t>
+      </w:r>
+    </w:p>
+    <w:p>
+      <w:pPr>
+        <w:numPr>
+          <w:ilvl w:val="0"/>
+          <w:numId w:val="4"/>
+        </w:numPr>
+      </w:pPr>
+      <w:r>
+        <w:t>[PR1] Presentación del módulo.</w:t>
+      </w:r>
+    </w:p>
+    <w:p>
+      <w:pPr>
+        <w:numPr>
+          <w:ilvl w:val="0"/>
+          <w:numId w:val="4"/>
+        </w:numPr>
+      </w:pPr>
+      <w:r>
+        <w:t>[BD1] Presentación del módulo.</w:t>
+      </w:r>
+    </w:p>
+    <w:p>
+      <w:pPr>
+        <w:numPr>
+          <w:ilvl w:val="0"/>
+          <w:numId w:val="4"/>
+        </w:numPr>
+      </w:pPr>
+      <w:r>
+        <w:t>[ED1] Presentación del módulo.</w:t>
+      </w:r>
+    </w:p>
+    <w:p>
+      <w:pPr>
+        <w:numPr>
+          <w:ilvl w:val="0"/>
+          <w:numId w:val="4"/>
+        </w:numPr>
+      </w:pPr>
+      <w:r>
+        <w:t>[PR2] Creación del proyecto. Planificación detallada de los requisitos de la aplicación.</w:t>
+      </w:r>
+    </w:p>
+    <w:p>
+      <w:pPr>
+        <w:numPr>
+          <w:ilvl w:val="0"/>
+          <w:numId w:val="4"/>
+        </w:numPr>
+      </w:pPr>
+      <w:r>
+        <w:t>[ED2] Análisis de las especificaciones del proyecto.</w:t>
+      </w:r>
+    </w:p>
+    <w:p>
+      <w:pPr>
+        <w:numPr>
+          <w:ilvl w:val="0"/>
+          <w:numId w:val="4"/>
+        </w:numPr>
+      </w:pPr>
+      <w:r>
+        <w:t>[ED3] Proyecto en GitHub. Planificación con Trello.</w:t>
+      </w:r>
+    </w:p>
+    <w:p>
+      <w:pPr>
+        <w:numPr>
+          <w:ilvl w:val="0"/>
+          <w:numId w:val="4"/>
+        </w:numPr>
+      </w:pPr>
+      <w:r>
+        <w:t>[BD2] Análisis de las especificaciones del proyecto. Diagrama E/R.</w:t>
+      </w:r>
+    </w:p>
+    <w:p>
+      <w:pPr>
+        <w:numPr>
+          <w:ilvl w:val="0"/>
+          <w:numId w:val="4"/>
+        </w:numPr>
+      </w:pPr>
+      <w:r>
+        <w:t>[ED4] Apartados de la memoria: Portada, Índice, Objetivos.</w:t>
+      </w:r>
+    </w:p>
+    <w:p>
+      <w:pPr>
+        <w:numPr>
+          <w:ilvl w:val="0"/>
+          <w:numId w:val="4"/>
+        </w:numPr>
+      </w:pPr>
+      <w:r>
+        <w:rPr>
+          <w:b/>
+          <w:bCs/>
+        </w:rPr>
+        <w:t xml:space="preserve">Sprint </w:t>
+      </w:r>
       <w:proofErr w:type="spellStart"/>
       <w:r>
-        <w:t>Burndown</w:t>
+        <w:rPr>
+          <w:b/>
+          <w:bCs/>
+        </w:rPr>
+        <w:t>Review</w:t>
       </w:r>
       <w:proofErr w:type="spellEnd"/>
       <w:r>
-        <w:t xml:space="preserve"> chart, y </w:t>
-      </w:r>
-      <w:r>
-        <w:t>añadir</w:t>
+        <w:rPr>
+          <w:b/>
+          <w:bCs/>
+        </w:rPr>
+        <w:t xml:space="preserve"> #1:</w:t>
+      </w:r>
+      <w:r>
+        <w:t xml:space="preserve"> 17 de marzo.</w:t>
+      </w:r>
+    </w:p>
+    <w:p>
+      <w:r>
+        <w:rPr>
+          <w:b/>
+          <w:bCs/>
+        </w:rPr>
+        <w:t xml:space="preserve">Sprint #2: 17 de marzo – 30 de marzo </w:t>
+      </w:r>
+    </w:p>
+    <w:p>
+      <w:pPr>
+        <w:numPr>
+          <w:ilvl w:val="0"/>
+          <w:numId w:val="5"/>
+        </w:numPr>
+      </w:pPr>
+      <w:r>
+        <w:t>[PR3] Diseño de la interfaz de las ventanas. Creación de las clases pertenecientes a la Vista.</w:t>
+      </w:r>
+    </w:p>
+    <w:p>
+      <w:pPr>
+        <w:numPr>
+          <w:ilvl w:val="0"/>
+          <w:numId w:val="5"/>
+        </w:numPr>
+      </w:pPr>
+      <w:r>
+        <w:t>[BD3] Generación del Modelo Relacional. Normalización.</w:t>
+      </w:r>
+    </w:p>
+    <w:p>
+      <w:pPr>
+        <w:numPr>
+          <w:ilvl w:val="0"/>
+          <w:numId w:val="5"/>
+        </w:numPr>
+      </w:pPr>
+      <w:r>
+        <w:t>[BD4] Creación de la BBDD: tablas, índices, etc.</w:t>
+      </w:r>
+    </w:p>
+    <w:p>
+      <w:pPr>
+        <w:numPr>
+          <w:ilvl w:val="0"/>
+          <w:numId w:val="5"/>
+        </w:numPr>
+      </w:pPr>
+      <w:r>
+        <w:t>[BD5] Inserción de los datos necesarios para la aplicación.</w:t>
+      </w:r>
+    </w:p>
+    <w:p>
+      <w:pPr>
+        <w:numPr>
+          <w:ilvl w:val="0"/>
+          <w:numId w:val="5"/>
+        </w:numPr>
+      </w:pPr>
+      <w:r>
+        <w:t>[ED5] Diagrama de casos de uso.</w:t>
+      </w:r>
+    </w:p>
+    <w:p>
+      <w:pPr>
+        <w:numPr>
+          <w:ilvl w:val="0"/>
+          <w:numId w:val="5"/>
+        </w:numPr>
+      </w:pPr>
+      <w:r>
+        <w:t>[ED6] Diseño del logo.</w:t>
+      </w:r>
+    </w:p>
+    <w:p>
+      <w:pPr>
+        <w:numPr>
+          <w:ilvl w:val="0"/>
+          <w:numId w:val="5"/>
+        </w:numPr>
+      </w:pPr>
+      <w:r>
+        <w:lastRenderedPageBreak/>
+        <w:t>[ED7] Apartados de la memoria: Tecnologías utilizadas, Metodologías, Anexo 1 – Listado de requisitos de la aplicación.</w:t>
+      </w:r>
+    </w:p>
+    <w:p>
+      <w:pPr>
+        <w:numPr>
+          <w:ilvl w:val="0"/>
+          <w:numId w:val="5"/>
+        </w:numPr>
+      </w:pPr>
+      <w:r>
+        <w:rPr>
+          <w:b/>
+          <w:bCs/>
+        </w:rPr>
+        <w:t xml:space="preserve">Sprint </w:t>
+      </w:r>
+      <w:proofErr w:type="spellStart"/>
+      <w:r>
+        <w:rPr>
+          <w:b/>
+          <w:bCs/>
+        </w:rPr>
+        <w:t>Review</w:t>
+      </w:r>
+      <w:proofErr w:type="spellEnd"/>
+      <w:r>
+        <w:rPr>
+          <w:b/>
+          <w:bCs/>
+        </w:rPr>
+        <w:t xml:space="preserve"> #2:</w:t>
+      </w:r>
+      <w:r>
+        <w:t xml:space="preserve"> 7 de abril.</w:t>
+      </w:r>
+    </w:p>
+    <w:p>
+      <w:r>
+        <w:rPr>
+          <w:b/>
+          <w:bCs/>
+        </w:rPr>
+        <w:t xml:space="preserve">Sprint #3: 7 de abril – 20 de abril </w:t>
+      </w:r>
+    </w:p>
+    <w:p>
+      <w:pPr>
+        <w:numPr>
+          <w:ilvl w:val="0"/>
+          <w:numId w:val="6"/>
+        </w:numPr>
+      </w:pPr>
+      <w:r>
+        <w:t>[ED8] Generación del diagrama de clases.</w:t>
+      </w:r>
+    </w:p>
+    <w:p>
+      <w:pPr>
+        <w:numPr>
+          <w:ilvl w:val="0"/>
+          <w:numId w:val="6"/>
+        </w:numPr>
+      </w:pPr>
+      <w:r>
+        <w:t>[PR4] A partir del diagrama de clases: Creación de las clases pertenecientes al Modelo y creación de las clases pertenecientes al Control encargadas del acceso a BBDD y del manejo de la aplicación.</w:t>
+      </w:r>
+    </w:p>
+    <w:p>
+      <w:pPr>
+        <w:numPr>
+          <w:ilvl w:val="0"/>
+          <w:numId w:val="6"/>
+        </w:numPr>
+      </w:pPr>
+      <w:r>
+        <w:t>[ED9] Apartados de la memoria: Introducción, Desarrollo.</w:t>
+      </w:r>
+    </w:p>
+    <w:p>
+      <w:pPr>
+        <w:numPr>
+          <w:ilvl w:val="0"/>
+          <w:numId w:val="6"/>
+        </w:numPr>
+      </w:pPr>
+      <w:r>
+        <w:rPr>
+          <w:b/>
+          <w:bCs/>
+        </w:rPr>
+        <w:t xml:space="preserve">Sprint </w:t>
+      </w:r>
+      <w:proofErr w:type="spellStart"/>
+      <w:r>
+        <w:rPr>
+          <w:b/>
+          <w:bCs/>
+        </w:rPr>
+        <w:t>Review</w:t>
+      </w:r>
+      <w:proofErr w:type="spellEnd"/>
+      <w:r>
+        <w:rPr>
+          <w:b/>
+          <w:bCs/>
+        </w:rPr>
+        <w:t xml:space="preserve"> #3:</w:t>
+      </w:r>
+      <w:r>
+        <w:t xml:space="preserve"> 21 de abril.</w:t>
+      </w:r>
+    </w:p>
+    <w:p>
+      <w:r>
+        <w:rPr>
+          <w:b/>
+          <w:bCs/>
+        </w:rPr>
+        <w:t xml:space="preserve">Sprint #4: 21 de abril – 4 de mayo </w:t>
+      </w:r>
+    </w:p>
+    <w:p>
+      <w:pPr>
+        <w:numPr>
+          <w:ilvl w:val="0"/>
+          <w:numId w:val="7"/>
+        </w:numPr>
+      </w:pPr>
+      <w:r>
+        <w:t>[PR5] Refinamiento del programa.</w:t>
+      </w:r>
+    </w:p>
+    <w:p>
+      <w:pPr>
+        <w:numPr>
+          <w:ilvl w:val="0"/>
+          <w:numId w:val="7"/>
+        </w:numPr>
+      </w:pPr>
+      <w:r>
+        <w:t xml:space="preserve">[ED10] Realización de pruebas </w:t>
+      </w:r>
+      <w:proofErr w:type="spellStart"/>
+      <w:r>
+        <w:t>JUnit</w:t>
+      </w:r>
+      <w:proofErr w:type="spellEnd"/>
+      <w:r>
+        <w:t xml:space="preserve">. Documentación de la aplicación </w:t>
+      </w:r>
+      <w:proofErr w:type="spellStart"/>
+      <w:r>
+        <w:t>JavaDoc</w:t>
+      </w:r>
+      <w:proofErr w:type="spellEnd"/>
+      <w:r>
+        <w:t>.</w:t>
+      </w:r>
+    </w:p>
+    <w:p>
+      <w:pPr>
+        <w:numPr>
+          <w:ilvl w:val="0"/>
+          <w:numId w:val="7"/>
+        </w:numPr>
+      </w:pPr>
+      <w:r>
+        <w:t>[PR6] [BD6] Integración de todos los elementos y solución de las incidencias de integración que se produzcan.</w:t>
+      </w:r>
+    </w:p>
+    <w:p>
+      <w:pPr>
+        <w:numPr>
+          <w:ilvl w:val="0"/>
+          <w:numId w:val="7"/>
+        </w:numPr>
+      </w:pPr>
+      <w:r>
+        <w:t xml:space="preserve">[ED11] Realización del manual de usuario en la wiki de GitHub usando </w:t>
+      </w:r>
+      <w:proofErr w:type="spellStart"/>
+      <w:r>
+        <w:t>Markdown</w:t>
+      </w:r>
+      <w:proofErr w:type="spellEnd"/>
+      <w:r>
+        <w:t>.</w:t>
+      </w:r>
+    </w:p>
+    <w:p>
+      <w:pPr>
+        <w:numPr>
+          <w:ilvl w:val="0"/>
+          <w:numId w:val="7"/>
+        </w:numPr>
+      </w:pPr>
+      <w:r>
+        <w:t>[ED12] Memoria completa, excepto el Anexo II con las capturas de la aplicación.</w:t>
+      </w:r>
+    </w:p>
+    <w:p>
+      <w:pPr>
+        <w:numPr>
+          <w:ilvl w:val="0"/>
+          <w:numId w:val="7"/>
+        </w:numPr>
+      </w:pPr>
+      <w:r>
+        <w:rPr>
+          <w:b/>
+          <w:bCs/>
+        </w:rPr>
+        <w:t xml:space="preserve">Project </w:t>
+      </w:r>
+      <w:proofErr w:type="spellStart"/>
+      <w:r>
+        <w:rPr>
+          <w:b/>
+          <w:bCs/>
+        </w:rPr>
+        <w:t>Review</w:t>
+      </w:r>
+      <w:proofErr w:type="spellEnd"/>
+      <w:r>
+        <w:rPr>
+          <w:b/>
+          <w:bCs/>
+        </w:rPr>
+        <w:t>:</w:t>
+      </w:r>
+      <w:r>
+        <w:t xml:space="preserve"> 5 de mayo.</w:t>
+      </w:r>
+    </w:p>
+    <w:p>
+      <w:r>
+        <w:t>Al terminar los sprints, se presenta el proyecto ante los profesores. En dicha presentación, se expondrá la memoria del proyecto y la aplicación realizada en eclipse.</w:t>
+      </w:r>
+    </w:p>
+    <w:p>
+      <w:r>
+        <w:t xml:space="preserve">Para planificar todas estas tareas, hemos utilizado una aplicación llamada Trello. </w:t>
+      </w:r>
+      <w:r>
+        <w:rPr>
+          <w:b/>
+          <w:bCs/>
+        </w:rPr>
+        <w:t>Trello</w:t>
+      </w:r>
+      <w:r>
+        <w:t xml:space="preserve"> es una plataforma y aplicación de software muy popular diseñada para la gestión de proyectos y la organización de tareas.</w:t>
       </w:r>
       <w:r>
         <w:t xml:space="preserve"> </w:t>
       </w:r>
       <w:r>
-        <w:t xml:space="preserve">un enlace a Git y </w:t>
-      </w:r>
-      <w:r>
-        <w:t>una imagen del tablero Trello</w:t>
-      </w:r>
-      <w:r>
-        <w:t xml:space="preserve"> al final del proyecto</w:t>
-      </w:r>
-      <w:r>
-        <w:t xml:space="preserve"> (</w:t>
-      </w:r>
-      <w:r>
-        <w:t>junto al</w:t>
-      </w:r>
-      <w:r>
-        <w:t xml:space="preserve"> enlace). Cómo se ha coordinado el equipo para poder finalizar el trabajo.</w:t>
-      </w:r>
-      <w:r>
-        <w:t xml:space="preserve"> Aportación realizada por cada estudiante.</w:t>
+        <w:t>Destaca por ser una herramienta muy visual</w:t>
+      </w:r>
+      <w:r>
+        <w:t xml:space="preserve"> y s</w:t>
+      </w:r>
+      <w:r>
+        <w:t>u objetivo es ayudarte a ti y a tu equipo a ver en qué se está trabajando, quién está haciendo qué y en qué fase se encuentra cada tarea.</w:t>
+      </w:r>
+      <w:r>
+        <w:t xml:space="preserve"> </w:t>
+      </w:r>
+    </w:p>
+    <w:p>
+      <w:r>
+        <w:t xml:space="preserve">Trello tiene muchas opciones a la hora de organizar un proyecto, pero nosotros hemos utilizado el Tablero. El tablero es una especie de pizarra en la cual se pueden añadir columnas </w:t>
+      </w:r>
+      <w:r>
+        <w:lastRenderedPageBreak/>
+        <w:t>para organizar mejor las tareas.</w:t>
+      </w:r>
+      <w:r>
+        <w:t xml:space="preserve"> Tiene bastantes opciones para modificar las tareas, como poder poner colores para poder diferenciar las tareas que son de cada asignatura o las etiquetas que sirven para ver quien esta haciendo esa tarea.</w:t>
+      </w:r>
+      <w:r>
+        <w:t xml:space="preserve"> Nosotros hemos decidido crear cinco columnas las cuales no ayudan a organizar las tareas: </w:t>
+      </w:r>
+    </w:p>
+    <w:p>
+      <w:r>
+        <w:rPr>
+          <w:b/>
+          <w:bCs/>
+        </w:rPr>
+        <w:t>PRODUCT BACKLOG:</w:t>
+      </w:r>
+      <w:r>
+        <w:t xml:space="preserve"> </w:t>
+      </w:r>
+      <w:r>
+        <w:t>Contiene todas las tareas del proyecto.</w:t>
+      </w:r>
+    </w:p>
+    <w:p>
+      <w:r>
+        <w:rPr>
+          <w:b/>
+          <w:bCs/>
+        </w:rPr>
+        <w:t>SPRINT BACKLOG:</w:t>
+      </w:r>
+      <w:r>
+        <w:t xml:space="preserve"> Contiene las tareas que </w:t>
+      </w:r>
+      <w:r>
+        <w:t>se tienen que hacer en el sprint actual.</w:t>
+      </w:r>
+    </w:p>
+    <w:p>
+      <w:r>
+        <w:rPr>
+          <w:b/>
+          <w:bCs/>
+        </w:rPr>
+        <w:t>DOING:</w:t>
+      </w:r>
+      <w:r>
+        <w:t xml:space="preserve"> Muestr</w:t>
+      </w:r>
+      <w:r>
+        <w:t>a las tareas que se están realizando y faltan por terminar</w:t>
+      </w:r>
+      <w:r>
+        <w:t>.</w:t>
+      </w:r>
+    </w:p>
+    <w:p>
+      <w:r>
+        <w:rPr>
+          <w:b/>
+          <w:bCs/>
+        </w:rPr>
+        <w:t>REVIEW:</w:t>
+      </w:r>
+      <w:r>
+        <w:t xml:space="preserve"> </w:t>
+      </w:r>
+      <w:r>
+        <w:t>Muestra las tareas que están terminadas, pero no están corregidas</w:t>
+      </w:r>
+      <w:r>
+        <w:t>.</w:t>
+      </w:r>
+    </w:p>
+    <w:p>
+      <w:r>
+        <w:rPr>
+          <w:b/>
+          <w:bCs/>
+        </w:rPr>
+        <w:t>DONE:</w:t>
+      </w:r>
+      <w:r>
+        <w:t xml:space="preserve"> </w:t>
+      </w:r>
+      <w:r>
+        <w:t>Muestra las tareas que están terminadas y corregidas.</w:t>
+      </w:r>
+    </w:p>
+    <w:p>
+      <w:r>
+        <w:t xml:space="preserve">Enlace TRELLO: </w:t>
+      </w:r>
+      <w:r>
+        <w:t>https://trello.com/b/iOwvuu9f/proyecto-integrador-daw</w:t>
       </w:r>
     </w:p>
     <w:p>
@@ -2006,6 +2586,7 @@
       </w:pPr>
       <w:bookmarkStart w:id="9" w:name="_Toc164530075"/>
       <w:r>
+        <w:lastRenderedPageBreak/>
         <w:t>Anexos</w:t>
       </w:r>
       <w:bookmarkEnd w:id="9"/>
@@ -2409,6 +2990,304 @@
 <file path=word/numbering.xml><?xml version="1.0" encoding="utf-8"?>
 <w:numbering xmlns:wpc="http://schemas.microsoft.com/office/word/2010/wordprocessingCanvas" xmlns:cx="http://schemas.microsoft.com/office/drawing/2014/chartex" xmlns:cx1="http://schemas.microsoft.com/office/drawing/2015/9/8/chartex" xmlns:cx2="http://schemas.microsoft.com/office/drawing/2015/10/21/chartex" xmlns:cx3="http://schemas.microsoft.com/office/drawing/2016/5/9/chartex" xmlns:cx4="http://schemas.microsoft.com/office/drawing/2016/5/10/chartex" xmlns:cx5="http://schemas.microsoft.com/office/drawing/2016/5/11/chartex" xmlns:cx6="http://schemas.microsoft.com/office/drawing/2016/5/12/chartex" xmlns:cx7="http://schemas.microsoft.com/office/drawing/2016/5/13/chartex" xmlns:cx8="http://schemas.microsoft.com/office/drawing/2016/5/14/chartex" xmlns:mc="http://schemas.openxmlformats.org/markup-compatibility/2006" xmlns:aink="http://schemas.microsoft.com/office/drawing/2016/ink" xmlns:am3d="http://schemas.microsoft.com/office/drawing/2017/model3d" xmlns:o="urn:schemas-microsoft-com:office:office" xmlns:oel="http://schemas.microsoft.com/office/2019/extlst" xmlns:r="http://schemas.openxmlformats.org/officeDocument/2006/relationships" xmlns:m="http://schemas.openxmlformats.org/officeDocument/2006/math" xmlns:v="urn:schemas-microsoft-com:vml" xmlns:wp14="http://schemas.microsoft.com/office/word/2010/wordprocessingDrawing" xmlns:wp="http://schemas.openxmlformats.org/drawingml/2006/wordprocessingDrawing" xmlns:w10="urn:schemas-microsoft-com:office:word" xmlns:w="http://schemas.openxmlformats.org/wordprocessingml/2006/main" xmlns:w14="http://schemas.microsoft.com/office/word/2010/wordml" xmlns:w15="http://schemas.microsoft.com/office/word/2012/wordml" xmlns:w16cex="http://schemas.microsoft.com/office/word/2018/wordml/cex" xmlns:w16cid="http://schemas.microsoft.com/office/word/2016/wordml/cid" xmlns:w16="http://schemas.microsoft.com/office/word/2018/wordml" xmlns:w16du="http://schemas.microsoft.com/office/word/2023/wordml/word16du" xmlns:w16sdtdh="http://schemas.microsoft.com/office/word/2020/wordml/sdtdatahash" xmlns:w16sdtfl="http://schemas.microsoft.com/office/word/2024/wordml/sdtformatlock" xmlns:w16se="http://schemas.microsoft.com/office/word/2015/wordml/symex" xmlns:wpg="http://schemas.microsoft.com/office/word/2010/wordprocessingGroup" xmlns:wpi="http://schemas.microsoft.com/office/word/2010/wordprocessingInk" xmlns:wne="http://schemas.microsoft.com/office/word/2006/wordml" xmlns:wps="http://schemas.microsoft.com/office/word/2010/wordprocessingShape" mc:Ignorable="w14 w15 w16se w16cid w16 w16cex w16sdtdh w16sdtfl w16du wp14">
   <w:abstractNum w:abstractNumId="0" w15:restartNumberingAfterBreak="0">
+    <w:nsid w:val="05D73372"/>
+    <w:multiLevelType w:val="multilevel"/>
+    <w:tmpl w:val="C144F42E"/>
+    <w:lvl w:ilvl="0">
+      <w:start w:val="1"/>
+      <w:numFmt w:val="bullet"/>
+      <w:lvlText w:val=""/>
+      <w:lvlJc w:val="left"/>
+      <w:pPr>
+        <w:tabs>
+          <w:tab w:val="num" w:pos="720"/>
+        </w:tabs>
+        <w:ind w:left="720" w:hanging="360"/>
+      </w:pPr>
+      <w:rPr>
+        <w:rFonts w:ascii="Symbol" w:hAnsi="Symbol" w:hint="default"/>
+        <w:sz w:val="20"/>
+      </w:rPr>
+    </w:lvl>
+    <w:lvl w:ilvl="1" w:tentative="1">
+      <w:start w:val="1"/>
+      <w:numFmt w:val="bullet"/>
+      <w:lvlText w:val="o"/>
+      <w:lvlJc w:val="left"/>
+      <w:pPr>
+        <w:tabs>
+          <w:tab w:val="num" w:pos="1440"/>
+        </w:tabs>
+        <w:ind w:left="1440" w:hanging="360"/>
+      </w:pPr>
+      <w:rPr>
+        <w:rFonts w:ascii="Courier New" w:hAnsi="Courier New" w:hint="default"/>
+        <w:sz w:val="20"/>
+      </w:rPr>
+    </w:lvl>
+    <w:lvl w:ilvl="2" w:tentative="1">
+      <w:start w:val="1"/>
+      <w:numFmt w:val="bullet"/>
+      <w:lvlText w:val=""/>
+      <w:lvlJc w:val="left"/>
+      <w:pPr>
+        <w:tabs>
+          <w:tab w:val="num" w:pos="2160"/>
+        </w:tabs>
+        <w:ind w:left="2160" w:hanging="360"/>
+      </w:pPr>
+      <w:rPr>
+        <w:rFonts w:ascii="Wingdings" w:hAnsi="Wingdings" w:hint="default"/>
+        <w:sz w:val="20"/>
+      </w:rPr>
+    </w:lvl>
+    <w:lvl w:ilvl="3" w:tentative="1">
+      <w:start w:val="1"/>
+      <w:numFmt w:val="bullet"/>
+      <w:lvlText w:val=""/>
+      <w:lvlJc w:val="left"/>
+      <w:pPr>
+        <w:tabs>
+          <w:tab w:val="num" w:pos="2880"/>
+        </w:tabs>
+        <w:ind w:left="2880" w:hanging="360"/>
+      </w:pPr>
+      <w:rPr>
+        <w:rFonts w:ascii="Wingdings" w:hAnsi="Wingdings" w:hint="default"/>
+        <w:sz w:val="20"/>
+      </w:rPr>
+    </w:lvl>
+    <w:lvl w:ilvl="4" w:tentative="1">
+      <w:start w:val="1"/>
+      <w:numFmt w:val="bullet"/>
+      <w:lvlText w:val=""/>
+      <w:lvlJc w:val="left"/>
+      <w:pPr>
+        <w:tabs>
+          <w:tab w:val="num" w:pos="3600"/>
+        </w:tabs>
+        <w:ind w:left="3600" w:hanging="360"/>
+      </w:pPr>
+      <w:rPr>
+        <w:rFonts w:ascii="Wingdings" w:hAnsi="Wingdings" w:hint="default"/>
+        <w:sz w:val="20"/>
+      </w:rPr>
+    </w:lvl>
+    <w:lvl w:ilvl="5" w:tentative="1">
+      <w:start w:val="1"/>
+      <w:numFmt w:val="bullet"/>
+      <w:lvlText w:val=""/>
+      <w:lvlJc w:val="left"/>
+      <w:pPr>
+        <w:tabs>
+          <w:tab w:val="num" w:pos="4320"/>
+        </w:tabs>
+        <w:ind w:left="4320" w:hanging="360"/>
+      </w:pPr>
+      <w:rPr>
+        <w:rFonts w:ascii="Wingdings" w:hAnsi="Wingdings" w:hint="default"/>
+        <w:sz w:val="20"/>
+      </w:rPr>
+    </w:lvl>
+    <w:lvl w:ilvl="6" w:tentative="1">
+      <w:start w:val="1"/>
+      <w:numFmt w:val="bullet"/>
+      <w:lvlText w:val=""/>
+      <w:lvlJc w:val="left"/>
+      <w:pPr>
+        <w:tabs>
+          <w:tab w:val="num" w:pos="5040"/>
+        </w:tabs>
+        <w:ind w:left="5040" w:hanging="360"/>
+      </w:pPr>
+      <w:rPr>
+        <w:rFonts w:ascii="Wingdings" w:hAnsi="Wingdings" w:hint="default"/>
+        <w:sz w:val="20"/>
+      </w:rPr>
+    </w:lvl>
+    <w:lvl w:ilvl="7" w:tentative="1">
+      <w:start w:val="1"/>
+      <w:numFmt w:val="bullet"/>
+      <w:lvlText w:val=""/>
+      <w:lvlJc w:val="left"/>
+      <w:pPr>
+        <w:tabs>
+          <w:tab w:val="num" w:pos="5760"/>
+        </w:tabs>
+        <w:ind w:left="5760" w:hanging="360"/>
+      </w:pPr>
+      <w:rPr>
+        <w:rFonts w:ascii="Wingdings" w:hAnsi="Wingdings" w:hint="default"/>
+        <w:sz w:val="20"/>
+      </w:rPr>
+    </w:lvl>
+    <w:lvl w:ilvl="8" w:tentative="1">
+      <w:start w:val="1"/>
+      <w:numFmt w:val="bullet"/>
+      <w:lvlText w:val=""/>
+      <w:lvlJc w:val="left"/>
+      <w:pPr>
+        <w:tabs>
+          <w:tab w:val="num" w:pos="6480"/>
+        </w:tabs>
+        <w:ind w:left="6480" w:hanging="360"/>
+      </w:pPr>
+      <w:rPr>
+        <w:rFonts w:ascii="Wingdings" w:hAnsi="Wingdings" w:hint="default"/>
+        <w:sz w:val="20"/>
+      </w:rPr>
+    </w:lvl>
+  </w:abstractNum>
+  <w:abstractNum w:abstractNumId="1" w15:restartNumberingAfterBreak="0">
+    <w:nsid w:val="10AF43C6"/>
+    <w:multiLevelType w:val="multilevel"/>
+    <w:tmpl w:val="94A61654"/>
+    <w:lvl w:ilvl="0">
+      <w:start w:val="1"/>
+      <w:numFmt w:val="bullet"/>
+      <w:lvlText w:val=""/>
+      <w:lvlJc w:val="left"/>
+      <w:pPr>
+        <w:tabs>
+          <w:tab w:val="num" w:pos="720"/>
+        </w:tabs>
+        <w:ind w:left="720" w:hanging="360"/>
+      </w:pPr>
+      <w:rPr>
+        <w:rFonts w:ascii="Symbol" w:hAnsi="Symbol" w:hint="default"/>
+        <w:sz w:val="20"/>
+      </w:rPr>
+    </w:lvl>
+    <w:lvl w:ilvl="1" w:tentative="1">
+      <w:start w:val="1"/>
+      <w:numFmt w:val="bullet"/>
+      <w:lvlText w:val="o"/>
+      <w:lvlJc w:val="left"/>
+      <w:pPr>
+        <w:tabs>
+          <w:tab w:val="num" w:pos="1440"/>
+        </w:tabs>
+        <w:ind w:left="1440" w:hanging="360"/>
+      </w:pPr>
+      <w:rPr>
+        <w:rFonts w:ascii="Courier New" w:hAnsi="Courier New" w:hint="default"/>
+        <w:sz w:val="20"/>
+      </w:rPr>
+    </w:lvl>
+    <w:lvl w:ilvl="2" w:tentative="1">
+      <w:start w:val="1"/>
+      <w:numFmt w:val="bullet"/>
+      <w:lvlText w:val=""/>
+      <w:lvlJc w:val="left"/>
+      <w:pPr>
+        <w:tabs>
+          <w:tab w:val="num" w:pos="2160"/>
+        </w:tabs>
+        <w:ind w:left="2160" w:hanging="360"/>
+      </w:pPr>
+      <w:rPr>
+        <w:rFonts w:ascii="Wingdings" w:hAnsi="Wingdings" w:hint="default"/>
+        <w:sz w:val="20"/>
+      </w:rPr>
+    </w:lvl>
+    <w:lvl w:ilvl="3" w:tentative="1">
+      <w:start w:val="1"/>
+      <w:numFmt w:val="bullet"/>
+      <w:lvlText w:val=""/>
+      <w:lvlJc w:val="left"/>
+      <w:pPr>
+        <w:tabs>
+          <w:tab w:val="num" w:pos="2880"/>
+        </w:tabs>
+        <w:ind w:left="2880" w:hanging="360"/>
+      </w:pPr>
+      <w:rPr>
+        <w:rFonts w:ascii="Wingdings" w:hAnsi="Wingdings" w:hint="default"/>
+        <w:sz w:val="20"/>
+      </w:rPr>
+    </w:lvl>
+    <w:lvl w:ilvl="4" w:tentative="1">
+      <w:start w:val="1"/>
+      <w:numFmt w:val="bullet"/>
+      <w:lvlText w:val=""/>
+      <w:lvlJc w:val="left"/>
+      <w:pPr>
+        <w:tabs>
+          <w:tab w:val="num" w:pos="3600"/>
+        </w:tabs>
+        <w:ind w:left="3600" w:hanging="360"/>
+      </w:pPr>
+      <w:rPr>
+        <w:rFonts w:ascii="Wingdings" w:hAnsi="Wingdings" w:hint="default"/>
+        <w:sz w:val="20"/>
+      </w:rPr>
+    </w:lvl>
+    <w:lvl w:ilvl="5" w:tentative="1">
+      <w:start w:val="1"/>
+      <w:numFmt w:val="bullet"/>
+      <w:lvlText w:val=""/>
+      <w:lvlJc w:val="left"/>
+      <w:pPr>
+        <w:tabs>
+          <w:tab w:val="num" w:pos="4320"/>
+        </w:tabs>
+        <w:ind w:left="4320" w:hanging="360"/>
+      </w:pPr>
+      <w:rPr>
+        <w:rFonts w:ascii="Wingdings" w:hAnsi="Wingdings" w:hint="default"/>
+        <w:sz w:val="20"/>
+      </w:rPr>
+    </w:lvl>
+    <w:lvl w:ilvl="6" w:tentative="1">
+      <w:start w:val="1"/>
+      <w:numFmt w:val="bullet"/>
+      <w:lvlText w:val=""/>
+      <w:lvlJc w:val="left"/>
+      <w:pPr>
+        <w:tabs>
+          <w:tab w:val="num" w:pos="5040"/>
+        </w:tabs>
+        <w:ind w:left="5040" w:hanging="360"/>
+      </w:pPr>
+      <w:rPr>
+        <w:rFonts w:ascii="Wingdings" w:hAnsi="Wingdings" w:hint="default"/>
+        <w:sz w:val="20"/>
+      </w:rPr>
+    </w:lvl>
+    <w:lvl w:ilvl="7" w:tentative="1">
+      <w:start w:val="1"/>
+      <w:numFmt w:val="bullet"/>
+      <w:lvlText w:val=""/>
+      <w:lvlJc w:val="left"/>
+      <w:pPr>
+        <w:tabs>
+          <w:tab w:val="num" w:pos="5760"/>
+        </w:tabs>
+        <w:ind w:left="5760" w:hanging="360"/>
+      </w:pPr>
+      <w:rPr>
+        <w:rFonts w:ascii="Wingdings" w:hAnsi="Wingdings" w:hint="default"/>
+        <w:sz w:val="20"/>
+      </w:rPr>
+    </w:lvl>
+    <w:lvl w:ilvl="8" w:tentative="1">
+      <w:start w:val="1"/>
+      <w:numFmt w:val="bullet"/>
+      <w:lvlText w:val=""/>
+      <w:lvlJc w:val="left"/>
+      <w:pPr>
+        <w:tabs>
+          <w:tab w:val="num" w:pos="6480"/>
+        </w:tabs>
+        <w:ind w:left="6480" w:hanging="360"/>
+      </w:pPr>
+      <w:rPr>
+        <w:rFonts w:ascii="Wingdings" w:hAnsi="Wingdings" w:hint="default"/>
+        <w:sz w:val="20"/>
+      </w:rPr>
+    </w:lvl>
+  </w:abstractNum>
+  <w:abstractNum w:abstractNumId="2" w15:restartNumberingAfterBreak="0">
     <w:nsid w:val="169346AC"/>
     <w:multiLevelType w:val="multilevel"/>
     <w:tmpl w:val="C6789AC4"/>
@@ -2529,7 +3408,305 @@
       </w:rPr>
     </w:lvl>
   </w:abstractNum>
-  <w:abstractNum w:abstractNumId="1" w15:restartNumberingAfterBreak="0">
+  <w:abstractNum w:abstractNumId="3" w15:restartNumberingAfterBreak="0">
+    <w:nsid w:val="47D9143C"/>
+    <w:multiLevelType w:val="multilevel"/>
+    <w:tmpl w:val="F404CCE2"/>
+    <w:lvl w:ilvl="0">
+      <w:start w:val="1"/>
+      <w:numFmt w:val="bullet"/>
+      <w:lvlText w:val=""/>
+      <w:lvlJc w:val="left"/>
+      <w:pPr>
+        <w:tabs>
+          <w:tab w:val="num" w:pos="720"/>
+        </w:tabs>
+        <w:ind w:left="720" w:hanging="360"/>
+      </w:pPr>
+      <w:rPr>
+        <w:rFonts w:ascii="Symbol" w:hAnsi="Symbol" w:hint="default"/>
+        <w:sz w:val="20"/>
+      </w:rPr>
+    </w:lvl>
+    <w:lvl w:ilvl="1" w:tentative="1">
+      <w:start w:val="1"/>
+      <w:numFmt w:val="bullet"/>
+      <w:lvlText w:val="o"/>
+      <w:lvlJc w:val="left"/>
+      <w:pPr>
+        <w:tabs>
+          <w:tab w:val="num" w:pos="1440"/>
+        </w:tabs>
+        <w:ind w:left="1440" w:hanging="360"/>
+      </w:pPr>
+      <w:rPr>
+        <w:rFonts w:ascii="Courier New" w:hAnsi="Courier New" w:hint="default"/>
+        <w:sz w:val="20"/>
+      </w:rPr>
+    </w:lvl>
+    <w:lvl w:ilvl="2" w:tentative="1">
+      <w:start w:val="1"/>
+      <w:numFmt w:val="bullet"/>
+      <w:lvlText w:val=""/>
+      <w:lvlJc w:val="left"/>
+      <w:pPr>
+        <w:tabs>
+          <w:tab w:val="num" w:pos="2160"/>
+        </w:tabs>
+        <w:ind w:left="2160" w:hanging="360"/>
+      </w:pPr>
+      <w:rPr>
+        <w:rFonts w:ascii="Wingdings" w:hAnsi="Wingdings" w:hint="default"/>
+        <w:sz w:val="20"/>
+      </w:rPr>
+    </w:lvl>
+    <w:lvl w:ilvl="3" w:tentative="1">
+      <w:start w:val="1"/>
+      <w:numFmt w:val="bullet"/>
+      <w:lvlText w:val=""/>
+      <w:lvlJc w:val="left"/>
+      <w:pPr>
+        <w:tabs>
+          <w:tab w:val="num" w:pos="2880"/>
+        </w:tabs>
+        <w:ind w:left="2880" w:hanging="360"/>
+      </w:pPr>
+      <w:rPr>
+        <w:rFonts w:ascii="Wingdings" w:hAnsi="Wingdings" w:hint="default"/>
+        <w:sz w:val="20"/>
+      </w:rPr>
+    </w:lvl>
+    <w:lvl w:ilvl="4" w:tentative="1">
+      <w:start w:val="1"/>
+      <w:numFmt w:val="bullet"/>
+      <w:lvlText w:val=""/>
+      <w:lvlJc w:val="left"/>
+      <w:pPr>
+        <w:tabs>
+          <w:tab w:val="num" w:pos="3600"/>
+        </w:tabs>
+        <w:ind w:left="3600" w:hanging="360"/>
+      </w:pPr>
+      <w:rPr>
+        <w:rFonts w:ascii="Wingdings" w:hAnsi="Wingdings" w:hint="default"/>
+        <w:sz w:val="20"/>
+      </w:rPr>
+    </w:lvl>
+    <w:lvl w:ilvl="5" w:tentative="1">
+      <w:start w:val="1"/>
+      <w:numFmt w:val="bullet"/>
+      <w:lvlText w:val=""/>
+      <w:lvlJc w:val="left"/>
+      <w:pPr>
+        <w:tabs>
+          <w:tab w:val="num" w:pos="4320"/>
+        </w:tabs>
+        <w:ind w:left="4320" w:hanging="360"/>
+      </w:pPr>
+      <w:rPr>
+        <w:rFonts w:ascii="Wingdings" w:hAnsi="Wingdings" w:hint="default"/>
+        <w:sz w:val="20"/>
+      </w:rPr>
+    </w:lvl>
+    <w:lvl w:ilvl="6" w:tentative="1">
+      <w:start w:val="1"/>
+      <w:numFmt w:val="bullet"/>
+      <w:lvlText w:val=""/>
+      <w:lvlJc w:val="left"/>
+      <w:pPr>
+        <w:tabs>
+          <w:tab w:val="num" w:pos="5040"/>
+        </w:tabs>
+        <w:ind w:left="5040" w:hanging="360"/>
+      </w:pPr>
+      <w:rPr>
+        <w:rFonts w:ascii="Wingdings" w:hAnsi="Wingdings" w:hint="default"/>
+        <w:sz w:val="20"/>
+      </w:rPr>
+    </w:lvl>
+    <w:lvl w:ilvl="7" w:tentative="1">
+      <w:start w:val="1"/>
+      <w:numFmt w:val="bullet"/>
+      <w:lvlText w:val=""/>
+      <w:lvlJc w:val="left"/>
+      <w:pPr>
+        <w:tabs>
+          <w:tab w:val="num" w:pos="5760"/>
+        </w:tabs>
+        <w:ind w:left="5760" w:hanging="360"/>
+      </w:pPr>
+      <w:rPr>
+        <w:rFonts w:ascii="Wingdings" w:hAnsi="Wingdings" w:hint="default"/>
+        <w:sz w:val="20"/>
+      </w:rPr>
+    </w:lvl>
+    <w:lvl w:ilvl="8" w:tentative="1">
+      <w:start w:val="1"/>
+      <w:numFmt w:val="bullet"/>
+      <w:lvlText w:val=""/>
+      <w:lvlJc w:val="left"/>
+      <w:pPr>
+        <w:tabs>
+          <w:tab w:val="num" w:pos="6480"/>
+        </w:tabs>
+        <w:ind w:left="6480" w:hanging="360"/>
+      </w:pPr>
+      <w:rPr>
+        <w:rFonts w:ascii="Wingdings" w:hAnsi="Wingdings" w:hint="default"/>
+        <w:sz w:val="20"/>
+      </w:rPr>
+    </w:lvl>
+  </w:abstractNum>
+  <w:abstractNum w:abstractNumId="4" w15:restartNumberingAfterBreak="0">
+    <w:nsid w:val="51CA6E4A"/>
+    <w:multiLevelType w:val="multilevel"/>
+    <w:tmpl w:val="A3C2F2F4"/>
+    <w:lvl w:ilvl="0">
+      <w:start w:val="1"/>
+      <w:numFmt w:val="bullet"/>
+      <w:lvlText w:val=""/>
+      <w:lvlJc w:val="left"/>
+      <w:pPr>
+        <w:tabs>
+          <w:tab w:val="num" w:pos="720"/>
+        </w:tabs>
+        <w:ind w:left="720" w:hanging="360"/>
+      </w:pPr>
+      <w:rPr>
+        <w:rFonts w:ascii="Symbol" w:hAnsi="Symbol" w:hint="default"/>
+        <w:sz w:val="20"/>
+      </w:rPr>
+    </w:lvl>
+    <w:lvl w:ilvl="1" w:tentative="1">
+      <w:start w:val="1"/>
+      <w:numFmt w:val="bullet"/>
+      <w:lvlText w:val="o"/>
+      <w:lvlJc w:val="left"/>
+      <w:pPr>
+        <w:tabs>
+          <w:tab w:val="num" w:pos="1440"/>
+        </w:tabs>
+        <w:ind w:left="1440" w:hanging="360"/>
+      </w:pPr>
+      <w:rPr>
+        <w:rFonts w:ascii="Courier New" w:hAnsi="Courier New" w:hint="default"/>
+        <w:sz w:val="20"/>
+      </w:rPr>
+    </w:lvl>
+    <w:lvl w:ilvl="2" w:tentative="1">
+      <w:start w:val="1"/>
+      <w:numFmt w:val="bullet"/>
+      <w:lvlText w:val=""/>
+      <w:lvlJc w:val="left"/>
+      <w:pPr>
+        <w:tabs>
+          <w:tab w:val="num" w:pos="2160"/>
+        </w:tabs>
+        <w:ind w:left="2160" w:hanging="360"/>
+      </w:pPr>
+      <w:rPr>
+        <w:rFonts w:ascii="Wingdings" w:hAnsi="Wingdings" w:hint="default"/>
+        <w:sz w:val="20"/>
+      </w:rPr>
+    </w:lvl>
+    <w:lvl w:ilvl="3" w:tentative="1">
+      <w:start w:val="1"/>
+      <w:numFmt w:val="bullet"/>
+      <w:lvlText w:val=""/>
+      <w:lvlJc w:val="left"/>
+      <w:pPr>
+        <w:tabs>
+          <w:tab w:val="num" w:pos="2880"/>
+        </w:tabs>
+        <w:ind w:left="2880" w:hanging="360"/>
+      </w:pPr>
+      <w:rPr>
+        <w:rFonts w:ascii="Wingdings" w:hAnsi="Wingdings" w:hint="default"/>
+        <w:sz w:val="20"/>
+      </w:rPr>
+    </w:lvl>
+    <w:lvl w:ilvl="4" w:tentative="1">
+      <w:start w:val="1"/>
+      <w:numFmt w:val="bullet"/>
+      <w:lvlText w:val=""/>
+      <w:lvlJc w:val="left"/>
+      <w:pPr>
+        <w:tabs>
+          <w:tab w:val="num" w:pos="3600"/>
+        </w:tabs>
+        <w:ind w:left="3600" w:hanging="360"/>
+      </w:pPr>
+      <w:rPr>
+        <w:rFonts w:ascii="Wingdings" w:hAnsi="Wingdings" w:hint="default"/>
+        <w:sz w:val="20"/>
+      </w:rPr>
+    </w:lvl>
+    <w:lvl w:ilvl="5" w:tentative="1">
+      <w:start w:val="1"/>
+      <w:numFmt w:val="bullet"/>
+      <w:lvlText w:val=""/>
+      <w:lvlJc w:val="left"/>
+      <w:pPr>
+        <w:tabs>
+          <w:tab w:val="num" w:pos="4320"/>
+        </w:tabs>
+        <w:ind w:left="4320" w:hanging="360"/>
+      </w:pPr>
+      <w:rPr>
+        <w:rFonts w:ascii="Wingdings" w:hAnsi="Wingdings" w:hint="default"/>
+        <w:sz w:val="20"/>
+      </w:rPr>
+    </w:lvl>
+    <w:lvl w:ilvl="6" w:tentative="1">
+      <w:start w:val="1"/>
+      <w:numFmt w:val="bullet"/>
+      <w:lvlText w:val=""/>
+      <w:lvlJc w:val="left"/>
+      <w:pPr>
+        <w:tabs>
+          <w:tab w:val="num" w:pos="5040"/>
+        </w:tabs>
+        <w:ind w:left="5040" w:hanging="360"/>
+      </w:pPr>
+      <w:rPr>
+        <w:rFonts w:ascii="Wingdings" w:hAnsi="Wingdings" w:hint="default"/>
+        <w:sz w:val="20"/>
+      </w:rPr>
+    </w:lvl>
+    <w:lvl w:ilvl="7" w:tentative="1">
+      <w:start w:val="1"/>
+      <w:numFmt w:val="bullet"/>
+      <w:lvlText w:val=""/>
+      <w:lvlJc w:val="left"/>
+      <w:pPr>
+        <w:tabs>
+          <w:tab w:val="num" w:pos="5760"/>
+        </w:tabs>
+        <w:ind w:left="5760" w:hanging="360"/>
+      </w:pPr>
+      <w:rPr>
+        <w:rFonts w:ascii="Wingdings" w:hAnsi="Wingdings" w:hint="default"/>
+        <w:sz w:val="20"/>
+      </w:rPr>
+    </w:lvl>
+    <w:lvl w:ilvl="8" w:tentative="1">
+      <w:start w:val="1"/>
+      <w:numFmt w:val="bullet"/>
+      <w:lvlText w:val=""/>
+      <w:lvlJc w:val="left"/>
+      <w:pPr>
+        <w:tabs>
+          <w:tab w:val="num" w:pos="6480"/>
+        </w:tabs>
+        <w:ind w:left="6480" w:hanging="360"/>
+      </w:pPr>
+      <w:rPr>
+        <w:rFonts w:ascii="Wingdings" w:hAnsi="Wingdings" w:hint="default"/>
+        <w:sz w:val="20"/>
+      </w:rPr>
+    </w:lvl>
+  </w:abstractNum>
+  <w:abstractNum w:abstractNumId="5" w15:restartNumberingAfterBreak="0">
     <w:nsid w:val="6A017403"/>
     <w:multiLevelType w:val="multilevel"/>
     <w:tmpl w:val="C6789AC4"/>
@@ -2650,10 +3827,174 @@
       </w:rPr>
     </w:lvl>
   </w:abstractNum>
+  <w:abstractNum w:abstractNumId="6" w15:restartNumberingAfterBreak="0">
+    <w:nsid w:val="6DEA0B35"/>
+    <w:multiLevelType w:val="multilevel"/>
+    <w:tmpl w:val="39224976"/>
+    <w:lvl w:ilvl="0">
+      <w:start w:val="1"/>
+      <w:numFmt w:val="bullet"/>
+      <w:lvlText w:val=""/>
+      <w:lvlJc w:val="left"/>
+      <w:pPr>
+        <w:tabs>
+          <w:tab w:val="num" w:pos="720"/>
+        </w:tabs>
+        <w:ind w:left="720" w:hanging="360"/>
+      </w:pPr>
+      <w:rPr>
+        <w:rFonts w:ascii="Symbol" w:hAnsi="Symbol" w:hint="default"/>
+        <w:sz w:val="20"/>
+      </w:rPr>
+    </w:lvl>
+    <w:lvl w:ilvl="1" w:tentative="1">
+      <w:start w:val="1"/>
+      <w:numFmt w:val="bullet"/>
+      <w:lvlText w:val="o"/>
+      <w:lvlJc w:val="left"/>
+      <w:pPr>
+        <w:tabs>
+          <w:tab w:val="num" w:pos="1440"/>
+        </w:tabs>
+        <w:ind w:left="1440" w:hanging="360"/>
+      </w:pPr>
+      <w:rPr>
+        <w:rFonts w:ascii="Courier New" w:hAnsi="Courier New" w:hint="default"/>
+        <w:sz w:val="20"/>
+      </w:rPr>
+    </w:lvl>
+    <w:lvl w:ilvl="2" w:tentative="1">
+      <w:start w:val="1"/>
+      <w:numFmt w:val="bullet"/>
+      <w:lvlText w:val=""/>
+      <w:lvlJc w:val="left"/>
+      <w:pPr>
+        <w:tabs>
+          <w:tab w:val="num" w:pos="2160"/>
+        </w:tabs>
+        <w:ind w:left="2160" w:hanging="360"/>
+      </w:pPr>
+      <w:rPr>
+        <w:rFonts w:ascii="Wingdings" w:hAnsi="Wingdings" w:hint="default"/>
+        <w:sz w:val="20"/>
+      </w:rPr>
+    </w:lvl>
+    <w:lvl w:ilvl="3" w:tentative="1">
+      <w:start w:val="1"/>
+      <w:numFmt w:val="bullet"/>
+      <w:lvlText w:val=""/>
+      <w:lvlJc w:val="left"/>
+      <w:pPr>
+        <w:tabs>
+          <w:tab w:val="num" w:pos="2880"/>
+        </w:tabs>
+        <w:ind w:left="2880" w:hanging="360"/>
+      </w:pPr>
+      <w:rPr>
+        <w:rFonts w:ascii="Wingdings" w:hAnsi="Wingdings" w:hint="default"/>
+        <w:sz w:val="20"/>
+      </w:rPr>
+    </w:lvl>
+    <w:lvl w:ilvl="4" w:tentative="1">
+      <w:start w:val="1"/>
+      <w:numFmt w:val="bullet"/>
+      <w:lvlText w:val=""/>
+      <w:lvlJc w:val="left"/>
+      <w:pPr>
+        <w:tabs>
+          <w:tab w:val="num" w:pos="3600"/>
+        </w:tabs>
+        <w:ind w:left="3600" w:hanging="360"/>
+      </w:pPr>
+      <w:rPr>
+        <w:rFonts w:ascii="Wingdings" w:hAnsi="Wingdings" w:hint="default"/>
+        <w:sz w:val="20"/>
+      </w:rPr>
+    </w:lvl>
+    <w:lvl w:ilvl="5" w:tentative="1">
+      <w:start w:val="1"/>
+      <w:numFmt w:val="bullet"/>
+      <w:lvlText w:val=""/>
+      <w:lvlJc w:val="left"/>
+      <w:pPr>
+        <w:tabs>
+          <w:tab w:val="num" w:pos="4320"/>
+        </w:tabs>
+        <w:ind w:left="4320" w:hanging="360"/>
+      </w:pPr>
+      <w:rPr>
+        <w:rFonts w:ascii="Wingdings" w:hAnsi="Wingdings" w:hint="default"/>
+        <w:sz w:val="20"/>
+      </w:rPr>
+    </w:lvl>
+    <w:lvl w:ilvl="6" w:tentative="1">
+      <w:start w:val="1"/>
+      <w:numFmt w:val="bullet"/>
+      <w:lvlText w:val=""/>
+      <w:lvlJc w:val="left"/>
+      <w:pPr>
+        <w:tabs>
+          <w:tab w:val="num" w:pos="5040"/>
+        </w:tabs>
+        <w:ind w:left="5040" w:hanging="360"/>
+      </w:pPr>
+      <w:rPr>
+        <w:rFonts w:ascii="Wingdings" w:hAnsi="Wingdings" w:hint="default"/>
+        <w:sz w:val="20"/>
+      </w:rPr>
+    </w:lvl>
+    <w:lvl w:ilvl="7" w:tentative="1">
+      <w:start w:val="1"/>
+      <w:numFmt w:val="bullet"/>
+      <w:lvlText w:val=""/>
+      <w:lvlJc w:val="left"/>
+      <w:pPr>
+        <w:tabs>
+          <w:tab w:val="num" w:pos="5760"/>
+        </w:tabs>
+        <w:ind w:left="5760" w:hanging="360"/>
+      </w:pPr>
+      <w:rPr>
+        <w:rFonts w:ascii="Wingdings" w:hAnsi="Wingdings" w:hint="default"/>
+        <w:sz w:val="20"/>
+      </w:rPr>
+    </w:lvl>
+    <w:lvl w:ilvl="8" w:tentative="1">
+      <w:start w:val="1"/>
+      <w:numFmt w:val="bullet"/>
+      <w:lvlText w:val=""/>
+      <w:lvlJc w:val="left"/>
+      <w:pPr>
+        <w:tabs>
+          <w:tab w:val="num" w:pos="6480"/>
+        </w:tabs>
+        <w:ind w:left="6480" w:hanging="360"/>
+      </w:pPr>
+      <w:rPr>
+        <w:rFonts w:ascii="Wingdings" w:hAnsi="Wingdings" w:hint="default"/>
+        <w:sz w:val="20"/>
+      </w:rPr>
+    </w:lvl>
+  </w:abstractNum>
   <w:num w:numId="1" w16cid:durableId="863713764">
+    <w:abstractNumId w:val="2"/>
+  </w:num>
+  <w:num w:numId="2" w16cid:durableId="1628002420">
+    <w:abstractNumId w:val="5"/>
+  </w:num>
+  <w:num w:numId="3" w16cid:durableId="998537203">
+    <w:abstractNumId w:val="3"/>
+  </w:num>
+  <w:num w:numId="4" w16cid:durableId="1445344541">
+    <w:abstractNumId w:val="6"/>
+  </w:num>
+  <w:num w:numId="5" w16cid:durableId="319769107">
+    <w:abstractNumId w:val="4"/>
+  </w:num>
+  <w:num w:numId="6" w16cid:durableId="544103486">
     <w:abstractNumId w:val="0"/>
   </w:num>
-  <w:num w:numId="2" w16cid:durableId="1628002420">
+  <w:num w:numId="7" w16cid:durableId="2112159821">
     <w:abstractNumId w:val="1"/>
   </w:num>
 </w:numbering>
@@ -3094,7 +4435,6 @@
   <w:style w:type="character" w:default="1" w:styleId="Fuentedeprrafopredeter">
     <w:name w:val="Default Paragraph Font"/>
     <w:uiPriority w:val="1"/>
-    <w:semiHidden/>
     <w:unhideWhenUsed/>
   </w:style>
   <w:style w:type="table" w:default="1" w:styleId="Tablanormal">
@@ -3243,6 +4583,18 @@
     <w:pPr>
       <w:spacing w:after="100"/>
     </w:pPr>
+  </w:style>
+  <w:style w:type="character" w:styleId="Mencinsinresolver">
+    <w:name w:val="Unresolved Mention"/>
+    <w:basedOn w:val="Fuentedeprrafopredeter"/>
+    <w:uiPriority w:val="99"/>
+    <w:semiHidden/>
+    <w:unhideWhenUsed/>
+    <w:rsid w:val="0002717E"/>
+    <w:rPr>
+      <w:color w:val="605E5C"/>
+      <w:shd w:val="clear" w:color="auto" w:fill="E1DFDD"/>
+    </w:rPr>
   </w:style>
 </w:styles>
 </file>
@@ -3509,15 +4861,6 @@
 </file>
 
 <file path=customXml/item1.xml><?xml version="1.0" encoding="utf-8"?>
-<?mso-contentType ?>
-<FormTemplates xmlns="http://schemas.microsoft.com/sharepoint/v3/contenttype/forms">
-  <Display>DocumentLibraryForm</Display>
-  <Edit>DocumentLibraryForm</Edit>
-  <New>DocumentLibraryForm</New>
-</FormTemplates>
-</file>
-
-<file path=customXml/item2.xml><?xml version="1.0" encoding="utf-8"?>
 <ct:contentTypeSchema xmlns:ct="http://schemas.microsoft.com/office/2006/metadata/contentType" xmlns:ma="http://schemas.microsoft.com/office/2006/metadata/properties/metaAttributes" ct:_="" ma:_="" ma:contentTypeName="Document" ma:contentTypeID="0x0101003771EF6F4DD57D4BB341978B0C699B9F" ma:contentTypeVersion="5" ma:contentTypeDescription="Create a new document." ma:contentTypeScope="" ma:versionID="06868b8f65cc4d54ae1303708550a388">
   <xsd:schema xmlns:xsd="http://www.w3.org/2001/XMLSchema" xmlns:xs="http://www.w3.org/2001/XMLSchema" xmlns:p="http://schemas.microsoft.com/office/2006/metadata/properties" xmlns:ns3="fd8a73f8-f815-4fba-aad8-7d5d42663f91" targetNamespace="http://schemas.microsoft.com/office/2006/metadata/properties" ma:root="true" ma:fieldsID="d2cd9717685c60f99e0cb70942fdffc5" ns3:_="">
     <xsd:import namespace="fd8a73f8-f815-4fba-aad8-7d5d42663f91"/>
@@ -3667,11 +5010,16 @@
 </ct:contentTypeSchema>
 </file>
 
-<file path=customXml/item3.xml><?xml version="1.0" encoding="utf-8"?>
-<b:Sources xmlns:b="http://schemas.openxmlformats.org/officeDocument/2006/bibliography" xmlns="http://schemas.openxmlformats.org/officeDocument/2006/bibliography" SelectedStyle="/APASixthEditionOfficeOnline.xsl" StyleName="APA" Version="6"/>
+<file path=customXml/item2.xml><?xml version="1.0" encoding="utf-8"?>
+<?mso-contentType ?>
+<FormTemplates xmlns="http://schemas.microsoft.com/sharepoint/v3/contenttype/forms">
+  <Display>DocumentLibraryForm</Display>
+  <Edit>DocumentLibraryForm</Edit>
+  <New>DocumentLibraryForm</New>
+</FormTemplates>
 </file>
 
-<file path=customXml/item4.xml><?xml version="1.0" encoding="utf-8"?>
+<file path=customXml/item3.xml><?xml version="1.0" encoding="utf-8"?>
 <p:properties xmlns:p="http://schemas.microsoft.com/office/2006/metadata/properties" xmlns:xsi="http://www.w3.org/2001/XMLSchema-instance" xmlns:pc="http://schemas.microsoft.com/office/infopath/2007/PartnerControls">
   <documentManagement>
     <_activity xmlns="fd8a73f8-f815-4fba-aad8-7d5d42663f91" xsi:nil="true"/>
@@ -3679,15 +5027,11 @@
 </p:properties>
 </file>
 
-<file path=customXml/itemProps1.xml><?xml version="1.0" encoding="utf-8"?>
-<ds:datastoreItem xmlns:ds="http://schemas.openxmlformats.org/officeDocument/2006/customXml" ds:itemID="{98966CDD-637B-4D63-95C4-03CFA3699F1F}">
-  <ds:schemaRefs>
-    <ds:schemaRef ds:uri="http://schemas.microsoft.com/sharepoint/v3/contenttype/forms"/>
-  </ds:schemaRefs>
-</ds:datastoreItem>
+<file path=customXml/item4.xml><?xml version="1.0" encoding="utf-8"?>
+<b:Sources xmlns:b="http://schemas.openxmlformats.org/officeDocument/2006/bibliography" xmlns="http://schemas.openxmlformats.org/officeDocument/2006/bibliography" SelectedStyle="/APASixthEditionOfficeOnline.xsl" StyleName="APA" Version="6"/>
 </file>
 
-<file path=customXml/itemProps2.xml><?xml version="1.0" encoding="utf-8"?>
+<file path=customXml/itemProps1.xml><?xml version="1.0" encoding="utf-8"?>
 <ds:datastoreItem xmlns:ds="http://schemas.openxmlformats.org/officeDocument/2006/customXml" ds:itemID="{31BF955A-D32C-45E3-B821-FAF3A835F9A4}">
   <ds:schemaRefs>
     <ds:schemaRef ds:uri="http://schemas.microsoft.com/office/2006/metadata/contentType"/>
@@ -3705,15 +5049,15 @@
 </ds:datastoreItem>
 </file>
 
-<file path=customXml/itemProps3.xml><?xml version="1.0" encoding="utf-8"?>
-<ds:datastoreItem xmlns:ds="http://schemas.openxmlformats.org/officeDocument/2006/customXml" ds:itemID="{B84EB3CA-A7A5-E449-AC80-CF8C7BFFBCE0}">
+<file path=customXml/itemProps2.xml><?xml version="1.0" encoding="utf-8"?>
+<ds:datastoreItem xmlns:ds="http://schemas.openxmlformats.org/officeDocument/2006/customXml" ds:itemID="{98966CDD-637B-4D63-95C4-03CFA3699F1F}">
   <ds:schemaRefs>
-    <ds:schemaRef ds:uri="http://schemas.openxmlformats.org/officeDocument/2006/bibliography"/>
+    <ds:schemaRef ds:uri="http://schemas.microsoft.com/sharepoint/v3/contenttype/forms"/>
   </ds:schemaRefs>
 </ds:datastoreItem>
 </file>
 
-<file path=customXml/itemProps4.xml><?xml version="1.0" encoding="utf-8"?>
+<file path=customXml/itemProps3.xml><?xml version="1.0" encoding="utf-8"?>
 <ds:datastoreItem xmlns:ds="http://schemas.openxmlformats.org/officeDocument/2006/customXml" ds:itemID="{F5965877-3DCA-4AA9-B0CE-C0B104DB6983}">
   <ds:schemaRefs>
     <ds:schemaRef ds:uri="http://schemas.microsoft.com/office/2006/metadata/properties"/>
@@ -3721,4 +5065,12 @@
     <ds:schemaRef ds:uri="fd8a73f8-f815-4fba-aad8-7d5d42663f91"/>
   </ds:schemaRefs>
 </ds:datastoreItem>
+</file>
+
+<file path=customXml/itemProps4.xml><?xml version="1.0" encoding="utf-8"?>
+<ds:datastoreItem xmlns:ds="http://schemas.openxmlformats.org/officeDocument/2006/customXml" ds:itemID="{B84EB3CA-A7A5-E449-AC80-CF8C7BFFBCE0}">
+  <ds:schemaRefs>
+    <ds:schemaRef ds:uri="http://schemas.openxmlformats.org/officeDocument/2006/bibliography"/>
+  </ds:schemaRefs>
+</ds:datastoreItem>
 </file>
</xml_diff>

<commit_message>
Creación de la base de datos + Diagrama Casos de uso + Modificacion de la memoria
</commit_message>
<xml_diff>
--- a/Documentacion/Memoria Proyecto Integrador.docx
+++ b/Documentacion/Memoria Proyecto Integrador.docx
@@ -73,16 +73,6 @@
               </wp:inline>
             </w:drawing>
           </w:r>
-        </w:p>
-        <w:p>
-          <w:pPr>
-            <w:jc w:val="center"/>
-          </w:pPr>
-        </w:p>
-        <w:p>
-          <w:pPr>
-            <w:jc w:val="center"/>
-          </w:pPr>
         </w:p>
         <w:p/>
         <w:p/>
@@ -152,10 +142,10 @@
               <w:noProof/>
             </w:rPr>
             <w:drawing>
-              <wp:inline distT="0" distB="0" distL="0" distR="0" wp14:anchorId="56DAD1B8" wp14:editId="550B3D84">
-                <wp:extent cx="2238375" cy="2238375"/>
+              <wp:inline distT="0" distB="0" distL="0" distR="0" wp14:anchorId="49896AD9" wp14:editId="33291D15">
+                <wp:extent cx="3200998" cy="2911642"/>
                 <wp:effectExtent l="0" t="0" r="0" b="0"/>
-                <wp:docPr id="29408032" name="Imagen 1"/>
+                <wp:docPr id="2037173593" name="Imagen 6"/>
                 <wp:cNvGraphicFramePr>
                   <a:graphicFrameLocks xmlns:a="http://schemas.openxmlformats.org/drawingml/2006/main" noChangeAspect="1"/>
                 </wp:cNvGraphicFramePr>
@@ -163,12 +153,12 @@
                   <a:graphicData uri="http://schemas.openxmlformats.org/drawingml/2006/picture">
                     <pic:pic xmlns:pic="http://schemas.openxmlformats.org/drawingml/2006/picture">
                       <pic:nvPicPr>
-                        <pic:cNvPr id="0" name="Picture 1"/>
+                        <pic:cNvPr id="0" name="Picture 7"/>
                         <pic:cNvPicPr>
                           <a:picLocks noChangeAspect="1" noChangeArrowheads="1"/>
                         </pic:cNvPicPr>
                       </pic:nvPicPr>
-                      <pic:blipFill>
+                      <pic:blipFill rotWithShape="1">
                         <a:blip r:embed="rId12">
                           <a:extLst>
                             <a:ext uri="{28A0092B-C50C-407E-A947-70E740481C1C}">
@@ -176,7 +166,7 @@
                             </a:ext>
                           </a:extLst>
                         </a:blip>
-                        <a:srcRect/>
+                        <a:srcRect l="5977" r="7519"/>
                         <a:stretch>
                           <a:fillRect/>
                         </a:stretch>
@@ -184,7 +174,7 @@
                       <pic:spPr bwMode="auto">
                         <a:xfrm>
                           <a:off x="0" y="0"/>
-                          <a:ext cx="2238375" cy="2238375"/>
+                          <a:ext cx="3224423" cy="2932950"/>
                         </a:xfrm>
                         <a:prstGeom prst="rect">
                           <a:avLst/>
@@ -193,6 +183,11 @@
                         <a:ln>
                           <a:noFill/>
                         </a:ln>
+                        <a:extLst>
+                          <a:ext uri="{53640926-AAD7-44D8-BBD7-CCE9431645EC}">
+                            <a14:shadowObscured xmlns:a14="http://schemas.microsoft.com/office/drawing/2010/main"/>
+                          </a:ext>
+                        </a:extLst>
                       </pic:spPr>
                     </pic:pic>
                   </a:graphicData>
@@ -1541,8 +1536,6 @@
         <w:t>. La integración de tecnologías como el lenguaje de programación Java, el uso de bases de datos relacionales MySQL y el control de versiones mediante GitHub asegura un entorno de desarrollo profesional y colaborativo. Con este enfoque, buscamos no solo cumplir con las especificaciones técnicas, sino también demostrar capacidad de resolución de problemas y gestión eficaz del trabajo en equipo en un entorno de desarrollo real.</w:t>
       </w:r>
     </w:p>
-    <w:p/>
-    <w:p/>
     <w:p>
       <w:pPr>
         <w:pStyle w:val="Ttulo1"/>
@@ -1601,65 +1594,48 @@
         <w:rPr>
           <w:szCs w:val="24"/>
         </w:rPr>
-        <w:t xml:space="preserve">En el módulo de Programación el enfoque se centra en dar vida a la lógica de negocio y a la interfaz mediante el diseño de clases necesarias para seguir el patrón </w:t>
+        <w:t>En el módulo de Programación el enfoque se centra en dar vida a la lógica de negocio y a la interfaz mediante el diseño de clases necesarias para seguir el patrón MVC. El equipo debe implementar cada una de las clases para lograr su objetivo incluyendo clases de interfaz gráfica pertenecientes a la vista, clases que representen el modelo y clases encargadas de la lógica pertenecientes al control. Se desarrollará una aplicación que gestione información almacenada en bases de datos relacionales identificando y utilizando mecanismos de conexión lo que permitirá alcanzar la competencia completa para desarrollar componentes software en lenguajes de programación orientados a objetos.</w:t>
+      </w:r>
+    </w:p>
+    <w:p>
+      <w:pPr>
+        <w:spacing w:after="240"/>
+      </w:pPr>
+      <w:r>
+        <w:rPr>
+          <w:szCs w:val="24"/>
+        </w:rPr>
+        <w:t xml:space="preserve">Por último, el módulo de Entornos de Desarrollo asegura la calidad del software y la correcta gestión del ciclo de vida del producto realizando el análisis y el diseño de la aplicación empleando técnicas </w:t>
       </w:r>
       <w:proofErr w:type="spellStart"/>
       <w:r>
         <w:rPr>
           <w:szCs w:val="24"/>
         </w:rPr>
-        <w:t>MVC</w:t>
+        <w:t>UML</w:t>
       </w:r>
       <w:proofErr w:type="spellEnd"/>
       <w:r>
         <w:rPr>
           <w:szCs w:val="24"/>
         </w:rPr>
-        <w:t>. El equipo debe implementar cada una de las clases para lograr su objetivo incluyendo clases de interfaz gráfica pertenecientes a la vista, clases que representen el modelo y clases encargadas de la lógica pertenecientes al control. Se desarrollará una aplicación que gestione información almacenada en bases de datos relacionales identificando y utilizando mecanismos de conexión lo que permitirá alcanzar la competencia completa para desarrollar componentes software en lenguajes de programación orientados a objetos.</w:t>
-      </w:r>
-    </w:p>
-    <w:p>
-      <w:pPr>
-        <w:spacing w:after="240"/>
-      </w:pPr>
+        <w:t xml:space="preserve">. Es fundamental documentar la aplicación con </w:t>
+      </w:r>
+      <w:proofErr w:type="spellStart"/>
       <w:r>
         <w:rPr>
           <w:szCs w:val="24"/>
         </w:rPr>
-        <w:t xml:space="preserve">Por último, el módulo de Entornos de Desarrollo asegura la calidad del software y la correcta gestión del ciclo de vida del producto realizando el análisis y el diseño de la aplicación empleando técnicas </w:t>
-      </w:r>
-      <w:proofErr w:type="spellStart"/>
+        <w:t>JavaDoc</w:t>
+      </w:r>
+      <w:proofErr w:type="spellEnd"/>
       <w:r>
         <w:rPr>
           <w:szCs w:val="24"/>
         </w:rPr>
-        <w:t>UML</w:t>
-      </w:r>
-      <w:proofErr w:type="spellEnd"/>
-      <w:r>
-        <w:rPr>
-          <w:szCs w:val="24"/>
-        </w:rPr>
-        <w:t xml:space="preserve">. Es fundamental documentar la aplicación con </w:t>
-      </w:r>
-      <w:proofErr w:type="spellStart"/>
-      <w:r>
-        <w:rPr>
-          <w:szCs w:val="24"/>
-        </w:rPr>
-        <w:t>JavaDoc</w:t>
-      </w:r>
-      <w:proofErr w:type="spellEnd"/>
-      <w:r>
-        <w:rPr>
-          <w:szCs w:val="24"/>
-        </w:rPr>
         <w:t xml:space="preserve"> y gestionar las diferentes versiones del software y el trabajo colaborativo a través de plataformas adecuadas. El equipo también llevará a cabo la depuración y testeo sobre los programas siguiendo metodologías ágiles para el desarrollo y planificación de programas asegurando así un producto final estable y funcional.</w:t>
       </w:r>
     </w:p>
-    <w:p/>
-    <w:p/>
-    <w:p/>
     <w:p>
       <w:pPr>
         <w:pStyle w:val="Ttulo1"/>
@@ -2051,8 +2027,63 @@
       <w:bookmarkEnd w:id="10"/>
     </w:p>
     <w:p>
-      <w:r>
-        <w:t>Incluir el listado de requisitos de programación y BD necesarios para garantizar el correcto funcionamiento de la aplicación.</w:t>
+      <w:pPr>
+        <w:pStyle w:val="Prrafodelista"/>
+        <w:numPr>
+          <w:ilvl w:val="0"/>
+          <w:numId w:val="4"/>
+        </w:numPr>
+      </w:pPr>
+      <w:r>
+        <w:t>La aplicación debe gestionar información almacenada en bases de datos relacionales.</w:t>
+      </w:r>
+    </w:p>
+    <w:p>
+      <w:pPr>
+        <w:pStyle w:val="Prrafodelista"/>
+        <w:numPr>
+          <w:ilvl w:val="0"/>
+          <w:numId w:val="4"/>
+        </w:numPr>
+      </w:pPr>
+      <w:r>
+        <w:t>Se debe permitir la creación, borrado y cambio de citas y acceso a talleres y clientes.</w:t>
+      </w:r>
+    </w:p>
+    <w:p>
+      <w:pPr>
+        <w:pStyle w:val="Prrafodelista"/>
+        <w:numPr>
+          <w:ilvl w:val="0"/>
+          <w:numId w:val="4"/>
+        </w:numPr>
+      </w:pPr>
+      <w:r>
+        <w:t>Debe contar con una pantalla de log in.</w:t>
+      </w:r>
+    </w:p>
+    <w:p>
+      <w:pPr>
+        <w:pStyle w:val="Prrafodelista"/>
+        <w:numPr>
+          <w:ilvl w:val="0"/>
+          <w:numId w:val="4"/>
+        </w:numPr>
+      </w:pPr>
+      <w:r>
+        <w:t>La aplicación debe proporcionar diferentes permisos dependiendo de la categoría del empleado que inicie sesión.</w:t>
+      </w:r>
+    </w:p>
+    <w:p>
+      <w:pPr>
+        <w:pStyle w:val="Prrafodelista"/>
+        <w:numPr>
+          <w:ilvl w:val="0"/>
+          <w:numId w:val="4"/>
+        </w:numPr>
+      </w:pPr>
+      <w:r>
+        <w:t>Debe seguir el modelo MVC (Modelo, Vista, Controlador).</w:t>
       </w:r>
     </w:p>
     <w:p>
@@ -2099,9 +2130,27 @@
         <w:t>.</w:t>
       </w:r>
     </w:p>
+    <w:p/>
+    <w:p/>
+    <w:p/>
+    <w:p/>
+    <w:p/>
+    <w:p/>
+    <w:p/>
+    <w:p/>
+    <w:p/>
+    <w:p/>
+    <w:p/>
+    <w:p/>
+    <w:p/>
+    <w:p/>
+    <w:p/>
     <w:p>
       <w:pPr>
         <w:pStyle w:val="Ttulo1"/>
+        <w:rPr>
+          <w:sz w:val="24"/>
+        </w:rPr>
       </w:pPr>
       <w:bookmarkStart w:id="12" w:name="_Toc164530078"/>
       <w:r>
@@ -2119,27 +2168,236 @@
       <w:bookmarkEnd w:id="12"/>
     </w:p>
     <w:p>
-      <w:r>
-        <w:t>…</w:t>
-      </w:r>
-    </w:p>
-    <w:p>
-      <w:r>
-        <w:t xml:space="preserve">Incluirse </w:t>
-      </w:r>
-      <w:r>
-        <w:t>como anexos</w:t>
-      </w:r>
-      <w:r>
-        <w:t xml:space="preserve"> cuestiones que se consideren fundamentales incluir en el proyecto, pero que por extensión es preferible presentar como anexo, como pueden ser fragmentos de código</w:t>
-      </w:r>
-      <w:r>
-        <w:t>,</w:t>
-      </w:r>
-      <w:r>
-        <w:t xml:space="preserve"> o ejecución de las pruebas realizadas.</w:t>
-      </w:r>
-    </w:p>
+      <w:pPr>
+        <w:rPr>
+          <w:b/>
+          <w:bCs/>
+          <w:u w:val="single"/>
+        </w:rPr>
+      </w:pPr>
+      <w:r>
+        <w:rPr>
+          <w:b/>
+          <w:bCs/>
+          <w:u w:val="single"/>
+        </w:rPr>
+        <w:t xml:space="preserve">Modelo </w:t>
+      </w:r>
+      <w:r>
+        <w:rPr>
+          <w:b/>
+          <w:bCs/>
+          <w:u w:val="single"/>
+        </w:rPr>
+        <w:t>entidad-relación</w:t>
+      </w:r>
+      <w:r>
+        <w:rPr>
+          <w:b/>
+          <w:bCs/>
+          <w:u w:val="single"/>
+        </w:rPr>
+        <w:t xml:space="preserve"> base de datos</w:t>
+      </w:r>
+    </w:p>
+    <w:p>
+      <w:r>
+        <w:rPr>
+          <w:noProof/>
+        </w:rPr>
+        <w:drawing>
+          <wp:inline distT="0" distB="0" distL="0" distR="0" wp14:anchorId="26E376EE" wp14:editId="29041EC4">
+            <wp:extent cx="5753100" cy="6553200"/>
+            <wp:effectExtent l="0" t="0" r="0" b="0"/>
+            <wp:docPr id="1828622477" name="Imagen 2"/>
+            <wp:cNvGraphicFramePr>
+              <a:graphicFrameLocks xmlns:a="http://schemas.openxmlformats.org/drawingml/2006/main" noChangeAspect="1"/>
+            </wp:cNvGraphicFramePr>
+            <a:graphic xmlns:a="http://schemas.openxmlformats.org/drawingml/2006/main">
+              <a:graphicData uri="http://schemas.openxmlformats.org/drawingml/2006/picture">
+                <pic:pic xmlns:pic="http://schemas.openxmlformats.org/drawingml/2006/picture">
+                  <pic:nvPicPr>
+                    <pic:cNvPr id="0" name="Picture 3"/>
+                    <pic:cNvPicPr>
+                      <a:picLocks noChangeAspect="1" noChangeArrowheads="1"/>
+                    </pic:cNvPicPr>
+                  </pic:nvPicPr>
+                  <pic:blipFill>
+                    <a:blip r:embed="rId13" cstate="print">
+                      <a:extLst>
+                        <a:ext uri="{28A0092B-C50C-407E-A947-70E740481C1C}">
+                          <a14:useLocalDpi xmlns:a14="http://schemas.microsoft.com/office/drawing/2010/main" val="0"/>
+                        </a:ext>
+                      </a:extLst>
+                    </a:blip>
+                    <a:srcRect/>
+                    <a:stretch>
+                      <a:fillRect/>
+                    </a:stretch>
+                  </pic:blipFill>
+                  <pic:spPr bwMode="auto">
+                    <a:xfrm>
+                      <a:off x="0" y="0"/>
+                      <a:ext cx="5753100" cy="6553200"/>
+                    </a:xfrm>
+                    <a:prstGeom prst="rect">
+                      <a:avLst/>
+                    </a:prstGeom>
+                    <a:noFill/>
+                    <a:ln>
+                      <a:noFill/>
+                    </a:ln>
+                  </pic:spPr>
+                </pic:pic>
+              </a:graphicData>
+            </a:graphic>
+          </wp:inline>
+        </w:drawing>
+      </w:r>
+    </w:p>
+    <w:p/>
+    <w:p/>
+    <w:p/>
+    <w:p/>
+    <w:p>
+      <w:r>
+        <w:rPr>
+          <w:b/>
+          <w:bCs/>
+          <w:noProof/>
+          <w:u w:val="single"/>
+        </w:rPr>
+        <w:drawing>
+          <wp:inline distT="0" distB="0" distL="0" distR="0" wp14:anchorId="119170F2" wp14:editId="6127EDA9">
+            <wp:extent cx="1514475" cy="1457325"/>
+            <wp:effectExtent l="0" t="0" r="9525" b="0"/>
+            <wp:docPr id="1906084737" name="Imagen 4"/>
+            <wp:cNvGraphicFramePr>
+              <a:graphicFrameLocks xmlns:a="http://schemas.openxmlformats.org/drawingml/2006/main" noChangeAspect="1"/>
+            </wp:cNvGraphicFramePr>
+            <a:graphic xmlns:a="http://schemas.openxmlformats.org/drawingml/2006/main">
+              <a:graphicData uri="http://schemas.openxmlformats.org/drawingml/2006/picture">
+                <pic:pic xmlns:pic="http://schemas.openxmlformats.org/drawingml/2006/picture">
+                  <pic:nvPicPr>
+                    <pic:cNvPr id="0" name="Picture 5"/>
+                    <pic:cNvPicPr>
+                      <a:picLocks noChangeAspect="1" noChangeArrowheads="1"/>
+                    </pic:cNvPicPr>
+                  </pic:nvPicPr>
+                  <pic:blipFill>
+                    <a:blip r:embed="rId14">
+                      <a:extLst>
+                        <a:ext uri="{28A0092B-C50C-407E-A947-70E740481C1C}">
+                          <a14:useLocalDpi xmlns:a14="http://schemas.microsoft.com/office/drawing/2010/main" val="0"/>
+                        </a:ext>
+                      </a:extLst>
+                    </a:blip>
+                    <a:srcRect/>
+                    <a:stretch>
+                      <a:fillRect/>
+                    </a:stretch>
+                  </pic:blipFill>
+                  <pic:spPr bwMode="auto">
+                    <a:xfrm>
+                      <a:off x="0" y="0"/>
+                      <a:ext cx="1514475" cy="1457325"/>
+                    </a:xfrm>
+                    <a:prstGeom prst="rect">
+                      <a:avLst/>
+                    </a:prstGeom>
+                    <a:noFill/>
+                    <a:ln>
+                      <a:noFill/>
+                    </a:ln>
+                  </pic:spPr>
+                </pic:pic>
+              </a:graphicData>
+            </a:graphic>
+          </wp:inline>
+        </w:drawing>
+      </w:r>
+    </w:p>
+    <w:p/>
+    <w:p/>
+    <w:p/>
+    <w:p/>
+    <w:p>
+      <w:pPr>
+        <w:rPr>
+          <w:b/>
+          <w:bCs/>
+          <w:u w:val="single"/>
+        </w:rPr>
+      </w:pPr>
+      <w:r>
+        <w:rPr>
+          <w:b/>
+          <w:bCs/>
+          <w:u w:val="single"/>
+        </w:rPr>
+        <w:t>Diagrama de casos de uso</w:t>
+      </w:r>
+    </w:p>
+    <w:p>
+      <w:r>
+        <w:rPr>
+          <w:noProof/>
+        </w:rPr>
+        <w:drawing>
+          <wp:inline distT="0" distB="0" distL="0" distR="0" wp14:anchorId="02A22606" wp14:editId="5931B410">
+            <wp:extent cx="5753100" cy="3619500"/>
+            <wp:effectExtent l="0" t="0" r="0" b="0"/>
+            <wp:docPr id="1739441134" name="Imagen 3"/>
+            <wp:cNvGraphicFramePr>
+              <a:graphicFrameLocks xmlns:a="http://schemas.openxmlformats.org/drawingml/2006/main" noChangeAspect="1"/>
+            </wp:cNvGraphicFramePr>
+            <a:graphic xmlns:a="http://schemas.openxmlformats.org/drawingml/2006/main">
+              <a:graphicData uri="http://schemas.openxmlformats.org/drawingml/2006/picture">
+                <pic:pic xmlns:pic="http://schemas.openxmlformats.org/drawingml/2006/picture">
+                  <pic:nvPicPr>
+                    <pic:cNvPr id="0" name="Picture 4"/>
+                    <pic:cNvPicPr>
+                      <a:picLocks noChangeAspect="1" noChangeArrowheads="1"/>
+                    </pic:cNvPicPr>
+                  </pic:nvPicPr>
+                  <pic:blipFill>
+                    <a:blip r:embed="rId15">
+                      <a:extLst>
+                        <a:ext uri="{28A0092B-C50C-407E-A947-70E740481C1C}">
+                          <a14:useLocalDpi xmlns:a14="http://schemas.microsoft.com/office/drawing/2010/main" val="0"/>
+                        </a:ext>
+                      </a:extLst>
+                    </a:blip>
+                    <a:srcRect/>
+                    <a:stretch>
+                      <a:fillRect/>
+                    </a:stretch>
+                  </pic:blipFill>
+                  <pic:spPr bwMode="auto">
+                    <a:xfrm>
+                      <a:off x="0" y="0"/>
+                      <a:ext cx="5753100" cy="3619500"/>
+                    </a:xfrm>
+                    <a:prstGeom prst="rect">
+                      <a:avLst/>
+                    </a:prstGeom>
+                    <a:noFill/>
+                    <a:ln>
+                      <a:noFill/>
+                    </a:ln>
+                  </pic:spPr>
+                </pic:pic>
+              </a:graphicData>
+            </a:graphic>
+          </wp:inline>
+        </w:drawing>
+      </w:r>
+    </w:p>
+    <w:p/>
+    <w:p/>
+    <w:p/>
+    <w:p/>
+    <w:p/>
     <w:p/>
     <w:p>
       <w:r>
@@ -2196,8 +2454,8 @@
     </w:p>
     <w:p/>
     <w:sectPr>
-      <w:headerReference w:type="default" r:id="rId13"/>
-      <w:footerReference w:type="default" r:id="rId14"/>
+      <w:headerReference w:type="default" r:id="rId16"/>
+      <w:footerReference w:type="default" r:id="rId17"/>
       <w:pgSz w:w="11906" w:h="16838"/>
       <w:pgMar w:top="1418" w:right="1418" w:bottom="1418" w:left="1418" w:header="709" w:footer="709" w:gutter="0"/>
       <w:pgNumType w:start="0"/>
@@ -2530,6 +2788,119 @@
     </w:lvl>
   </w:abstractNum>
   <w:abstractNum w:abstractNumId="1" w15:restartNumberingAfterBreak="0">
+    <w:nsid w:val="38736371"/>
+    <w:multiLevelType w:val="hybridMultilevel"/>
+    <w:tmpl w:val="4E6285FA"/>
+    <w:lvl w:ilvl="0" w:tplc="0C0A0001">
+      <w:start w:val="1"/>
+      <w:numFmt w:val="bullet"/>
+      <w:lvlText w:val=""/>
+      <w:lvlJc w:val="left"/>
+      <w:pPr>
+        <w:ind w:left="720" w:hanging="360"/>
+      </w:pPr>
+      <w:rPr>
+        <w:rFonts w:ascii="Symbol" w:hAnsi="Symbol" w:hint="default"/>
+      </w:rPr>
+    </w:lvl>
+    <w:lvl w:ilvl="1" w:tplc="0C0A0003" w:tentative="1">
+      <w:start w:val="1"/>
+      <w:numFmt w:val="bullet"/>
+      <w:lvlText w:val="o"/>
+      <w:lvlJc w:val="left"/>
+      <w:pPr>
+        <w:ind w:left="1440" w:hanging="360"/>
+      </w:pPr>
+      <w:rPr>
+        <w:rFonts w:ascii="Courier New" w:hAnsi="Courier New" w:cs="Courier New" w:hint="default"/>
+      </w:rPr>
+    </w:lvl>
+    <w:lvl w:ilvl="2" w:tplc="0C0A0005" w:tentative="1">
+      <w:start w:val="1"/>
+      <w:numFmt w:val="bullet"/>
+      <w:lvlText w:val=""/>
+      <w:lvlJc w:val="left"/>
+      <w:pPr>
+        <w:ind w:left="2160" w:hanging="360"/>
+      </w:pPr>
+      <w:rPr>
+        <w:rFonts w:ascii="Wingdings" w:hAnsi="Wingdings" w:hint="default"/>
+      </w:rPr>
+    </w:lvl>
+    <w:lvl w:ilvl="3" w:tplc="0C0A0001" w:tentative="1">
+      <w:start w:val="1"/>
+      <w:numFmt w:val="bullet"/>
+      <w:lvlText w:val=""/>
+      <w:lvlJc w:val="left"/>
+      <w:pPr>
+        <w:ind w:left="2880" w:hanging="360"/>
+      </w:pPr>
+      <w:rPr>
+        <w:rFonts w:ascii="Symbol" w:hAnsi="Symbol" w:hint="default"/>
+      </w:rPr>
+    </w:lvl>
+    <w:lvl w:ilvl="4" w:tplc="0C0A0003" w:tentative="1">
+      <w:start w:val="1"/>
+      <w:numFmt w:val="bullet"/>
+      <w:lvlText w:val="o"/>
+      <w:lvlJc w:val="left"/>
+      <w:pPr>
+        <w:ind w:left="3600" w:hanging="360"/>
+      </w:pPr>
+      <w:rPr>
+        <w:rFonts w:ascii="Courier New" w:hAnsi="Courier New" w:cs="Courier New" w:hint="default"/>
+      </w:rPr>
+    </w:lvl>
+    <w:lvl w:ilvl="5" w:tplc="0C0A0005" w:tentative="1">
+      <w:start w:val="1"/>
+      <w:numFmt w:val="bullet"/>
+      <w:lvlText w:val=""/>
+      <w:lvlJc w:val="left"/>
+      <w:pPr>
+        <w:ind w:left="4320" w:hanging="360"/>
+      </w:pPr>
+      <w:rPr>
+        <w:rFonts w:ascii="Wingdings" w:hAnsi="Wingdings" w:hint="default"/>
+      </w:rPr>
+    </w:lvl>
+    <w:lvl w:ilvl="6" w:tplc="0C0A0001" w:tentative="1">
+      <w:start w:val="1"/>
+      <w:numFmt w:val="bullet"/>
+      <w:lvlText w:val=""/>
+      <w:lvlJc w:val="left"/>
+      <w:pPr>
+        <w:ind w:left="5040" w:hanging="360"/>
+      </w:pPr>
+      <w:rPr>
+        <w:rFonts w:ascii="Symbol" w:hAnsi="Symbol" w:hint="default"/>
+      </w:rPr>
+    </w:lvl>
+    <w:lvl w:ilvl="7" w:tplc="0C0A0003" w:tentative="1">
+      <w:start w:val="1"/>
+      <w:numFmt w:val="bullet"/>
+      <w:lvlText w:val="o"/>
+      <w:lvlJc w:val="left"/>
+      <w:pPr>
+        <w:ind w:left="5760" w:hanging="360"/>
+      </w:pPr>
+      <w:rPr>
+        <w:rFonts w:ascii="Courier New" w:hAnsi="Courier New" w:cs="Courier New" w:hint="default"/>
+      </w:rPr>
+    </w:lvl>
+    <w:lvl w:ilvl="8" w:tplc="0C0A0005" w:tentative="1">
+      <w:start w:val="1"/>
+      <w:numFmt w:val="bullet"/>
+      <w:lvlText w:val=""/>
+      <w:lvlJc w:val="left"/>
+      <w:pPr>
+        <w:ind w:left="6480" w:hanging="360"/>
+      </w:pPr>
+      <w:rPr>
+        <w:rFonts w:ascii="Wingdings" w:hAnsi="Wingdings" w:hint="default"/>
+      </w:rPr>
+    </w:lvl>
+  </w:abstractNum>
+  <w:abstractNum w:abstractNumId="2" w15:restartNumberingAfterBreak="0">
     <w:nsid w:val="6A017403"/>
     <w:multiLevelType w:val="multilevel"/>
     <w:tmpl w:val="C6789AC4"/>
@@ -2650,10 +3021,129 @@
       </w:rPr>
     </w:lvl>
   </w:abstractNum>
+  <w:abstractNum w:abstractNumId="3" w15:restartNumberingAfterBreak="0">
+    <w:nsid w:val="6CB17E00"/>
+    <w:multiLevelType w:val="hybridMultilevel"/>
+    <w:tmpl w:val="1CBCA7C4"/>
+    <w:lvl w:ilvl="0" w:tplc="0C0A0001">
+      <w:start w:val="1"/>
+      <w:numFmt w:val="bullet"/>
+      <w:lvlText w:val=""/>
+      <w:lvlJc w:val="left"/>
+      <w:pPr>
+        <w:ind w:left="720" w:hanging="360"/>
+      </w:pPr>
+      <w:rPr>
+        <w:rFonts w:ascii="Symbol" w:hAnsi="Symbol" w:hint="default"/>
+      </w:rPr>
+    </w:lvl>
+    <w:lvl w:ilvl="1" w:tplc="0C0A0003" w:tentative="1">
+      <w:start w:val="1"/>
+      <w:numFmt w:val="bullet"/>
+      <w:lvlText w:val="o"/>
+      <w:lvlJc w:val="left"/>
+      <w:pPr>
+        <w:ind w:left="1440" w:hanging="360"/>
+      </w:pPr>
+      <w:rPr>
+        <w:rFonts w:ascii="Courier New" w:hAnsi="Courier New" w:cs="Courier New" w:hint="default"/>
+      </w:rPr>
+    </w:lvl>
+    <w:lvl w:ilvl="2" w:tplc="0C0A0005" w:tentative="1">
+      <w:start w:val="1"/>
+      <w:numFmt w:val="bullet"/>
+      <w:lvlText w:val=""/>
+      <w:lvlJc w:val="left"/>
+      <w:pPr>
+        <w:ind w:left="2160" w:hanging="360"/>
+      </w:pPr>
+      <w:rPr>
+        <w:rFonts w:ascii="Wingdings" w:hAnsi="Wingdings" w:hint="default"/>
+      </w:rPr>
+    </w:lvl>
+    <w:lvl w:ilvl="3" w:tplc="0C0A0001" w:tentative="1">
+      <w:start w:val="1"/>
+      <w:numFmt w:val="bullet"/>
+      <w:lvlText w:val=""/>
+      <w:lvlJc w:val="left"/>
+      <w:pPr>
+        <w:ind w:left="2880" w:hanging="360"/>
+      </w:pPr>
+      <w:rPr>
+        <w:rFonts w:ascii="Symbol" w:hAnsi="Symbol" w:hint="default"/>
+      </w:rPr>
+    </w:lvl>
+    <w:lvl w:ilvl="4" w:tplc="0C0A0003" w:tentative="1">
+      <w:start w:val="1"/>
+      <w:numFmt w:val="bullet"/>
+      <w:lvlText w:val="o"/>
+      <w:lvlJc w:val="left"/>
+      <w:pPr>
+        <w:ind w:left="3600" w:hanging="360"/>
+      </w:pPr>
+      <w:rPr>
+        <w:rFonts w:ascii="Courier New" w:hAnsi="Courier New" w:cs="Courier New" w:hint="default"/>
+      </w:rPr>
+    </w:lvl>
+    <w:lvl w:ilvl="5" w:tplc="0C0A0005" w:tentative="1">
+      <w:start w:val="1"/>
+      <w:numFmt w:val="bullet"/>
+      <w:lvlText w:val=""/>
+      <w:lvlJc w:val="left"/>
+      <w:pPr>
+        <w:ind w:left="4320" w:hanging="360"/>
+      </w:pPr>
+      <w:rPr>
+        <w:rFonts w:ascii="Wingdings" w:hAnsi="Wingdings" w:hint="default"/>
+      </w:rPr>
+    </w:lvl>
+    <w:lvl w:ilvl="6" w:tplc="0C0A0001" w:tentative="1">
+      <w:start w:val="1"/>
+      <w:numFmt w:val="bullet"/>
+      <w:lvlText w:val=""/>
+      <w:lvlJc w:val="left"/>
+      <w:pPr>
+        <w:ind w:left="5040" w:hanging="360"/>
+      </w:pPr>
+      <w:rPr>
+        <w:rFonts w:ascii="Symbol" w:hAnsi="Symbol" w:hint="default"/>
+      </w:rPr>
+    </w:lvl>
+    <w:lvl w:ilvl="7" w:tplc="0C0A0003" w:tentative="1">
+      <w:start w:val="1"/>
+      <w:numFmt w:val="bullet"/>
+      <w:lvlText w:val="o"/>
+      <w:lvlJc w:val="left"/>
+      <w:pPr>
+        <w:ind w:left="5760" w:hanging="360"/>
+      </w:pPr>
+      <w:rPr>
+        <w:rFonts w:ascii="Courier New" w:hAnsi="Courier New" w:cs="Courier New" w:hint="default"/>
+      </w:rPr>
+    </w:lvl>
+    <w:lvl w:ilvl="8" w:tplc="0C0A0005" w:tentative="1">
+      <w:start w:val="1"/>
+      <w:numFmt w:val="bullet"/>
+      <w:lvlText w:val=""/>
+      <w:lvlJc w:val="left"/>
+      <w:pPr>
+        <w:ind w:left="6480" w:hanging="360"/>
+      </w:pPr>
+      <w:rPr>
+        <w:rFonts w:ascii="Wingdings" w:hAnsi="Wingdings" w:hint="default"/>
+      </w:rPr>
+    </w:lvl>
+  </w:abstractNum>
   <w:num w:numId="1" w16cid:durableId="863713764">
     <w:abstractNumId w:val="0"/>
   </w:num>
   <w:num w:numId="2" w16cid:durableId="1628002420">
+    <w:abstractNumId w:val="2"/>
+  </w:num>
+  <w:num w:numId="3" w16cid:durableId="1142499719">
+    <w:abstractNumId w:val="3"/>
+  </w:num>
+  <w:num w:numId="4" w16cid:durableId="382751423">
     <w:abstractNumId w:val="1"/>
   </w:num>
 </w:numbering>
@@ -3057,7 +3547,7 @@
   <w:style w:type="paragraph" w:default="1" w:styleId="Normal">
     <w:name w:val="Normal"/>
     <w:qFormat/>
-    <w:rsid w:val="00AC38AD"/>
+    <w:rsid w:val="00826507"/>
     <w:pPr>
       <w:spacing w:after="120" w:line="360" w:lineRule="auto"/>
       <w:jc w:val="both"/>
@@ -3094,7 +3584,6 @@
   <w:style w:type="character" w:default="1" w:styleId="Fuentedeprrafopredeter">
     <w:name w:val="Default Paragraph Font"/>
     <w:uiPriority w:val="1"/>
-    <w:semiHidden/>
     <w:unhideWhenUsed/>
   </w:style>
   <w:style w:type="table" w:default="1" w:styleId="Tablanormal">
@@ -3242,6 +3731,17 @@
     <w:rsid w:val="00AC38AD"/>
     <w:pPr>
       <w:spacing w:after="100"/>
+    </w:pPr>
+  </w:style>
+  <w:style w:type="paragraph" w:styleId="Prrafodelista">
+    <w:name w:val="List Paragraph"/>
+    <w:basedOn w:val="Normal"/>
+    <w:uiPriority w:val="34"/>
+    <w:qFormat/>
+    <w:rsid w:val="00DB083A"/>
+    <w:pPr>
+      <w:ind w:left="720"/>
+      <w:contextualSpacing/>
     </w:pPr>
   </w:style>
 </w:styles>
@@ -3509,15 +4009,6 @@
 </file>
 
 <file path=customXml/item1.xml><?xml version="1.0" encoding="utf-8"?>
-<?mso-contentType ?>
-<FormTemplates xmlns="http://schemas.microsoft.com/sharepoint/v3/contenttype/forms">
-  <Display>DocumentLibraryForm</Display>
-  <Edit>DocumentLibraryForm</Edit>
-  <New>DocumentLibraryForm</New>
-</FormTemplates>
-</file>
-
-<file path=customXml/item2.xml><?xml version="1.0" encoding="utf-8"?>
 <ct:contentTypeSchema xmlns:ct="http://schemas.microsoft.com/office/2006/metadata/contentType" xmlns:ma="http://schemas.microsoft.com/office/2006/metadata/properties/metaAttributes" ct:_="" ma:_="" ma:contentTypeName="Document" ma:contentTypeID="0x0101003771EF6F4DD57D4BB341978B0C699B9F" ma:contentTypeVersion="5" ma:contentTypeDescription="Create a new document." ma:contentTypeScope="" ma:versionID="06868b8f65cc4d54ae1303708550a388">
   <xsd:schema xmlns:xsd="http://www.w3.org/2001/XMLSchema" xmlns:xs="http://www.w3.org/2001/XMLSchema" xmlns:p="http://schemas.microsoft.com/office/2006/metadata/properties" xmlns:ns3="fd8a73f8-f815-4fba-aad8-7d5d42663f91" targetNamespace="http://schemas.microsoft.com/office/2006/metadata/properties" ma:root="true" ma:fieldsID="d2cd9717685c60f99e0cb70942fdffc5" ns3:_="">
     <xsd:import namespace="fd8a73f8-f815-4fba-aad8-7d5d42663f91"/>
@@ -3667,11 +4158,16 @@
 </ct:contentTypeSchema>
 </file>
 
-<file path=customXml/item3.xml><?xml version="1.0" encoding="utf-8"?>
-<b:Sources xmlns:b="http://schemas.openxmlformats.org/officeDocument/2006/bibliography" xmlns="http://schemas.openxmlformats.org/officeDocument/2006/bibliography" SelectedStyle="/APASixthEditionOfficeOnline.xsl" StyleName="APA" Version="6"/>
+<file path=customXml/item2.xml><?xml version="1.0" encoding="utf-8"?>
+<?mso-contentType ?>
+<FormTemplates xmlns="http://schemas.microsoft.com/sharepoint/v3/contenttype/forms">
+  <Display>DocumentLibraryForm</Display>
+  <Edit>DocumentLibraryForm</Edit>
+  <New>DocumentLibraryForm</New>
+</FormTemplates>
 </file>
 
-<file path=customXml/item4.xml><?xml version="1.0" encoding="utf-8"?>
+<file path=customXml/item3.xml><?xml version="1.0" encoding="utf-8"?>
 <p:properties xmlns:p="http://schemas.microsoft.com/office/2006/metadata/properties" xmlns:xsi="http://www.w3.org/2001/XMLSchema-instance" xmlns:pc="http://schemas.microsoft.com/office/infopath/2007/PartnerControls">
   <documentManagement>
     <_activity xmlns="fd8a73f8-f815-4fba-aad8-7d5d42663f91" xsi:nil="true"/>
@@ -3679,15 +4175,11 @@
 </p:properties>
 </file>
 
-<file path=customXml/itemProps1.xml><?xml version="1.0" encoding="utf-8"?>
-<ds:datastoreItem xmlns:ds="http://schemas.openxmlformats.org/officeDocument/2006/customXml" ds:itemID="{98966CDD-637B-4D63-95C4-03CFA3699F1F}">
-  <ds:schemaRefs>
-    <ds:schemaRef ds:uri="http://schemas.microsoft.com/sharepoint/v3/contenttype/forms"/>
-  </ds:schemaRefs>
-</ds:datastoreItem>
+<file path=customXml/item4.xml><?xml version="1.0" encoding="utf-8"?>
+<b:Sources xmlns:b="http://schemas.openxmlformats.org/officeDocument/2006/bibliography" xmlns="http://schemas.openxmlformats.org/officeDocument/2006/bibliography" SelectedStyle="/APASixthEditionOfficeOnline.xsl" StyleName="APA" Version="6"/>
 </file>
 
-<file path=customXml/itemProps2.xml><?xml version="1.0" encoding="utf-8"?>
+<file path=customXml/itemProps1.xml><?xml version="1.0" encoding="utf-8"?>
 <ds:datastoreItem xmlns:ds="http://schemas.openxmlformats.org/officeDocument/2006/customXml" ds:itemID="{31BF955A-D32C-45E3-B821-FAF3A835F9A4}">
   <ds:schemaRefs>
     <ds:schemaRef ds:uri="http://schemas.microsoft.com/office/2006/metadata/contentType"/>
@@ -3705,15 +4197,15 @@
 </ds:datastoreItem>
 </file>
 
-<file path=customXml/itemProps3.xml><?xml version="1.0" encoding="utf-8"?>
-<ds:datastoreItem xmlns:ds="http://schemas.openxmlformats.org/officeDocument/2006/customXml" ds:itemID="{B84EB3CA-A7A5-E449-AC80-CF8C7BFFBCE0}">
+<file path=customXml/itemProps2.xml><?xml version="1.0" encoding="utf-8"?>
+<ds:datastoreItem xmlns:ds="http://schemas.openxmlformats.org/officeDocument/2006/customXml" ds:itemID="{98966CDD-637B-4D63-95C4-03CFA3699F1F}">
   <ds:schemaRefs>
-    <ds:schemaRef ds:uri="http://schemas.openxmlformats.org/officeDocument/2006/bibliography"/>
+    <ds:schemaRef ds:uri="http://schemas.microsoft.com/sharepoint/v3/contenttype/forms"/>
   </ds:schemaRefs>
 </ds:datastoreItem>
 </file>
 
-<file path=customXml/itemProps4.xml><?xml version="1.0" encoding="utf-8"?>
+<file path=customXml/itemProps3.xml><?xml version="1.0" encoding="utf-8"?>
 <ds:datastoreItem xmlns:ds="http://schemas.openxmlformats.org/officeDocument/2006/customXml" ds:itemID="{F5965877-3DCA-4AA9-B0CE-C0B104DB6983}">
   <ds:schemaRefs>
     <ds:schemaRef ds:uri="http://schemas.microsoft.com/office/2006/metadata/properties"/>
@@ -3721,4 +4213,12 @@
     <ds:schemaRef ds:uri="fd8a73f8-f815-4fba-aad8-7d5d42663f91"/>
   </ds:schemaRefs>
 </ds:datastoreItem>
+</file>
+
+<file path=customXml/itemProps4.xml><?xml version="1.0" encoding="utf-8"?>
+<ds:datastoreItem xmlns:ds="http://schemas.openxmlformats.org/officeDocument/2006/customXml" ds:itemID="{B84EB3CA-A7A5-E449-AC80-CF8C7BFFBCE0}">
+  <ds:schemaRefs>
+    <ds:schemaRef ds:uri="http://schemas.openxmlformats.org/officeDocument/2006/bibliography"/>
+  </ds:schemaRefs>
+</ds:datastoreItem>
 </file>
</xml_diff>